<commit_message>
Amaal/Juliano: agregar NOMBRE_PASANTE, CI, ESPECIALIDAD; limpiar placeholders
</commit_message>
<xml_diff>
--- a/amaal/reportes/Informe_Pasantia_IUTECP_BORRADOR1.docx
+++ b/amaal/reportes/Informe_Pasantia_IUTECP_BORRADOR1.docx
@@ -389,9 +389,8 @@
       </w:pPr>
     </w:p>
     <w:p>
-      <w:bookmarkStart w:id="bm_agradecimientos" w:name="bm_agradecimientos"/>
-      <w:pPr>
-        <w:spacing w:before="1140" w:after="480"/>
+      <w:pPr>
+        <w:spacing w:line="276" w:lineRule="auto" w:before="0" w:after="0"/>
         <w:jc w:val="center"/>
       </w:pPr>
       <w:r>
@@ -400,9 +399,143 @@
           <w:b/>
           <w:sz w:val="24"/>
         </w:rPr>
-        <w:t>AGRADECIMIENTOS</w:t>
+        <w:t>REPÚBLICA BOLIVARIANA DE VENEZUELA</w:t>
       </w:r>
-      <w:bookmarkEnd w:id="bm_agradecimientos"/>
+    </w:p>
+    <w:p>
+      <w:pPr>
+        <w:spacing w:line="276" w:lineRule="auto" w:before="0" w:after="0"/>
+        <w:jc w:val="center"/>
+      </w:pPr>
+      <w:r>
+        <w:rPr>
+          <w:rFonts w:ascii="Times New Roman" w:hAnsi="Times New Roman"/>
+          <w:b/>
+          <w:sz w:val="24"/>
+        </w:rPr>
+        <w:t>MINISTERIO DEL PODER POPULAR PARA LA EDUCACIÓN</w:t>
+      </w:r>
+    </w:p>
+    <w:p>
+      <w:pPr>
+        <w:spacing w:line="276" w:lineRule="auto" w:before="0" w:after="0"/>
+        <w:jc w:val="center"/>
+      </w:pPr>
+      <w:r>
+        <w:rPr>
+          <w:rFonts w:ascii="Times New Roman" w:hAnsi="Times New Roman"/>
+          <w:b/>
+          <w:sz w:val="24"/>
+        </w:rPr>
+        <w:t>INSTITUTO UNIVERSITARIO DE TECNOLOGÍA</w:t>
+      </w:r>
+    </w:p>
+    <w:p>
+      <w:pPr>
+        <w:spacing w:line="276" w:lineRule="auto" w:before="0" w:after="0"/>
+        <w:jc w:val="center"/>
+      </w:pPr>
+      <w:r>
+        <w:rPr>
+          <w:rFonts w:ascii="Times New Roman" w:hAnsi="Times New Roman"/>
+          <w:b/>
+          <w:sz w:val="24"/>
+        </w:rPr>
+        <w:t>"ELÍAS CALIXTO POMPA"</w:t>
+      </w:r>
+    </w:p>
+    <w:p>
+      <w:pPr>
+        <w:spacing w:line="276" w:lineRule="auto" w:before="0" w:after="0"/>
+        <w:jc w:val="center"/>
+      </w:pPr>
+      <w:r>
+        <w:rPr>
+          <w:rFonts w:ascii="Times New Roman" w:hAnsi="Times New Roman"/>
+          <w:b/>
+          <w:sz w:val="24"/>
+        </w:rPr>
+        <w:t>EL TIGRE, ESTADO ANZOÁTEGUI</w:t>
+      </w:r>
+    </w:p>
+    <w:p/>
+    <w:p>
+      <w:pPr>
+        <w:spacing w:before="480" w:after="480"/>
+        <w:jc w:val="center"/>
+      </w:pPr>
+      <w:r>
+        <w:rPr>
+          <w:rFonts w:ascii="Times New Roman" w:hAnsi="Times New Roman"/>
+          <w:b/>
+          <w:sz w:val="24"/>
+        </w:rPr>
+        <w:t>APROBACIÓN DEL TUTOR INDUSTRIAL</w:t>
+      </w:r>
+    </w:p>
+    <w:p>
+      <w:pPr>
+        <w:spacing w:line="360" w:lineRule="auto"/>
+        <w:ind w:firstLine="0"/>
+        <w:jc w:val="both"/>
+      </w:pPr>
+      <w:r>
+        <w:rPr>
+          <w:rFonts w:ascii="Times New Roman" w:hAnsi="Times New Roman"/>
+          <w:sz w:val="24"/>
+        </w:rPr>
+        <w:t>En mi carácter de tutor industrial del informe de pasantías presentado por: Alrifaai Alrifaaie Amaal, de Cédula de Identidad V-31.985.792; para optar al grado de Técnico Superior Universitario en la especialidad de: Administración, cuyo título es; “EVALUACIÓN DEL CONTROL ADMINISTRATIVO APLICADO A LA GESTIÓN DE SOLICITUDES DE SERVICIOS DE TELECOMUNICACIONES EN LA EMPRESA INGENIERÍA DE TELECOMUNICACIONES, C.A.”, manifiesto que cumple con los requisitos exigidos por el Instituto Universitario de Tecnología “Elías Calixto Pompa” (IUTECP); y que, por lo tanto, considero que reúne los méritos suficientes para ser evaluado por el jurado que se decida designar a tal fin.</w:t>
+      </w:r>
+    </w:p>
+    <w:p/>
+    <w:p/>
+    <w:p>
+      <w:pPr>
+        <w:spacing w:line="360" w:lineRule="auto"/>
+        <w:jc w:val="left"/>
+      </w:pPr>
+      <w:r>
+        <w:rPr>
+          <w:rFonts w:ascii="Times New Roman" w:hAnsi="Times New Roman"/>
+          <w:sz w:val="24"/>
+        </w:rPr>
+        <w:t>En la Ciudad de El Tigre, a los ___ días del mes de _______ de 2026</w:t>
+      </w:r>
+    </w:p>
+    <w:p/>
+    <w:p/>
+    <w:p/>
+    <w:p/>
+    <w:p/>
+    <w:p/>
+    <w:p>
+      <w:pPr>
+        <w:tabs>
+          <w:tab w:pos="10205" w:val="left"/>
+        </w:tabs>
+        <w:jc w:val="left"/>
+      </w:pPr>
+      <w:r>
+        <w:rPr>
+          <w:rFonts w:ascii="Times New Roman" w:hAnsi="Times New Roman"/>
+          <w:sz w:val="24"/>
+        </w:rPr>
+        <w:t>Apellidos y Nombres</w:t>
+      </w:r>
+      <w:r>
+        <w:rPr>
+          <w:rFonts w:ascii="Times New Roman" w:hAnsi="Times New Roman"/>
+          <w:sz w:val="24"/>
+        </w:rPr>
+        <w:tab/>
+      </w:r>
+      <w:r>
+        <w:rPr>
+          <w:rFonts w:ascii="Times New Roman" w:hAnsi="Times New Roman"/>
+          <w:sz w:val="24"/>
+        </w:rPr>
+        <w:t>C.I.: _______________</w:t>
+      </w:r>
     </w:p>
     <w:p>
       <w:pPr>
@@ -418,36 +551,7 @@
     </w:p>
     <w:p>
       <w:pPr>
-        <w:spacing w:line="360" w:lineRule="auto" w:after="0" w:before="0"/>
-        <w:ind w:firstLine="709"/>
-        <w:jc w:val="both"/>
-      </w:pPr>
-      <w:r>
-        <w:rPr>
-          <w:rFonts w:ascii="Times New Roman" w:hAnsi="Times New Roman"/>
-          <w:i w:val="0"/>
-          <w:sz w:val="24"/>
-        </w:rPr>
-        <w:t>Aquí van los agradecimientos.</w:t>
-      </w:r>
-    </w:p>
-    <w:p>
-      <w:pPr>
-        <w:sectPr>
-          <w:footerReference w:type="default" r:id="rId16"/>
-          <w:type w:val="continuous"/>
-          <w:pgSz w:w="12240" w:h="15840"/>
-          <w:pgMar w:top="1701" w:right="1701" w:bottom="1701" w:left="2268" w:header="720" w:footer="720" w:gutter="0"/>
-          <w:cols w:space="720"/>
-          <w:titlePg/>
-          <w:docGrid w:linePitch="360"/>
-        </w:sectPr>
-      </w:pPr>
-    </w:p>
-    <w:p>
-      <w:bookmarkStart w:id="bm_dedicatoria" w:name="bm_dedicatoria"/>
-      <w:pPr>
-        <w:spacing w:before="1140" w:after="480"/>
+        <w:spacing w:line="276" w:lineRule="auto" w:before="0" w:after="0"/>
         <w:jc w:val="center"/>
       </w:pPr>
       <w:r>
@@ -456,42 +560,148 @@
           <w:b/>
           <w:sz w:val="24"/>
         </w:rPr>
-        <w:t>DEDICATORIA</w:t>
+        <w:t>REPÚBLICA BOLIVARIANA DE VENEZUELA</w:t>
       </w:r>
-      <w:bookmarkEnd w:id="bm_dedicatoria"/>
     </w:p>
     <w:p>
       <w:pPr>
-        <w:sectPr>
-          <w:footerReference w:type="default" r:id="rId17"/>
-          <w:pgSz w:w="12240" w:h="15840"/>
-          <w:pgMar w:top="1701" w:right="1701" w:bottom="1701" w:left="2268" w:header="720" w:footer="720" w:gutter="0"/>
-          <w:cols w:space="720"/>
-          <w:titlePg/>
-          <w:docGrid w:linePitch="360"/>
-        </w:sectPr>
-      </w:pPr>
-    </w:p>
-    <w:p>
-      <w:pPr>
-        <w:spacing w:line="360" w:lineRule="auto" w:after="0" w:before="0"/>
-        <w:ind w:firstLine="709"/>
-        <w:jc w:val="both"/>
+        <w:spacing w:line="276" w:lineRule="auto" w:before="0" w:after="0"/>
+        <w:jc w:val="center"/>
       </w:pPr>
       <w:r>
         <w:rPr>
           <w:rFonts w:ascii="Times New Roman" w:hAnsi="Times New Roman"/>
-          <w:i w:val="0"/>
+          <w:b/>
           <w:sz w:val="24"/>
         </w:rPr>
-        <w:t>Aquí va la dedicatoria.</w:t>
+        <w:t>MINISTERIO DEL PODER POPULAR PARA LA EDUCACIÓN</w:t>
       </w:r>
     </w:p>
     <w:p>
       <w:pPr>
+        <w:spacing w:line="276" w:lineRule="auto" w:before="0" w:after="0"/>
+        <w:jc w:val="center"/>
+      </w:pPr>
+      <w:r>
+        <w:rPr>
+          <w:rFonts w:ascii="Times New Roman" w:hAnsi="Times New Roman"/>
+          <w:b/>
+          <w:sz w:val="24"/>
+        </w:rPr>
+        <w:t>INSTITUTO UNIVERSITARIO DE TECNOLOGÍA</w:t>
+      </w:r>
+    </w:p>
+    <w:p>
+      <w:pPr>
+        <w:spacing w:line="276" w:lineRule="auto" w:before="0" w:after="0"/>
+        <w:jc w:val="center"/>
+      </w:pPr>
+      <w:r>
+        <w:rPr>
+          <w:rFonts w:ascii="Times New Roman" w:hAnsi="Times New Roman"/>
+          <w:b/>
+          <w:sz w:val="24"/>
+        </w:rPr>
+        <w:t>"ELÍAS CALIXTO POMPA"</w:t>
+      </w:r>
+    </w:p>
+    <w:p>
+      <w:pPr>
+        <w:spacing w:line="276" w:lineRule="auto" w:before="0" w:after="0"/>
+        <w:jc w:val="center"/>
+      </w:pPr>
+      <w:r>
+        <w:rPr>
+          <w:rFonts w:ascii="Times New Roman" w:hAnsi="Times New Roman"/>
+          <w:b/>
+          <w:sz w:val="24"/>
+        </w:rPr>
+        <w:t>EL TIGRE, ESTADO ANZOÁTEGUI</w:t>
+      </w:r>
+    </w:p>
+    <w:p/>
+    <w:p>
+      <w:pPr>
+        <w:spacing w:before="480" w:after="480"/>
+        <w:jc w:val="center"/>
+      </w:pPr>
+      <w:r>
+        <w:rPr>
+          <w:rFonts w:ascii="Times New Roman" w:hAnsi="Times New Roman"/>
+          <w:b/>
+          <w:sz w:val="24"/>
+        </w:rPr>
+        <w:t>APROBACIÓN DEL TUTOR ACADÉMICO</w:t>
+      </w:r>
+    </w:p>
+    <w:p>
+      <w:pPr>
+        <w:spacing w:line="360" w:lineRule="auto"/>
+        <w:ind w:firstLine="0"/>
+        <w:jc w:val="both"/>
+      </w:pPr>
+      <w:r>
+        <w:rPr>
+          <w:rFonts w:ascii="Times New Roman" w:hAnsi="Times New Roman"/>
+          <w:sz w:val="24"/>
+        </w:rPr>
+        <w:t>En mi carácter de tutor académico del informe de pasantías presentado por: Alrifaai Alrifaaie Amaal, de Cédula de Identidad V-31.985.792; para optar al grado de Técnico Superior Universitario en la especialidad de: Administración, cuyo título es; “EVALUACIÓN DEL CONTROL ADMINISTRATIVO APLICADO A LA GESTIÓN DE SOLICITUDES DE SERVICIOS DE TELECOMUNICACIONES EN LA EMPRESA INGENIERÍA DE TELECOMUNICACIONES, C.A.”, manifiesto que cumple con los requisitos exigidos por el Instituto Universitario de Tecnología “Elías Calixto Pompa” (IUTECP); y que, por lo tanto, considero que reúne los méritos suficientes para ser evaluado por el jurado que se decida designar a tal fin.</w:t>
+      </w:r>
+    </w:p>
+    <w:p/>
+    <w:p/>
+    <w:p>
+      <w:pPr>
+        <w:spacing w:line="360" w:lineRule="auto"/>
+        <w:jc w:val="left"/>
+      </w:pPr>
+      <w:r>
+        <w:rPr>
+          <w:rFonts w:ascii="Times New Roman" w:hAnsi="Times New Roman"/>
+          <w:sz w:val="24"/>
+        </w:rPr>
+        <w:t>En la Ciudad de El Tigre, a los ___ días del mes de _______ de 2026</w:t>
+      </w:r>
+    </w:p>
+    <w:p/>
+    <w:p/>
+    <w:p/>
+    <w:p/>
+    <w:p/>
+    <w:p/>
+    <w:p>
+      <w:pPr>
+        <w:tabs>
+          <w:tab w:pos="10205" w:val="left"/>
+        </w:tabs>
+        <w:jc w:val="left"/>
+      </w:pPr>
+      <w:r>
+        <w:rPr>
+          <w:rFonts w:ascii="Times New Roman" w:hAnsi="Times New Roman"/>
+          <w:sz w:val="24"/>
+        </w:rPr>
+        <w:t>Apellidos y Nombres</w:t>
+      </w:r>
+      <w:r>
+        <w:rPr>
+          <w:rFonts w:ascii="Times New Roman" w:hAnsi="Times New Roman"/>
+          <w:sz w:val="24"/>
+        </w:rPr>
+        <w:tab/>
+      </w:r>
+      <w:r>
+        <w:rPr>
+          <w:rFonts w:ascii="Times New Roman" w:hAnsi="Times New Roman"/>
+          <w:sz w:val="24"/>
+        </w:rPr>
+        <w:t>C.I.: _______________</w:t>
+      </w:r>
+    </w:p>
+    <w:p>
+      <w:pPr>
         <w:sectPr>
-          <w:footerReference w:type="default" r:id="rId18"/>
-          <w:type w:val="continuous"/>
+          <w:footerReference w:type="default" r:id="rId16"/>
           <w:pgSz w:w="12240" w:h="15840"/>
           <w:pgMar w:top="1701" w:right="1701" w:bottom="1701" w:left="2268" w:header="720" w:footer="720" w:gutter="0"/>
           <w:cols w:space="720"/>
@@ -517,7 +727,7 @@
     <w:p>
       <w:pPr>
         <w:sectPr>
-          <w:footerReference w:type="default" r:id="rId19"/>
+          <w:footerReference w:type="default" r:id="rId17"/>
           <w:pgSz w:w="12240" w:h="15840"/>
           <w:pgMar w:top="1701" w:right="1701" w:bottom="1701" w:left="2268" w:header="720" w:footer="720" w:gutter="0"/>
           <w:cols w:space="720"/>
@@ -554,7 +764,7 @@
           <w:b w:val="0"/>
           <w:sz w:val="24"/>
         </w:rPr>
-        <w:t>AGRADECIMIENTOS</w:t>
+        <w:t>APROBACIÓN DEL TUTOR INDUSTRIAL</w:t>
         <w:tab/>
       </w:r>
       <w:r>
@@ -564,7 +774,7 @@
           <w:sz w:val="24"/>
         </w:rPr>
         <w:fldChar w:fldCharType="begin"/>
-        <w:instrText xml:space="preserve"> PAGEREF bm_agradecimientos \h </w:instrText>
+        <w:instrText xml:space="preserve"> PAGEREF bm_aprob_ind \h </w:instrText>
         <w:fldChar w:fldCharType="separate"/>
         <w:t>?</w:t>
         <w:fldChar w:fldCharType="end"/>
@@ -584,7 +794,7 @@
           <w:b w:val="0"/>
           <w:sz w:val="24"/>
         </w:rPr>
-        <w:t>DEDICATORIA</w:t>
+        <w:t>APROBACIÓN DEL TUTOR ACADÉMICO</w:t>
         <w:tab/>
       </w:r>
       <w:r>
@@ -594,7 +804,7 @@
           <w:sz w:val="24"/>
         </w:rPr>
         <w:fldChar w:fldCharType="begin"/>
-        <w:instrText xml:space="preserve"> PAGEREF bm_dedicatoria \h </w:instrText>
+        <w:instrText xml:space="preserve"> PAGEREF bm_aprob_acad \h </w:instrText>
         <w:fldChar w:fldCharType="separate"/>
         <w:t>?</w:t>
         <w:fldChar w:fldCharType="end"/>
@@ -704,36 +914,6 @@
           <w:b w:val="0"/>
           <w:sz w:val="24"/>
         </w:rPr>
-        <w:t>LISTA DE ANEXOS</w:t>
-        <w:tab/>
-      </w:r>
-      <w:r>
-        <w:rPr>
-          <w:rFonts w:ascii="Times New Roman" w:hAnsi="Times New Roman"/>
-          <w:b w:val="0"/>
-          <w:sz w:val="24"/>
-        </w:rPr>
-        <w:fldChar w:fldCharType="begin"/>
-        <w:instrText xml:space="preserve"> PAGEREF bm_lista_anexos \h </w:instrText>
-        <w:fldChar w:fldCharType="separate"/>
-        <w:t>?</w:t>
-        <w:fldChar w:fldCharType="end"/>
-      </w:r>
-    </w:p>
-    <w:p>
-      <w:pPr>
-        <w:tabs>
-          <w:tab w:pos="8271" w:val="right" w:leader="dot"/>
-        </w:tabs>
-        <w:spacing w:line="360" w:lineRule="auto" w:before="0" w:after="80"/>
-        <w:ind w:left="0"/>
-      </w:pPr>
-      <w:r>
-        <w:rPr>
-          <w:rFonts w:ascii="Times New Roman" w:hAnsi="Times New Roman"/>
-          <w:b w:val="0"/>
-          <w:sz w:val="24"/>
-        </w:rPr>
         <w:t>RESUMEN</w:t>
         <w:tab/>
       </w:r>
@@ -1154,7 +1334,7 @@
     <w:p>
       <w:pPr>
         <w:sectPr>
-          <w:footerReference w:type="default" r:id="rId20"/>
+          <w:footerReference w:type="default" r:id="rId18"/>
           <w:type w:val="continuous"/>
           <w:pgSz w:w="12240" w:h="15840"/>
           <w:pgMar w:top="1701" w:right="1701" w:bottom="1701" w:left="2268" w:header="720" w:footer="720" w:gutter="0"/>
@@ -1183,7 +1363,7 @@
     <w:p>
       <w:pPr>
         <w:sectPr>
-          <w:footerReference w:type="default" r:id="rId21"/>
+          <w:footerReference w:type="default" r:id="rId19"/>
           <w:pgSz w:w="12240" w:h="15840"/>
           <w:pgMar w:top="1701" w:right="1701" w:bottom="1701" w:left="2268" w:header="720" w:footer="720" w:gutter="0"/>
           <w:cols w:space="720"/>
@@ -1286,7 +1466,7 @@
     <w:p>
       <w:pPr>
         <w:sectPr>
-          <w:footerReference w:type="default" r:id="rId22"/>
+          <w:footerReference w:type="default" r:id="rId20"/>
           <w:type w:val="continuous"/>
           <w:pgSz w:w="12240" w:h="15840"/>
           <w:pgMar w:top="1701" w:right="1701" w:bottom="1701" w:left="2268" w:header="720" w:footer="720" w:gutter="0"/>
@@ -1315,7 +1495,7 @@
     <w:p>
       <w:pPr>
         <w:sectPr>
-          <w:footerReference w:type="default" r:id="rId23"/>
+          <w:footerReference w:type="default" r:id="rId21"/>
           <w:pgSz w:w="12240" w:h="15840"/>
           <w:pgMar w:top="1701" w:right="1701" w:bottom="1701" w:left="2268" w:header="720" w:footer="720" w:gutter="0"/>
           <w:cols w:space="720"/>
@@ -1327,7 +1507,7 @@
     <w:p>
       <w:pPr>
         <w:sectPr>
-          <w:footerReference w:type="default" r:id="rId24"/>
+          <w:footerReference w:type="default" r:id="rId22"/>
           <w:type w:val="continuous"/>
           <w:pgSz w:w="12240" w:h="15840"/>
           <w:pgMar w:top="1701" w:right="1701" w:bottom="1701" w:left="2268" w:header="720" w:footer="720" w:gutter="0"/>
@@ -1356,7 +1536,7 @@
     <w:p>
       <w:pPr>
         <w:sectPr>
-          <w:footerReference w:type="default" r:id="rId25"/>
+          <w:footerReference w:type="default" r:id="rId23"/>
           <w:pgSz w:w="12240" w:h="15840"/>
           <w:pgMar w:top="1701" w:right="1701" w:bottom="1701" w:left="2268" w:header="720" w:footer="720" w:gutter="0"/>
           <w:cols w:space="720"/>
@@ -1491,7 +1671,7 @@
     <w:p>
       <w:pPr>
         <w:sectPr>
-          <w:footerReference w:type="default" r:id="rId26"/>
+          <w:footerReference w:type="default" r:id="rId24"/>
           <w:type w:val="continuous"/>
           <w:pgSz w:w="12240" w:h="15840"/>
           <w:pgMar w:top="1701" w:right="1701" w:bottom="1701" w:left="2268" w:header="720" w:footer="720" w:gutter="0"/>
@@ -1520,7 +1700,7 @@
     <w:p>
       <w:pPr>
         <w:sectPr>
-          <w:footerReference w:type="default" r:id="rId27"/>
+          <w:footerReference w:type="default" r:id="rId25"/>
           <w:pgSz w:w="12240" w:h="15840"/>
           <w:pgMar w:top="1701" w:right="1701" w:bottom="1701" w:left="2268" w:header="720" w:footer="720" w:gutter="0"/>
           <w:cols w:space="720"/>
@@ -1558,104 +1738,8 @@
     </w:p>
     <w:p>
       <w:pPr>
-        <w:tabs>
-          <w:tab w:pos="1020" w:val="left"/>
-          <w:tab w:pos="8271" w:val="right" w:leader="dot"/>
-        </w:tabs>
-        <w:spacing w:line="360" w:lineRule="auto" w:before="0" w:after="80"/>
-        <w:ind w:left="1020" w:hanging="1020"/>
-      </w:pPr>
-      <w:r>
-        <w:rPr>
-          <w:rFonts w:ascii="Times New Roman" w:hAnsi="Times New Roman"/>
-          <w:sz w:val="24"/>
-        </w:rPr>
-        <w:t>A</w:t>
-        <w:tab/>
-        <w:t>Aquí va la descripción del Anexo A</w:t>
-        <w:tab/>
-      </w:r>
-      <w:r>
-        <w:rPr>
-          <w:rFonts w:ascii="Times New Roman" w:hAnsi="Times New Roman"/>
-          <w:b w:val="0"/>
-          <w:sz w:val="24"/>
-        </w:rPr>
-        <w:fldChar w:fldCharType="begin"/>
-        <w:instrText xml:space="preserve"> PAGEREF bm_anexoA \h </w:instrText>
-        <w:fldChar w:fldCharType="separate"/>
-        <w:t>?</w:t>
-        <w:fldChar w:fldCharType="end"/>
-      </w:r>
-    </w:p>
-    <w:p>
-      <w:pPr>
-        <w:tabs>
-          <w:tab w:pos="1020" w:val="left"/>
-          <w:tab w:pos="8271" w:val="right" w:leader="dot"/>
-        </w:tabs>
-        <w:spacing w:line="360" w:lineRule="auto" w:before="0" w:after="80"/>
-        <w:ind w:left="1020" w:hanging="1020"/>
-      </w:pPr>
-      <w:r>
-        <w:rPr>
-          <w:rFonts w:ascii="Times New Roman" w:hAnsi="Times New Roman"/>
-          <w:sz w:val="24"/>
-        </w:rPr>
-        <w:t>B</w:t>
-        <w:tab/>
-        <w:t>Aquí va la descripción del Anexo B</w:t>
-        <w:tab/>
-      </w:r>
-      <w:r>
-        <w:rPr>
-          <w:rFonts w:ascii="Times New Roman" w:hAnsi="Times New Roman"/>
-          <w:b w:val="0"/>
-          <w:sz w:val="24"/>
-        </w:rPr>
-        <w:fldChar w:fldCharType="begin"/>
-        <w:instrText xml:space="preserve"> PAGEREF bm_anexoB \h </w:instrText>
-        <w:fldChar w:fldCharType="separate"/>
-        <w:t>?</w:t>
-        <w:fldChar w:fldCharType="end"/>
-      </w:r>
-    </w:p>
-    <w:p>
-      <w:pPr>
-        <w:tabs>
-          <w:tab w:pos="1020" w:val="left"/>
-          <w:tab w:pos="8271" w:val="right" w:leader="dot"/>
-        </w:tabs>
-        <w:spacing w:line="360" w:lineRule="auto" w:before="0" w:after="80"/>
-        <w:ind w:left="1020" w:hanging="1020"/>
-      </w:pPr>
-      <w:r>
-        <w:rPr>
-          <w:rFonts w:ascii="Times New Roman" w:hAnsi="Times New Roman"/>
-          <w:sz w:val="24"/>
-        </w:rPr>
-        <w:t>C</w:t>
-        <w:tab/>
-        <w:t>Aquí va la descripción del Anexo C</w:t>
-        <w:tab/>
-      </w:r>
-      <w:r>
-        <w:rPr>
-          <w:rFonts w:ascii="Times New Roman" w:hAnsi="Times New Roman"/>
-          <w:b w:val="0"/>
-          <w:sz w:val="24"/>
-        </w:rPr>
-        <w:fldChar w:fldCharType="begin"/>
-        <w:instrText xml:space="preserve"> PAGEREF bm_anexoC \h </w:instrText>
-        <w:fldChar w:fldCharType="separate"/>
-        <w:t>?</w:t>
-        <w:fldChar w:fldCharType="end"/>
-      </w:r>
-    </w:p>
-    <w:p>
-      <w:pPr>
         <w:sectPr>
-          <w:footerReference w:type="default" r:id="rId28"/>
+          <w:footerReference w:type="default" r:id="rId26"/>
           <w:type w:val="continuous"/>
           <w:pgSz w:w="12240" w:h="15840"/>
           <w:pgMar w:top="1701" w:right="1701" w:bottom="1701" w:left="2268" w:header="720" w:footer="720" w:gutter="0"/>
@@ -1684,7 +1768,7 @@
     <w:p>
       <w:pPr>
         <w:sectPr>
-          <w:footerReference w:type="default" r:id="rId29"/>
+          <w:footerReference w:type="default" r:id="rId27"/>
           <w:pgSz w:w="12240" w:h="15840"/>
           <w:pgMar w:top="1701" w:right="1701" w:bottom="1701" w:left="2268" w:header="720" w:footer="720" w:gutter="0"/>
           <w:cols w:space="720"/>
@@ -1726,7 +1810,7 @@
     <w:p>
       <w:pPr>
         <w:sectPr>
-          <w:footerReference w:type="default" r:id="rId30"/>
+          <w:footerReference w:type="default" r:id="rId28"/>
           <w:type w:val="continuous"/>
           <w:pgSz w:w="12240" w:h="15840"/>
           <w:pgMar w:top="1701" w:right="1701" w:bottom="1701" w:left="2268" w:header="720" w:footer="720" w:gutter="0"/>
@@ -1755,7 +1839,7 @@
     <w:p>
       <w:pPr>
         <w:sectPr>
-          <w:footerReference w:type="default" r:id="rId31"/>
+          <w:footerReference w:type="default" r:id="rId29"/>
           <w:pgSz w:w="12240" w:h="15840"/>
           <w:pgMar w:top="1701" w:right="1701" w:bottom="1701" w:left="2268" w:header="720" w:footer="720" w:gutter="0"/>
           <w:cols w:space="720"/>
@@ -1782,7 +1866,7 @@
     <w:p>
       <w:pPr>
         <w:sectPr>
-          <w:footerReference w:type="default" r:id="rId32"/>
+          <w:footerReference w:type="default" r:id="rId30"/>
           <w:type w:val="continuous"/>
           <w:pgSz w:w="12240" w:h="15840"/>
           <w:pgMar w:top="1701" w:right="1701" w:bottom="1701" w:left="2268" w:header="720" w:footer="720" w:gutter="0"/>
@@ -1825,7 +1909,7 @@
     <w:p>
       <w:pPr>
         <w:sectPr>
-          <w:footerReference w:type="default" r:id="rId33"/>
+          <w:footerReference w:type="default" r:id="rId31"/>
           <w:pgSz w:w="12240" w:h="15840"/>
           <w:pgMar w:top="1701" w:right="1701" w:bottom="1701" w:left="2268" w:header="720" w:footer="720" w:gutter="0"/>
           <w:cols w:space="720"/>
@@ -2538,7 +2622,7 @@
     <w:p>
       <w:pPr>
         <w:sectPr>
-          <w:footerReference w:type="default" r:id="rId34"/>
+          <w:footerReference w:type="default" r:id="rId32"/>
           <w:type w:val="continuous"/>
           <w:pgSz w:w="12240" w:h="15840"/>
           <w:pgMar w:top="1701" w:right="1701" w:bottom="1701" w:left="2268" w:header="720" w:footer="720" w:gutter="0"/>
@@ -2567,7 +2651,7 @@
     <w:p>
       <w:pPr>
         <w:sectPr>
-          <w:footerReference w:type="default" r:id="rId35"/>
+          <w:footerReference w:type="default" r:id="rId33"/>
           <w:pgSz w:w="12240" w:h="15840"/>
           <w:pgMar w:top="1701" w:right="1701" w:bottom="1701" w:left="2268" w:header="720" w:footer="720" w:gutter="0"/>
           <w:cols w:space="720"/>
@@ -2696,7 +2780,7 @@
     <w:p>
       <w:pPr>
         <w:sectPr>
-          <w:footerReference w:type="default" r:id="rId36"/>
+          <w:footerReference w:type="default" r:id="rId34"/>
           <w:type w:val="continuous"/>
           <w:pgSz w:w="12240" w:h="15840"/>
           <w:pgMar w:top="1701" w:right="1701" w:bottom="1701" w:left="2268" w:header="720" w:footer="720" w:gutter="0"/>
@@ -2722,173 +2806,8 @@
       </w:r>
       <w:bookmarkEnd w:id="bm_anexos"/>
     </w:p>
-    <w:p>
-      <w:pPr>
-        <w:sectPr>
-          <w:footerReference w:type="default" r:id="rId37"/>
-          <w:pgSz w:w="12240" w:h="15840"/>
-          <w:pgMar w:top="1701" w:right="1701" w:bottom="1701" w:left="2268" w:header="720" w:footer="720" w:gutter="0"/>
-          <w:cols w:space="720"/>
-          <w:titlePg/>
-          <w:docGrid w:linePitch="360"/>
-        </w:sectPr>
-      </w:pPr>
-    </w:p>
-    <w:p>
-      <w:bookmarkStart w:id="bm_anexoA" w:name="bm_anexoA"/>
-      <w:pPr>
-        <w:spacing w:before="0" w:after="480"/>
-        <w:jc w:val="center"/>
-      </w:pPr>
-      <w:bookmarkEnd w:id="bm_anexoA"/>
-      <w:r>
-        <w:rPr>
-          <w:rFonts w:ascii="Times New Roman" w:hAnsi="Times New Roman"/>
-          <w:b/>
-          <w:sz w:val="24"/>
-        </w:rPr>
-        <w:t>ANEXO A</w:t>
-      </w:r>
-    </w:p>
-    <w:p>
-      <w:pPr>
-        <w:spacing w:before="240" w:after="480"/>
-        <w:jc w:val="center"/>
-      </w:pPr>
-      <w:r>
-        <w:rPr>
-          <w:rFonts w:ascii="Times New Roman" w:hAnsi="Times New Roman"/>
-          <w:b/>
-          <w:sz w:val="24"/>
-        </w:rPr>
-        <w:t>[Aquí va la descripción del Anexo A]</w:t>
-      </w:r>
-    </w:p>
-    <w:p>
-      <w:pPr>
-        <w:jc w:val="center"/>
-      </w:pPr>
-      <w:r>
-        <w:rPr>
-          <w:rFonts w:ascii="Times New Roman" w:hAnsi="Times New Roman"/>
-          <w:i/>
-          <w:sz w:val="20"/>
-        </w:rPr>
-        <w:t>(Contenido elaborado por el estudiante)</w:t>
-      </w:r>
-    </w:p>
-    <w:p>
-      <w:pPr>
-        <w:sectPr>
-          <w:footerReference w:type="default" r:id="rId38"/>
-          <w:pgSz w:w="12240" w:h="15840"/>
-          <w:pgMar w:top="1701" w:right="1701" w:bottom="1701" w:left="2268" w:header="720" w:footer="720" w:gutter="0"/>
-          <w:cols w:space="720"/>
-          <w:titlePg/>
-          <w:docGrid w:linePitch="360"/>
-        </w:sectPr>
-      </w:pPr>
-    </w:p>
-    <w:p>
-      <w:bookmarkStart w:id="bm_anexoB" w:name="bm_anexoB"/>
-      <w:pPr>
-        <w:spacing w:before="0" w:after="480"/>
-        <w:jc w:val="center"/>
-      </w:pPr>
-      <w:bookmarkEnd w:id="bm_anexoB"/>
-      <w:r>
-        <w:rPr>
-          <w:rFonts w:ascii="Times New Roman" w:hAnsi="Times New Roman"/>
-          <w:b/>
-          <w:sz w:val="24"/>
-        </w:rPr>
-        <w:t>ANEXO B</w:t>
-      </w:r>
-    </w:p>
-    <w:p>
-      <w:pPr>
-        <w:spacing w:before="240" w:after="480"/>
-        <w:jc w:val="center"/>
-      </w:pPr>
-      <w:r>
-        <w:rPr>
-          <w:rFonts w:ascii="Times New Roman" w:hAnsi="Times New Roman"/>
-          <w:b/>
-          <w:sz w:val="24"/>
-        </w:rPr>
-        <w:t>[Aquí va la descripción del Anexo B]</w:t>
-      </w:r>
-    </w:p>
-    <w:p>
-      <w:pPr>
-        <w:jc w:val="center"/>
-      </w:pPr>
-      <w:r>
-        <w:rPr>
-          <w:rFonts w:ascii="Times New Roman" w:hAnsi="Times New Roman"/>
-          <w:i/>
-          <w:sz w:val="20"/>
-        </w:rPr>
-        <w:t>(Contenido elaborado por el estudiante)</w:t>
-      </w:r>
-    </w:p>
-    <w:p>
-      <w:pPr>
-        <w:sectPr>
-          <w:footerReference w:type="default" r:id="rId39"/>
-          <w:pgSz w:w="12240" w:h="15840"/>
-          <w:pgMar w:top="1701" w:right="1701" w:bottom="1701" w:left="2268" w:header="720" w:footer="720" w:gutter="0"/>
-          <w:cols w:space="720"/>
-          <w:titlePg/>
-          <w:docGrid w:linePitch="360"/>
-        </w:sectPr>
-      </w:pPr>
-    </w:p>
-    <w:p>
-      <w:bookmarkStart w:id="bm_anexoC" w:name="bm_anexoC"/>
-      <w:pPr>
-        <w:spacing w:before="0" w:after="480"/>
-        <w:jc w:val="center"/>
-      </w:pPr>
-      <w:bookmarkEnd w:id="bm_anexoC"/>
-      <w:r>
-        <w:rPr>
-          <w:rFonts w:ascii="Times New Roman" w:hAnsi="Times New Roman"/>
-          <w:b/>
-          <w:sz w:val="24"/>
-        </w:rPr>
-        <w:t>ANEXO C</w:t>
-      </w:r>
-    </w:p>
-    <w:p>
-      <w:pPr>
-        <w:spacing w:before="240" w:after="480"/>
-        <w:jc w:val="center"/>
-      </w:pPr>
-      <w:r>
-        <w:rPr>
-          <w:rFonts w:ascii="Times New Roman" w:hAnsi="Times New Roman"/>
-          <w:b/>
-          <w:sz w:val="24"/>
-        </w:rPr>
-        <w:t>[Aquí va la descripción del Anexo C]</w:t>
-      </w:r>
-    </w:p>
-    <w:p>
-      <w:pPr>
-        <w:jc w:val="center"/>
-      </w:pPr>
-      <w:r>
-        <w:rPr>
-          <w:rFonts w:ascii="Times New Roman" w:hAnsi="Times New Roman"/>
-          <w:i/>
-          <w:sz w:val="20"/>
-        </w:rPr>
-        <w:t>(Contenido elaborado por el estudiante)</w:t>
-      </w:r>
-    </w:p>
     <w:sectPr>
-      <w:footerReference w:type="default" r:id="rId40"/>
+      <w:footerReference w:type="default" r:id="rId35"/>
       <w:pgSz w:w="12240" w:h="15840"/>
       <w:pgMar w:top="1701" w:right="1701" w:bottom="1701" w:left="2268" w:header="720" w:footer="720" w:gutter="0"/>
       <w:cols w:space="720"/>
@@ -3111,7 +3030,7 @@
         <w:sz w:val="24"/>
       </w:rPr>
       <w:fldChar w:fldCharType="begin"/>
-      <w:instrText xml:space="preserve"> PAGE \* roman </w:instrText>
+      <w:instrText xml:space="preserve"> PAGE </w:instrText>
       <w:fldChar w:fldCharType="separate"/>
       <w:fldChar w:fldCharType="end"/>
     </w:r>
@@ -3142,7 +3061,7 @@
         <w:sz w:val="24"/>
       </w:rPr>
       <w:fldChar w:fldCharType="begin"/>
-      <w:instrText xml:space="preserve"> PAGE \* roman </w:instrText>
+      <w:instrText xml:space="preserve"> PAGE </w:instrText>
       <w:fldChar w:fldCharType="separate"/>
       <w:fldChar w:fldCharType="end"/>
     </w:r>
@@ -3213,111 +3132,6 @@
 </w:ftr>
 </file>
 
-<file path=word/footer24.xml><?xml version="1.0" encoding="utf-8"?>
-<w:ftr xmlns:m="http://schemas.openxmlformats.org/officeDocument/2006/math" xmlns:mc="http://schemas.openxmlformats.org/markup-compatibility/2006" xmlns:mo="http://schemas.microsoft.com/office/mac/office/2008/main" xmlns:mv="urn:schemas-microsoft-com:mac:vml" xmlns:o="urn:schemas-microsoft-com:office:office" xmlns:r="http://schemas.openxmlformats.org/officeDocument/2006/relationships" xmlns:v="urn:schemas-microsoft-com:vml" xmlns:w10="urn:schemas-microsoft-com:office:word" xmlns:w14="http://schemas.microsoft.com/office/word/2010/wordml" xmlns:w="http://schemas.openxmlformats.org/wordprocessingml/2006/main" xmlns:wne="http://schemas.microsoft.com/office/word/2006/wordml" xmlns:wp14="http://schemas.microsoft.com/office/word/2010/wordprocessingDrawing" xmlns:wp="http://schemas.openxmlformats.org/drawingml/2006/wordprocessingDrawing" xmlns:wpc="http://schemas.microsoft.com/office/word/2010/wordprocessingCanvas" xmlns:wpg="http://schemas.microsoft.com/office/word/2010/wordprocessingGroup" xmlns:wpi="http://schemas.microsoft.com/office/word/2010/wordprocessingInk" xmlns:wps="http://schemas.microsoft.com/office/word/2010/wordprocessingShape" mc:Ignorable="w14 wp14">
-  <w:p>
-    <w:pPr>
-      <w:pStyle w:val="Footer"/>
-      <w:jc w:val="center"/>
-    </w:pPr>
-    <w:r>
-      <w:rPr>
-        <w:rFonts w:ascii="Times New Roman" w:hAnsi="Times New Roman"/>
-        <w:sz w:val="24"/>
-      </w:rPr>
-      <w:fldChar w:fldCharType="begin"/>
-      <w:instrText xml:space="preserve"> PAGE </w:instrText>
-      <w:fldChar w:fldCharType="separate"/>
-      <w:fldChar w:fldCharType="end"/>
-    </w:r>
-  </w:p>
-</w:ftr>
-</file>
-
-<file path=word/footer25.xml><?xml version="1.0" encoding="utf-8"?>
-<w:ftr xmlns:m="http://schemas.openxmlformats.org/officeDocument/2006/math" xmlns:mc="http://schemas.openxmlformats.org/markup-compatibility/2006" xmlns:mo="http://schemas.microsoft.com/office/mac/office/2008/main" xmlns:mv="urn:schemas-microsoft-com:mac:vml" xmlns:o="urn:schemas-microsoft-com:office:office" xmlns:r="http://schemas.openxmlformats.org/officeDocument/2006/relationships" xmlns:v="urn:schemas-microsoft-com:vml" xmlns:w10="urn:schemas-microsoft-com:office:word" xmlns:w14="http://schemas.microsoft.com/office/word/2010/wordml" xmlns:w="http://schemas.openxmlformats.org/wordprocessingml/2006/main" xmlns:wne="http://schemas.microsoft.com/office/word/2006/wordml" xmlns:wp14="http://schemas.microsoft.com/office/word/2010/wordprocessingDrawing" xmlns:wp="http://schemas.openxmlformats.org/drawingml/2006/wordprocessingDrawing" xmlns:wpc="http://schemas.microsoft.com/office/word/2010/wordprocessingCanvas" xmlns:wpg="http://schemas.microsoft.com/office/word/2010/wordprocessingGroup" xmlns:wpi="http://schemas.microsoft.com/office/word/2010/wordprocessingInk" xmlns:wps="http://schemas.microsoft.com/office/word/2010/wordprocessingShape" mc:Ignorable="w14 wp14">
-  <w:p>
-    <w:pPr>
-      <w:pStyle w:val="Footer"/>
-      <w:jc w:val="center"/>
-    </w:pPr>
-    <w:r>
-      <w:rPr>
-        <w:rFonts w:ascii="Times New Roman" w:hAnsi="Times New Roman"/>
-        <w:sz w:val="24"/>
-      </w:rPr>
-      <w:fldChar w:fldCharType="begin"/>
-      <w:instrText xml:space="preserve"> PAGE </w:instrText>
-      <w:fldChar w:fldCharType="separate"/>
-      <w:fldChar w:fldCharType="end"/>
-    </w:r>
-  </w:p>
-</w:ftr>
-</file>
-
-<file path=word/footer26.xml><?xml version="1.0" encoding="utf-8"?>
-<w:ftr xmlns:m="http://schemas.openxmlformats.org/officeDocument/2006/math" xmlns:mc="http://schemas.openxmlformats.org/markup-compatibility/2006" xmlns:mo="http://schemas.microsoft.com/office/mac/office/2008/main" xmlns:mv="urn:schemas-microsoft-com:mac:vml" xmlns:o="urn:schemas-microsoft-com:office:office" xmlns:r="http://schemas.openxmlformats.org/officeDocument/2006/relationships" xmlns:v="urn:schemas-microsoft-com:vml" xmlns:w10="urn:schemas-microsoft-com:office:word" xmlns:w14="http://schemas.microsoft.com/office/word/2010/wordml" xmlns:w="http://schemas.openxmlformats.org/wordprocessingml/2006/main" xmlns:wne="http://schemas.microsoft.com/office/word/2006/wordml" xmlns:wp14="http://schemas.microsoft.com/office/word/2010/wordprocessingDrawing" xmlns:wp="http://schemas.openxmlformats.org/drawingml/2006/wordprocessingDrawing" xmlns:wpc="http://schemas.microsoft.com/office/word/2010/wordprocessingCanvas" xmlns:wpg="http://schemas.microsoft.com/office/word/2010/wordprocessingGroup" xmlns:wpi="http://schemas.microsoft.com/office/word/2010/wordprocessingInk" xmlns:wps="http://schemas.microsoft.com/office/word/2010/wordprocessingShape" mc:Ignorable="w14 wp14">
-  <w:p>
-    <w:pPr>
-      <w:pStyle w:val="Footer"/>
-      <w:jc w:val="center"/>
-    </w:pPr>
-    <w:r>
-      <w:rPr>
-        <w:rFonts w:ascii="Times New Roman" w:hAnsi="Times New Roman"/>
-        <w:sz w:val="24"/>
-      </w:rPr>
-      <w:fldChar w:fldCharType="begin"/>
-      <w:instrText xml:space="preserve"> PAGE </w:instrText>
-      <w:fldChar w:fldCharType="separate"/>
-      <w:fldChar w:fldCharType="end"/>
-    </w:r>
-  </w:p>
-</w:ftr>
-</file>
-
-<file path=word/footer27.xml><?xml version="1.0" encoding="utf-8"?>
-<w:ftr xmlns:m="http://schemas.openxmlformats.org/officeDocument/2006/math" xmlns:mc="http://schemas.openxmlformats.org/markup-compatibility/2006" xmlns:mo="http://schemas.microsoft.com/office/mac/office/2008/main" xmlns:mv="urn:schemas-microsoft-com:mac:vml" xmlns:o="urn:schemas-microsoft-com:office:office" xmlns:r="http://schemas.openxmlformats.org/officeDocument/2006/relationships" xmlns:v="urn:schemas-microsoft-com:vml" xmlns:w10="urn:schemas-microsoft-com:office:word" xmlns:w14="http://schemas.microsoft.com/office/word/2010/wordml" xmlns:w="http://schemas.openxmlformats.org/wordprocessingml/2006/main" xmlns:wne="http://schemas.microsoft.com/office/word/2006/wordml" xmlns:wp14="http://schemas.microsoft.com/office/word/2010/wordprocessingDrawing" xmlns:wp="http://schemas.openxmlformats.org/drawingml/2006/wordprocessingDrawing" xmlns:wpc="http://schemas.microsoft.com/office/word/2010/wordprocessingCanvas" xmlns:wpg="http://schemas.microsoft.com/office/word/2010/wordprocessingGroup" xmlns:wpi="http://schemas.microsoft.com/office/word/2010/wordprocessingInk" xmlns:wps="http://schemas.microsoft.com/office/word/2010/wordprocessingShape" mc:Ignorable="w14 wp14">
-  <w:p>
-    <w:pPr>
-      <w:pStyle w:val="Footer"/>
-      <w:jc w:val="center"/>
-    </w:pPr>
-    <w:r>
-      <w:rPr>
-        <w:rFonts w:ascii="Times New Roman" w:hAnsi="Times New Roman"/>
-        <w:sz w:val="24"/>
-      </w:rPr>
-      <w:fldChar w:fldCharType="begin"/>
-      <w:instrText xml:space="preserve"> PAGE </w:instrText>
-      <w:fldChar w:fldCharType="separate"/>
-      <w:fldChar w:fldCharType="end"/>
-    </w:r>
-  </w:p>
-</w:ftr>
-</file>
-
-<file path=word/footer28.xml><?xml version="1.0" encoding="utf-8"?>
-<w:ftr xmlns:m="http://schemas.openxmlformats.org/officeDocument/2006/math" xmlns:mc="http://schemas.openxmlformats.org/markup-compatibility/2006" xmlns:mo="http://schemas.microsoft.com/office/mac/office/2008/main" xmlns:mv="urn:schemas-microsoft-com:mac:vml" xmlns:o="urn:schemas-microsoft-com:office:office" xmlns:r="http://schemas.openxmlformats.org/officeDocument/2006/relationships" xmlns:v="urn:schemas-microsoft-com:vml" xmlns:w10="urn:schemas-microsoft-com:office:word" xmlns:w14="http://schemas.microsoft.com/office/word/2010/wordml" xmlns:w="http://schemas.openxmlformats.org/wordprocessingml/2006/main" xmlns:wne="http://schemas.microsoft.com/office/word/2006/wordml" xmlns:wp14="http://schemas.microsoft.com/office/word/2010/wordprocessingDrawing" xmlns:wp="http://schemas.openxmlformats.org/drawingml/2006/wordprocessingDrawing" xmlns:wpc="http://schemas.microsoft.com/office/word/2010/wordprocessingCanvas" xmlns:wpg="http://schemas.microsoft.com/office/word/2010/wordprocessingGroup" xmlns:wpi="http://schemas.microsoft.com/office/word/2010/wordprocessingInk" xmlns:wps="http://schemas.microsoft.com/office/word/2010/wordprocessingShape" mc:Ignorable="w14 wp14">
-  <w:p>
-    <w:pPr>
-      <w:pStyle w:val="Footer"/>
-      <w:jc w:val="center"/>
-    </w:pPr>
-    <w:r>
-      <w:rPr>
-        <w:rFonts w:ascii="Times New Roman" w:hAnsi="Times New Roman"/>
-        <w:sz w:val="24"/>
-      </w:rPr>
-      <w:fldChar w:fldCharType="begin"/>
-      <w:instrText xml:space="preserve"> PAGE </w:instrText>
-      <w:fldChar w:fldCharType="separate"/>
-      <w:fldChar w:fldCharType="end"/>
-    </w:r>
-  </w:p>
-</w:ftr>
-</file>
-
 <file path=word/footer3.xml><?xml version="1.0" encoding="utf-8"?>
 <w:ftr xmlns:m="http://schemas.openxmlformats.org/officeDocument/2006/math" xmlns:mc="http://schemas.openxmlformats.org/markup-compatibility/2006" xmlns:mo="http://schemas.microsoft.com/office/mac/office/2008/main" xmlns:mv="urn:schemas-microsoft-com:mac:vml" xmlns:o="urn:schemas-microsoft-com:office:office" xmlns:r="http://schemas.openxmlformats.org/officeDocument/2006/relationships" xmlns:v="urn:schemas-microsoft-com:vml" xmlns:w10="urn:schemas-microsoft-com:office:word" xmlns:w14="http://schemas.microsoft.com/office/word/2010/wordml" xmlns:w="http://schemas.openxmlformats.org/wordprocessingml/2006/main" xmlns:wne="http://schemas.microsoft.com/office/word/2006/wordml" xmlns:wp14="http://schemas.microsoft.com/office/word/2010/wordprocessingDrawing" xmlns:wp="http://schemas.openxmlformats.org/drawingml/2006/wordprocessingDrawing" xmlns:wpc="http://schemas.microsoft.com/office/word/2010/wordprocessingCanvas" xmlns:wpg="http://schemas.microsoft.com/office/word/2010/wordprocessingGroup" xmlns:wpi="http://schemas.microsoft.com/office/word/2010/wordprocessingInk" xmlns:wps="http://schemas.microsoft.com/office/word/2010/wordprocessingShape" mc:Ignorable="w14 wp14">
   <w:p>
@@ -3365,6 +3179,26 @@
   <w:p>
     <w:pPr>
       <w:pStyle w:val="Footer"/>
+    </w:pPr>
+  </w:p>
+</w:ftr>
+</file>
+
+<file path=word/footer6.xml><?xml version="1.0" encoding="utf-8"?>
+<w:ftr xmlns:m="http://schemas.openxmlformats.org/officeDocument/2006/math" xmlns:mc="http://schemas.openxmlformats.org/markup-compatibility/2006" xmlns:mo="http://schemas.microsoft.com/office/mac/office/2008/main" xmlns:mv="urn:schemas-microsoft-com:mac:vml" xmlns:o="urn:schemas-microsoft-com:office:office" xmlns:r="http://schemas.openxmlformats.org/officeDocument/2006/relationships" xmlns:v="urn:schemas-microsoft-com:vml" xmlns:w10="urn:schemas-microsoft-com:office:word" xmlns:w14="http://schemas.microsoft.com/office/word/2010/wordml" xmlns:w="http://schemas.openxmlformats.org/wordprocessingml/2006/main" xmlns:wne="http://schemas.microsoft.com/office/word/2006/wordml" xmlns:wp14="http://schemas.microsoft.com/office/word/2010/wordprocessingDrawing" xmlns:wp="http://schemas.openxmlformats.org/drawingml/2006/wordprocessingDrawing" xmlns:wpc="http://schemas.microsoft.com/office/word/2010/wordprocessingCanvas" xmlns:wpg="http://schemas.microsoft.com/office/word/2010/wordprocessingGroup" xmlns:wpi="http://schemas.microsoft.com/office/word/2010/wordprocessingInk" xmlns:wps="http://schemas.microsoft.com/office/word/2010/wordprocessingShape" mc:Ignorable="w14 wp14">
+  <w:p>
+    <w:pPr>
+      <w:pStyle w:val="Footer"/>
+    </w:pPr>
+  </w:p>
+</w:ftr>
+</file>
+
+<file path=word/footer7.xml><?xml version="1.0" encoding="utf-8"?>
+<w:ftr xmlns:m="http://schemas.openxmlformats.org/officeDocument/2006/math" xmlns:mc="http://schemas.openxmlformats.org/markup-compatibility/2006" xmlns:mo="http://schemas.microsoft.com/office/mac/office/2008/main" xmlns:mv="urn:schemas-microsoft-com:mac:vml" xmlns:o="urn:schemas-microsoft-com:office:office" xmlns:r="http://schemas.openxmlformats.org/officeDocument/2006/relationships" xmlns:v="urn:schemas-microsoft-com:vml" xmlns:w10="urn:schemas-microsoft-com:office:word" xmlns:w14="http://schemas.microsoft.com/office/word/2010/wordml" xmlns:w="http://schemas.openxmlformats.org/wordprocessingml/2006/main" xmlns:wne="http://schemas.microsoft.com/office/word/2006/wordml" xmlns:wp14="http://schemas.microsoft.com/office/word/2010/wordprocessingDrawing" xmlns:wp="http://schemas.openxmlformats.org/drawingml/2006/wordprocessingDrawing" xmlns:wpc="http://schemas.microsoft.com/office/word/2010/wordprocessingCanvas" xmlns:wpg="http://schemas.microsoft.com/office/word/2010/wordprocessingGroup" xmlns:wpi="http://schemas.microsoft.com/office/word/2010/wordprocessingInk" xmlns:wps="http://schemas.microsoft.com/office/word/2010/wordprocessingShape" mc:Ignorable="w14 wp14">
+  <w:p>
+    <w:pPr>
+      <w:pStyle w:val="Footer"/>
       <w:jc w:val="center"/>
     </w:pPr>
     <w:r>
@@ -3381,7 +3215,7 @@
 </w:ftr>
 </file>
 
-<file path=word/footer6.xml><?xml version="1.0" encoding="utf-8"?>
+<file path=word/footer8.xml><?xml version="1.0" encoding="utf-8"?>
 <w:ftr xmlns:m="http://schemas.openxmlformats.org/officeDocument/2006/math" xmlns:mc="http://schemas.openxmlformats.org/markup-compatibility/2006" xmlns:mo="http://schemas.microsoft.com/office/mac/office/2008/main" xmlns:mv="urn:schemas-microsoft-com:mac:vml" xmlns:o="urn:schemas-microsoft-com:office:office" xmlns:r="http://schemas.openxmlformats.org/officeDocument/2006/relationships" xmlns:v="urn:schemas-microsoft-com:vml" xmlns:w10="urn:schemas-microsoft-com:office:word" xmlns:w14="http://schemas.microsoft.com/office/word/2010/wordml" xmlns:w="http://schemas.openxmlformats.org/wordprocessingml/2006/main" xmlns:wne="http://schemas.microsoft.com/office/word/2006/wordml" xmlns:wp14="http://schemas.microsoft.com/office/word/2010/wordprocessingDrawing" xmlns:wp="http://schemas.openxmlformats.org/drawingml/2006/wordprocessingDrawing" xmlns:wpc="http://schemas.microsoft.com/office/word/2010/wordprocessingCanvas" xmlns:wpg="http://schemas.microsoft.com/office/word/2010/wordprocessingGroup" xmlns:wpi="http://schemas.microsoft.com/office/word/2010/wordprocessingInk" xmlns:wps="http://schemas.microsoft.com/office/word/2010/wordprocessingShape" mc:Ignorable="w14 wp14">
   <w:p>
     <w:pPr>
@@ -3398,26 +3232,6 @@
       <w:fldChar w:fldCharType="separate"/>
       <w:fldChar w:fldCharType="end"/>
     </w:r>
-  </w:p>
-</w:ftr>
-</file>
-
-<file path=word/footer7.xml><?xml version="1.0" encoding="utf-8"?>
-<w:ftr xmlns:m="http://schemas.openxmlformats.org/officeDocument/2006/math" xmlns:mc="http://schemas.openxmlformats.org/markup-compatibility/2006" xmlns:mo="http://schemas.microsoft.com/office/mac/office/2008/main" xmlns:mv="urn:schemas-microsoft-com:mac:vml" xmlns:o="urn:schemas-microsoft-com:office:office" xmlns:r="http://schemas.openxmlformats.org/officeDocument/2006/relationships" xmlns:v="urn:schemas-microsoft-com:vml" xmlns:w10="urn:schemas-microsoft-com:office:word" xmlns:w14="http://schemas.microsoft.com/office/word/2010/wordml" xmlns:w="http://schemas.openxmlformats.org/wordprocessingml/2006/main" xmlns:wne="http://schemas.microsoft.com/office/word/2006/wordml" xmlns:wp14="http://schemas.microsoft.com/office/word/2010/wordprocessingDrawing" xmlns:wp="http://schemas.openxmlformats.org/drawingml/2006/wordprocessingDrawing" xmlns:wpc="http://schemas.microsoft.com/office/word/2010/wordprocessingCanvas" xmlns:wpg="http://schemas.microsoft.com/office/word/2010/wordprocessingGroup" xmlns:wpi="http://schemas.microsoft.com/office/word/2010/wordprocessingInk" xmlns:wps="http://schemas.microsoft.com/office/word/2010/wordprocessingShape" mc:Ignorable="w14 wp14">
-  <w:p>
-    <w:pPr>
-      <w:pStyle w:val="Footer"/>
-    </w:pPr>
-  </w:p>
-</w:ftr>
-</file>
-
-<file path=word/footer8.xml><?xml version="1.0" encoding="utf-8"?>
-<w:ftr xmlns:m="http://schemas.openxmlformats.org/officeDocument/2006/math" xmlns:mc="http://schemas.openxmlformats.org/markup-compatibility/2006" xmlns:mo="http://schemas.microsoft.com/office/mac/office/2008/main" xmlns:mv="urn:schemas-microsoft-com:mac:vml" xmlns:o="urn:schemas-microsoft-com:office:office" xmlns:r="http://schemas.openxmlformats.org/officeDocument/2006/relationships" xmlns:v="urn:schemas-microsoft-com:vml" xmlns:w10="urn:schemas-microsoft-com:office:word" xmlns:w14="http://schemas.microsoft.com/office/word/2010/wordml" xmlns:w="http://schemas.openxmlformats.org/wordprocessingml/2006/main" xmlns:wne="http://schemas.microsoft.com/office/word/2006/wordml" xmlns:wp14="http://schemas.microsoft.com/office/word/2010/wordprocessingDrawing" xmlns:wp="http://schemas.openxmlformats.org/drawingml/2006/wordprocessingDrawing" xmlns:wpc="http://schemas.microsoft.com/office/word/2010/wordprocessingCanvas" xmlns:wpg="http://schemas.microsoft.com/office/word/2010/wordprocessingGroup" xmlns:wpi="http://schemas.microsoft.com/office/word/2010/wordprocessingInk" xmlns:wps="http://schemas.microsoft.com/office/word/2010/wordprocessingShape" mc:Ignorable="w14 wp14">
-  <w:p>
-    <w:pPr>
-      <w:pStyle w:val="Footer"/>
-    </w:pPr>
   </w:p>
 </w:ftr>
 </file>

</xml_diff>

<commit_message>
Recompilar informes, borradores y cronogramas de todos
</commit_message>
<xml_diff>
--- a/amaal/reportes/Informe_Pasantia_IUTECP_BORRADOR1.docx
+++ b/amaal/reportes/Informe_Pasantia_IUTECP_BORRADOR1.docx
@@ -4,7 +4,7 @@
   <w:body>
     <w:p>
       <w:pPr>
-        <w:spacing w:line="276" w:lineRule="auto" w:before="0" w:after="0"/>
+        <w:spacing w:line="240" w:lineRule="auto" w:before="0" w:after="0"/>
         <w:jc w:val="center"/>
       </w:pPr>
       <w:r>
@@ -54,7 +54,7 @@
     </w:p>
     <w:p>
       <w:pPr>
-        <w:spacing w:before="947" w:after="1242"/>
+        <w:spacing w:before="400" w:after="240"/>
         <w:jc w:val="center"/>
       </w:pPr>
       <w:r>
@@ -94,7 +94,7 @@
     </w:p>
     <w:p>
       <w:pPr>
-        <w:spacing w:line="276" w:lineRule="auto" w:before="0" w:after="0"/>
+        <w:spacing w:line="360" w:lineRule="auto" w:before="1080" w:after="0"/>
         <w:jc w:val="center"/>
       </w:pPr>
       <w:r>
@@ -108,7 +108,7 @@
     </w:p>
     <w:p>
       <w:pPr>
-        <w:spacing w:line="276" w:lineRule="auto" w:before="3158" w:after="0"/>
+        <w:spacing w:line="240" w:lineRule="auto" w:before="2100"/>
         <w:jc w:val="right"/>
       </w:pPr>
       <w:r>
@@ -123,7 +123,7 @@
       <w:r>
         <w:rPr>
           <w:rFonts w:ascii="Times New Roman" w:hAnsi="Times New Roman"/>
-          <w:b/>
+          <w:b w:val="0"/>
           <w:sz w:val="24"/>
         </w:rPr>
         <w:t>Alrifaai Alrifaaie, Amaal</w:t>
@@ -132,7 +132,7 @@
       <w:r>
         <w:rPr>
           <w:rFonts w:ascii="Times New Roman" w:hAnsi="Times New Roman"/>
-          <w:b/>
+          <w:b w:val="0"/>
           <w:sz w:val="24"/>
         </w:rPr>
         <w:t>C.I.: 31.985.792</w:t>
@@ -140,7 +140,7 @@
     </w:p>
     <w:p>
       <w:pPr>
-        <w:spacing w:line="276" w:lineRule="auto" w:before="1579" w:after="0"/>
+        <w:spacing w:before="1240"/>
         <w:jc w:val="center"/>
       </w:pPr>
       <w:r>
@@ -155,6 +155,7 @@
       <w:pPr>
         <w:sectPr>
           <w:footerReference w:type="default" r:id="rId15"/>
+          <w:footerReference w:type="first" r:id="rId16"/>
           <w:pgSz w:w="12240" w:h="15840"/>
           <w:pgMar w:top="1701" w:right="1701" w:bottom="1701" w:left="2268" w:header="720" w:footer="720" w:gutter="0"/>
           <w:cols w:space="720"/>
@@ -164,7 +165,7 @@
     </w:p>
     <w:p>
       <w:pPr>
-        <w:spacing w:line="276" w:lineRule="auto" w:before="0" w:after="0"/>
+        <w:spacing w:line="240" w:lineRule="auto" w:before="0" w:after="0"/>
         <w:jc w:val="center"/>
       </w:pPr>
       <w:r>
@@ -214,7 +215,7 @@
     </w:p>
     <w:p>
       <w:pPr>
-        <w:spacing w:line="276" w:lineRule="auto" w:before="3053" w:after="0"/>
+        <w:spacing w:line="360" w:lineRule="auto" w:before="1280" w:after="0"/>
         <w:jc w:val="center"/>
       </w:pPr>
       <w:r>
@@ -228,7 +229,21 @@
     </w:p>
     <w:p>
       <w:pPr>
-        <w:spacing w:before="2544" w:after="0" w:line="20" w:lineRule="exact"/>
+        <w:spacing w:line="360" w:lineRule="auto" w:before="440" w:after="0"/>
+        <w:jc w:val="center"/>
+      </w:pPr>
+      <w:r>
+        <w:rPr>
+          <w:rFonts w:ascii="Times New Roman" w:hAnsi="Times New Roman"/>
+          <w:b/>
+          <w:sz w:val="24"/>
+        </w:rPr>
+        <w:t>Informe de pasantías para obtener el título de Técnico Superior Universitario en la especialidad de: Administración</w:t>
+      </w:r>
+    </w:p>
+    <w:p>
+      <w:pPr>
+        <w:spacing w:before="2100" w:after="0" w:line="20" w:lineRule="exact"/>
       </w:pPr>
     </w:p>
     <w:tbl>
@@ -253,11 +268,10 @@
         <w:tc>
           <w:tcPr>
             <w:tcW w:type="dxa" w:w="4133"/>
-            <w:vAlign w:val="top"/>
           </w:tcPr>
           <w:p>
             <w:pPr>
-              <w:spacing w:line="276" w:lineRule="auto"/>
+              <w:spacing w:line="240" w:lineRule="auto"/>
               <w:jc w:val="left"/>
             </w:pPr>
             <w:r>
@@ -272,7 +286,7 @@
             <w:r>
               <w:rPr>
                 <w:rFonts w:ascii="Times New Roman" w:hAnsi="Times New Roman"/>
-                <w:b/>
+                <w:b w:val="0"/>
                 <w:sz w:val="24"/>
               </w:rPr>
               <w:t>Mata, Lenny</w:t>
@@ -281,7 +295,7 @@
             <w:r>
               <w:rPr>
                 <w:rFonts w:ascii="Times New Roman" w:hAnsi="Times New Roman"/>
-                <w:b/>
+                <w:b w:val="0"/>
                 <w:sz w:val="24"/>
               </w:rPr>
               <w:t>C.I.: 8969750</w:t>
@@ -290,7 +304,7 @@
             <w:r>
               <w:rPr>
                 <w:rFonts w:ascii="Times New Roman" w:hAnsi="Times New Roman"/>
-                <w:b/>
+                <w:b w:val="0"/>
                 <w:sz w:val="24"/>
               </w:rPr>
               <w:br/>
@@ -307,7 +321,7 @@
             <w:r>
               <w:rPr>
                 <w:rFonts w:ascii="Times New Roman" w:hAnsi="Times New Roman"/>
-                <w:b/>
+                <w:b w:val="0"/>
                 <w:sz w:val="24"/>
               </w:rPr>
               <w:t>Dra. Álvarez, Carmen</w:t>
@@ -316,7 +330,7 @@
             <w:r>
               <w:rPr>
                 <w:rFonts w:ascii="Times New Roman" w:hAnsi="Times New Roman"/>
-                <w:b/>
+                <w:b w:val="0"/>
                 <w:sz w:val="24"/>
               </w:rPr>
               <w:t>C.I.: 14.452.956</w:t>
@@ -326,11 +340,10 @@
         <w:tc>
           <w:tcPr>
             <w:tcW w:type="dxa" w:w="4139"/>
-            <w:vAlign w:val="top"/>
           </w:tcPr>
           <w:p>
             <w:pPr>
-              <w:spacing w:line="276" w:lineRule="auto"/>
+              <w:spacing w:line="240" w:lineRule="auto"/>
               <w:jc w:val="right"/>
             </w:pPr>
             <w:r>
@@ -345,7 +358,7 @@
             <w:r>
               <w:rPr>
                 <w:rFonts w:ascii="Times New Roman" w:hAnsi="Times New Roman"/>
-                <w:b/>
+                <w:b w:val="0"/>
                 <w:sz w:val="24"/>
               </w:rPr>
               <w:t>Alrifaai Alrifaaie, Amaal</w:t>
@@ -354,7 +367,7 @@
             <w:r>
               <w:rPr>
                 <w:rFonts w:ascii="Times New Roman" w:hAnsi="Times New Roman"/>
-                <w:b/>
+                <w:b w:val="0"/>
                 <w:sz w:val="24"/>
               </w:rPr>
               <w:t>C.I.: 31.985.792</w:t>
@@ -365,7 +378,7 @@
     </w:tbl>
     <w:p>
       <w:pPr>
-        <w:spacing w:line="276" w:lineRule="auto" w:before="1272" w:after="0"/>
+        <w:spacing w:before="800"/>
         <w:jc w:val="center"/>
       </w:pPr>
       <w:r>
@@ -379,12 +392,13 @@
     <w:p>
       <w:pPr>
         <w:sectPr>
-          <w:footerReference w:type="default" r:id="rId16"/>
+          <w:footerReference w:type="default" r:id="rId17"/>
+          <w:footerReference w:type="first" r:id="rId18"/>
           <w:pgSz w:w="12240" w:h="15840"/>
           <w:pgMar w:top="1701" w:right="1701" w:bottom="1701" w:left="2268" w:header="720" w:footer="720" w:gutter="0"/>
           <w:cols w:space="720"/>
-          <w:titlePg/>
           <w:docGrid w:linePitch="360"/>
+          <w:pgNumType w:start="2" w:fmt="lowerRoman"/>
         </w:sectPr>
       </w:pPr>
     </w:p>
@@ -575,12 +589,13 @@
     <w:p>
       <w:pPr>
         <w:sectPr>
-          <w:footerReference w:type="default" r:id="rId17"/>
+          <w:footerReference w:type="default" r:id="rId19"/>
+          <w:footerReference w:type="first" r:id="rId20"/>
           <w:pgSz w:w="12240" w:h="15840"/>
           <w:pgMar w:top="1701" w:right="1701" w:bottom="1701" w:left="2268" w:header="720" w:footer="720" w:gutter="0"/>
           <w:cols w:space="720"/>
-          <w:titlePg/>
           <w:docGrid w:linePitch="360"/>
+          <w:pgNumType w:fmt="lowerRoman"/>
         </w:sectPr>
       </w:pPr>
     </w:p>
@@ -744,18 +759,20 @@
     <w:p>
       <w:pPr>
         <w:sectPr>
-          <w:footerReference w:type="default" r:id="rId18"/>
+          <w:footerReference w:type="default" r:id="rId21"/>
+          <w:footerReference w:type="first" r:id="rId22"/>
           <w:pgSz w:w="12240" w:h="15840"/>
           <w:pgMar w:top="1701" w:right="1701" w:bottom="1701" w:left="2268" w:header="720" w:footer="720" w:gutter="0"/>
           <w:cols w:space="720"/>
-          <w:titlePg/>
           <w:docGrid w:linePitch="360"/>
+          <w:pgNumType w:fmt="lowerRoman"/>
         </w:sectPr>
       </w:pPr>
     </w:p>
     <w:p>
-      <w:pPr>
-        <w:spacing w:before="1140" w:after="480"/>
+      <w:bookmarkStart w:id="bm_indice" w:name="bm_indice"/>
+      <w:pPr>
+        <w:spacing w:before="1140" w:after="480" w:line="360" w:lineRule="auto"/>
         <w:jc w:val="center"/>
       </w:pPr>
       <w:r>
@@ -766,22 +783,11 @@
         </w:rPr>
         <w:t>ÍNDICE DE CONTENIDO</w:t>
       </w:r>
+      <w:bookmarkEnd w:id="bm_indice"/>
     </w:p>
     <w:p>
       <w:pPr>
-        <w:sectPr>
-          <w:footerReference w:type="default" r:id="rId19"/>
-          <w:pgSz w:w="12240" w:h="15840"/>
-          <w:pgMar w:top="1701" w:right="1701" w:bottom="1701" w:left="2268" w:header="720" w:footer="720" w:gutter="0"/>
-          <w:cols w:space="720"/>
-          <w:titlePg/>
-          <w:docGrid w:linePitch="360"/>
-        </w:sectPr>
-      </w:pPr>
-    </w:p>
-    <w:p>
-      <w:pPr>
-        <w:spacing w:after="240"/>
+        <w:spacing w:after="80"/>
         <w:jc w:val="right"/>
       </w:pPr>
       <w:r>
@@ -798,7 +804,33 @@
         <w:tabs>
           <w:tab w:pos="8271" w:val="right" w:leader="dot"/>
         </w:tabs>
-        <w:spacing w:line="360" w:lineRule="auto" w:before="0" w:after="80"/>
+        <w:spacing w:line="240" w:lineRule="auto" w:before="0" w:after="0"/>
+        <w:ind w:left="0"/>
+      </w:pPr>
+      <w:r>
+        <w:rPr>
+          <w:rFonts w:ascii="Times New Roman" w:hAnsi="Times New Roman"/>
+          <w:b w:val="0"/>
+          <w:sz w:val="24"/>
+        </w:rPr>
+        <w:t>CONTRAPORTADA</w:t>
+        <w:tab/>
+      </w:r>
+      <w:r>
+        <w:rPr>
+          <w:rFonts w:ascii="Times New Roman" w:hAnsi="Times New Roman"/>
+          <w:b w:val="0"/>
+          <w:sz w:val="24"/>
+        </w:rPr>
+        <w:t>ii</w:t>
+      </w:r>
+    </w:p>
+    <w:p>
+      <w:pPr>
+        <w:tabs>
+          <w:tab w:pos="8271" w:val="right" w:leader="dot"/>
+        </w:tabs>
+        <w:spacing w:line="240" w:lineRule="auto" w:before="0" w:after="0"/>
         <w:ind w:left="0"/>
       </w:pPr>
       <w:r>
@@ -816,11 +848,7 @@
           <w:b w:val="0"/>
           <w:sz w:val="24"/>
         </w:rPr>
-        <w:fldChar w:fldCharType="begin"/>
-        <w:instrText xml:space="preserve"> PAGEREF bm_aprob_ind \h </w:instrText>
-        <w:fldChar w:fldCharType="separate"/>
-        <w:t>?</w:t>
-        <w:fldChar w:fldCharType="end"/>
+        <w:t>iii</w:t>
       </w:r>
     </w:p>
     <w:p>
@@ -828,7 +856,7 @@
         <w:tabs>
           <w:tab w:pos="8271" w:val="right" w:leader="dot"/>
         </w:tabs>
-        <w:spacing w:line="360" w:lineRule="auto" w:before="0" w:after="80"/>
+        <w:spacing w:line="240" w:lineRule="auto" w:before="0" w:after="0"/>
         <w:ind w:left="0"/>
       </w:pPr>
       <w:r>
@@ -846,11 +874,7 @@
           <w:b w:val="0"/>
           <w:sz w:val="24"/>
         </w:rPr>
-        <w:fldChar w:fldCharType="begin"/>
-        <w:instrText xml:space="preserve"> PAGEREF bm_aprob_acad \h </w:instrText>
-        <w:fldChar w:fldCharType="separate"/>
-        <w:t>?</w:t>
-        <w:fldChar w:fldCharType="end"/>
+        <w:t>iv</w:t>
       </w:r>
     </w:p>
     <w:p>
@@ -858,7 +882,33 @@
         <w:tabs>
           <w:tab w:pos="8271" w:val="right" w:leader="dot"/>
         </w:tabs>
-        <w:spacing w:line="360" w:lineRule="auto" w:before="0" w:after="80"/>
+        <w:spacing w:line="240" w:lineRule="auto" w:before="0" w:after="0"/>
+        <w:ind w:left="0"/>
+      </w:pPr>
+      <w:r>
+        <w:rPr>
+          <w:rFonts w:ascii="Times New Roman" w:hAnsi="Times New Roman"/>
+          <w:b w:val="0"/>
+          <w:sz w:val="24"/>
+        </w:rPr>
+        <w:t>ÍNDICE DE CONTENIDO</w:t>
+        <w:tab/>
+      </w:r>
+      <w:r>
+        <w:rPr>
+          <w:rFonts w:ascii="Times New Roman" w:hAnsi="Times New Roman"/>
+          <w:b w:val="0"/>
+          <w:sz w:val="24"/>
+        </w:rPr>
+        <w:t>v</w:t>
+      </w:r>
+    </w:p>
+    <w:p>
+      <w:pPr>
+        <w:tabs>
+          <w:tab w:pos="8271" w:val="right" w:leader="dot"/>
+        </w:tabs>
+        <w:spacing w:line="240" w:lineRule="auto" w:before="0" w:after="0"/>
         <w:ind w:left="0"/>
       </w:pPr>
       <w:r>
@@ -876,11 +926,7 @@
           <w:b w:val="0"/>
           <w:sz w:val="24"/>
         </w:rPr>
-        <w:fldChar w:fldCharType="begin"/>
-        <w:instrText xml:space="preserve"> PAGEREF bm_lista_cuadros \h </w:instrText>
-        <w:fldChar w:fldCharType="separate"/>
-        <w:t>?</w:t>
-        <w:fldChar w:fldCharType="end"/>
+        <w:t>vi</w:t>
       </w:r>
     </w:p>
     <w:p>
@@ -888,37 +934,7 @@
         <w:tabs>
           <w:tab w:pos="8271" w:val="right" w:leader="dot"/>
         </w:tabs>
-        <w:spacing w:line="360" w:lineRule="auto" w:before="0" w:after="80"/>
-        <w:ind w:left="0"/>
-      </w:pPr>
-      <w:r>
-        <w:rPr>
-          <w:rFonts w:ascii="Times New Roman" w:hAnsi="Times New Roman"/>
-          <w:b w:val="0"/>
-          <w:sz w:val="24"/>
-        </w:rPr>
-        <w:t>LISTA DE FIGURAS</w:t>
-        <w:tab/>
-      </w:r>
-      <w:r>
-        <w:rPr>
-          <w:rFonts w:ascii="Times New Roman" w:hAnsi="Times New Roman"/>
-          <w:b w:val="0"/>
-          <w:sz w:val="24"/>
-        </w:rPr>
-        <w:fldChar w:fldCharType="begin"/>
-        <w:instrText xml:space="preserve"> PAGEREF bm_lista_figuras \h </w:instrText>
-        <w:fldChar w:fldCharType="separate"/>
-        <w:t>?</w:t>
-        <w:fldChar w:fldCharType="end"/>
-      </w:r>
-    </w:p>
-    <w:p>
-      <w:pPr>
-        <w:tabs>
-          <w:tab w:pos="8271" w:val="right" w:leader="dot"/>
-        </w:tabs>
-        <w:spacing w:line="360" w:lineRule="auto" w:before="0" w:after="80"/>
+        <w:spacing w:line="240" w:lineRule="auto" w:before="0" w:after="0"/>
         <w:ind w:left="0"/>
       </w:pPr>
       <w:r>
@@ -936,11 +952,7 @@
           <w:b w:val="0"/>
           <w:sz w:val="24"/>
         </w:rPr>
-        <w:fldChar w:fldCharType="begin"/>
-        <w:instrText xml:space="preserve"> PAGEREF bm_lista_graficos \h </w:instrText>
-        <w:fldChar w:fldCharType="separate"/>
-        <w:t>?</w:t>
-        <w:fldChar w:fldCharType="end"/>
+        <w:t>vii</w:t>
       </w:r>
     </w:p>
     <w:p>
@@ -948,7 +960,7 @@
         <w:tabs>
           <w:tab w:pos="8271" w:val="right" w:leader="dot"/>
         </w:tabs>
-        <w:spacing w:line="360" w:lineRule="auto" w:before="0" w:after="80"/>
+        <w:spacing w:line="240" w:lineRule="auto" w:before="0" w:after="0"/>
         <w:ind w:left="0"/>
       </w:pPr>
       <w:r>
@@ -966,11 +978,7 @@
           <w:b w:val="0"/>
           <w:sz w:val="24"/>
         </w:rPr>
-        <w:fldChar w:fldCharType="begin"/>
-        <w:instrText xml:space="preserve"> PAGEREF bm_lista_anexos \h </w:instrText>
-        <w:fldChar w:fldCharType="separate"/>
-        <w:t>?</w:t>
-        <w:fldChar w:fldCharType="end"/>
+        <w:t>viii</w:t>
       </w:r>
     </w:p>
     <w:p>
@@ -978,7 +986,7 @@
         <w:tabs>
           <w:tab w:pos="8271" w:val="right" w:leader="dot"/>
         </w:tabs>
-        <w:spacing w:line="360" w:lineRule="auto" w:before="0" w:after="80"/>
+        <w:spacing w:line="240" w:lineRule="auto" w:before="0" w:after="0"/>
         <w:ind w:left="0"/>
       </w:pPr>
       <w:r>
@@ -996,11 +1004,7 @@
           <w:b w:val="0"/>
           <w:sz w:val="24"/>
         </w:rPr>
-        <w:fldChar w:fldCharType="begin"/>
-        <w:instrText xml:space="preserve"> PAGEREF bm_resumen \h </w:instrText>
-        <w:fldChar w:fldCharType="separate"/>
-        <w:t>?</w:t>
-        <w:fldChar w:fldCharType="end"/>
+        <w:t>ix</w:t>
       </w:r>
     </w:p>
     <w:p>
@@ -1008,7 +1012,7 @@
         <w:tabs>
           <w:tab w:pos="8271" w:val="right" w:leader="dot"/>
         </w:tabs>
-        <w:spacing w:line="360" w:lineRule="auto" w:before="0" w:after="80"/>
+        <w:spacing w:line="240" w:lineRule="auto" w:before="0" w:after="0"/>
         <w:ind w:left="0"/>
       </w:pPr>
       <w:r>
@@ -1026,16 +1030,12 @@
           <w:b w:val="0"/>
           <w:sz w:val="24"/>
         </w:rPr>
-        <w:fldChar w:fldCharType="begin"/>
-        <w:instrText xml:space="preserve"> PAGEREF bm_introduccion \h </w:instrText>
-        <w:fldChar w:fldCharType="separate"/>
-        <w:t>?</w:t>
-        <w:fldChar w:fldCharType="end"/>
+        <w:t>1</w:t>
       </w:r>
     </w:p>
     <w:p>
       <w:pPr>
-        <w:spacing w:before="240" w:after="120"/>
+        <w:spacing w:before="80" w:after="0"/>
       </w:pPr>
       <w:r>
         <w:rPr>
@@ -1049,7 +1049,7 @@
         <w:tabs>
           <w:tab w:pos="8271" w:val="right" w:leader="dot"/>
         </w:tabs>
-        <w:spacing w:line="360" w:lineRule="auto" w:before="0" w:after="80"/>
+        <w:spacing w:line="240" w:lineRule="auto" w:before="0" w:after="0"/>
         <w:ind w:left="0"/>
       </w:pPr>
       <w:r>
@@ -1079,7 +1079,7 @@
         <w:tabs>
           <w:tab w:pos="8271" w:val="right" w:leader="dot"/>
         </w:tabs>
-        <w:spacing w:line="360" w:lineRule="auto" w:before="0" w:after="80"/>
+        <w:spacing w:line="240" w:lineRule="auto" w:before="0" w:after="0"/>
         <w:ind w:left="283"/>
       </w:pPr>
       <w:r>
@@ -1109,7 +1109,7 @@
         <w:tabs>
           <w:tab w:pos="8271" w:val="right" w:leader="dot"/>
         </w:tabs>
-        <w:spacing w:line="360" w:lineRule="auto" w:before="0" w:after="80"/>
+        <w:spacing w:line="240" w:lineRule="auto" w:before="0" w:after="0"/>
         <w:ind w:left="283"/>
       </w:pPr>
       <w:r>
@@ -1139,7 +1139,7 @@
         <w:tabs>
           <w:tab w:pos="8271" w:val="right" w:leader="dot"/>
         </w:tabs>
-        <w:spacing w:line="360" w:lineRule="auto" w:before="0" w:after="80"/>
+        <w:spacing w:line="240" w:lineRule="auto" w:before="0" w:after="0"/>
         <w:ind w:left="283"/>
       </w:pPr>
       <w:r>
@@ -1169,7 +1169,7 @@
         <w:tabs>
           <w:tab w:pos="8271" w:val="right" w:leader="dot"/>
         </w:tabs>
-        <w:spacing w:line="360" w:lineRule="auto" w:before="0" w:after="80"/>
+        <w:spacing w:line="240" w:lineRule="auto" w:before="0" w:after="0"/>
         <w:ind w:left="283"/>
       </w:pPr>
       <w:r>
@@ -1199,7 +1199,7 @@
         <w:tabs>
           <w:tab w:pos="8271" w:val="right" w:leader="dot"/>
         </w:tabs>
-        <w:spacing w:line="360" w:lineRule="auto" w:before="0" w:after="80"/>
+        <w:spacing w:line="240" w:lineRule="auto" w:before="0" w:after="0"/>
         <w:ind w:left="283"/>
       </w:pPr>
       <w:r>
@@ -1229,7 +1229,7 @@
         <w:tabs>
           <w:tab w:pos="8271" w:val="right" w:leader="dot"/>
         </w:tabs>
-        <w:spacing w:line="360" w:lineRule="auto" w:before="0" w:after="80"/>
+        <w:spacing w:line="240" w:lineRule="auto" w:before="0" w:after="0"/>
         <w:ind w:left="283"/>
       </w:pPr>
       <w:r>
@@ -1259,7 +1259,7 @@
         <w:tabs>
           <w:tab w:pos="8271" w:val="right" w:leader="dot"/>
         </w:tabs>
-        <w:spacing w:line="360" w:lineRule="auto" w:before="0" w:after="80"/>
+        <w:spacing w:line="240" w:lineRule="auto" w:before="0" w:after="0"/>
         <w:ind w:left="283"/>
       </w:pPr>
       <w:r>
@@ -1289,7 +1289,7 @@
         <w:tabs>
           <w:tab w:pos="8271" w:val="right" w:leader="dot"/>
         </w:tabs>
-        <w:spacing w:line="360" w:lineRule="auto" w:before="0" w:after="80"/>
+        <w:spacing w:line="240" w:lineRule="auto" w:before="0" w:after="0"/>
         <w:ind w:left="283"/>
       </w:pPr>
       <w:r>
@@ -1319,7 +1319,7 @@
         <w:tabs>
           <w:tab w:pos="8271" w:val="right" w:leader="dot"/>
         </w:tabs>
-        <w:spacing w:line="360" w:lineRule="auto" w:before="0" w:after="80"/>
+        <w:spacing w:line="240" w:lineRule="auto" w:before="0" w:after="0"/>
         <w:ind w:left="283"/>
       </w:pPr>
       <w:r>
@@ -1349,7 +1349,37 @@
         <w:tabs>
           <w:tab w:pos="8271" w:val="right" w:leader="dot"/>
         </w:tabs>
-        <w:spacing w:line="360" w:lineRule="auto" w:before="0" w:after="80"/>
+        <w:spacing w:line="240" w:lineRule="auto" w:before="0" w:after="0"/>
+        <w:ind w:left="283"/>
+      </w:pPr>
+      <w:r>
+        <w:rPr>
+          <w:rFonts w:ascii="Times New Roman" w:hAnsi="Times New Roman"/>
+          <w:b w:val="0"/>
+          <w:sz w:val="24"/>
+        </w:rPr>
+        <w:t>Descripción del departamento donde realizó la pasantía</w:t>
+        <w:tab/>
+      </w:r>
+      <w:r>
+        <w:rPr>
+          <w:rFonts w:ascii="Times New Roman" w:hAnsi="Times New Roman"/>
+          <w:b w:val="0"/>
+          <w:sz w:val="24"/>
+        </w:rPr>
+        <w:fldChar w:fldCharType="begin"/>
+        <w:instrText xml:space="preserve"> PAGEREF bm_cap1_depto \h </w:instrText>
+        <w:fldChar w:fldCharType="separate"/>
+        <w:t>?</w:t>
+        <w:fldChar w:fldCharType="end"/>
+      </w:r>
+    </w:p>
+    <w:p>
+      <w:pPr>
+        <w:tabs>
+          <w:tab w:pos="8271" w:val="right" w:leader="dot"/>
+        </w:tabs>
+        <w:spacing w:line="240" w:lineRule="auto" w:before="0" w:after="0"/>
         <w:ind w:left="0"/>
       </w:pPr>
       <w:r>
@@ -1379,7 +1409,7 @@
         <w:tabs>
           <w:tab w:pos="8271" w:val="right" w:leader="dot"/>
         </w:tabs>
-        <w:spacing w:line="360" w:lineRule="auto" w:before="0" w:after="80"/>
+        <w:spacing w:line="240" w:lineRule="auto" w:before="0" w:after="0"/>
         <w:ind w:left="0"/>
       </w:pPr>
       <w:r>
@@ -1407,20 +1437,20 @@
     <w:p>
       <w:pPr>
         <w:sectPr>
-          <w:footerReference w:type="default" r:id="rId20"/>
-          <w:type w:val="continuous"/>
+          <w:footerReference w:type="default" r:id="rId23"/>
+          <w:footerReference w:type="first" r:id="rId24"/>
           <w:pgSz w:w="12240" w:h="15840"/>
           <w:pgMar w:top="1701" w:right="1701" w:bottom="1701" w:left="2268" w:header="720" w:footer="720" w:gutter="0"/>
           <w:cols w:space="720"/>
-          <w:titlePg/>
           <w:docGrid w:linePitch="360"/>
+          <w:pgNumType w:fmt="lowerRoman"/>
         </w:sectPr>
       </w:pPr>
     </w:p>
     <w:p>
       <w:bookmarkStart w:id="bm_lista_cuadros" w:name="bm_lista_cuadros"/>
       <w:pPr>
-        <w:spacing w:before="1140" w:after="480"/>
+        <w:spacing w:before="1140" w:after="480" w:line="360" w:lineRule="auto"/>
         <w:jc w:val="center"/>
       </w:pPr>
       <w:r>
@@ -1432,18 +1462,6 @@
         <w:t>LISTA DE CUADROS</w:t>
       </w:r>
       <w:bookmarkEnd w:id="bm_lista_cuadros"/>
-    </w:p>
-    <w:p>
-      <w:pPr>
-        <w:sectPr>
-          <w:footerReference w:type="default" r:id="rId21"/>
-          <w:pgSz w:w="12240" w:h="15840"/>
-          <w:pgMar w:top="1701" w:right="1701" w:bottom="1701" w:left="2268" w:header="720" w:footer="720" w:gutter="0"/>
-          <w:cols w:space="720"/>
-          <w:titlePg/>
-          <w:docGrid w:linePitch="360"/>
-        </w:sectPr>
-      </w:pPr>
     </w:p>
     <w:p>
       <w:pPr>
@@ -1475,61 +1493,20 @@
     <w:p>
       <w:pPr>
         <w:sectPr>
-          <w:footerReference w:type="default" r:id="rId22"/>
-          <w:type w:val="continuous"/>
+          <w:footerReference w:type="default" r:id="rId25"/>
+          <w:footerReference w:type="first" r:id="rId26"/>
           <w:pgSz w:w="12240" w:h="15840"/>
           <w:pgMar w:top="1701" w:right="1701" w:bottom="1701" w:left="2268" w:header="720" w:footer="720" w:gutter="0"/>
           <w:cols w:space="720"/>
-          <w:titlePg/>
           <w:docGrid w:linePitch="360"/>
-        </w:sectPr>
-      </w:pPr>
-    </w:p>
-    <w:p>
-      <w:bookmarkStart w:id="bm_lista_figuras" w:name="bm_lista_figuras"/>
-      <w:pPr>
-        <w:spacing w:before="1140" w:after="480"/>
-        <w:jc w:val="center"/>
-      </w:pPr>
-      <w:r>
-        <w:rPr>
-          <w:rFonts w:ascii="Times New Roman" w:hAnsi="Times New Roman"/>
-          <w:b/>
-          <w:sz w:val="24"/>
-        </w:rPr>
-        <w:t>LISTA DE FIGURAS</w:t>
-      </w:r>
-      <w:bookmarkEnd w:id="bm_lista_figuras"/>
-    </w:p>
-    <w:p>
-      <w:pPr>
-        <w:sectPr>
-          <w:footerReference w:type="default" r:id="rId23"/>
-          <w:pgSz w:w="12240" w:h="15840"/>
-          <w:pgMar w:top="1701" w:right="1701" w:bottom="1701" w:left="2268" w:header="720" w:footer="720" w:gutter="0"/>
-          <w:cols w:space="720"/>
-          <w:titlePg/>
-          <w:docGrid w:linePitch="360"/>
-        </w:sectPr>
-      </w:pPr>
-    </w:p>
-    <w:p>
-      <w:pPr>
-        <w:sectPr>
-          <w:footerReference w:type="default" r:id="rId24"/>
-          <w:type w:val="continuous"/>
-          <w:pgSz w:w="12240" w:h="15840"/>
-          <w:pgMar w:top="1701" w:right="1701" w:bottom="1701" w:left="2268" w:header="720" w:footer="720" w:gutter="0"/>
-          <w:cols w:space="720"/>
-          <w:titlePg/>
-          <w:docGrid w:linePitch="360"/>
+          <w:pgNumType w:fmt="lowerRoman"/>
         </w:sectPr>
       </w:pPr>
     </w:p>
     <w:p>
       <w:bookmarkStart w:id="bm_lista_graficos" w:name="bm_lista_graficos"/>
       <w:pPr>
-        <w:spacing w:before="1140" w:after="480"/>
+        <w:spacing w:before="1140" w:after="480" w:line="360" w:lineRule="auto"/>
         <w:jc w:val="center"/>
       </w:pPr>
       <w:r>
@@ -1541,18 +1518,6 @@
         <w:t>LISTA DE GRÁFICOS</w:t>
       </w:r>
       <w:bookmarkEnd w:id="bm_lista_graficos"/>
-    </w:p>
-    <w:p>
-      <w:pPr>
-        <w:sectPr>
-          <w:footerReference w:type="default" r:id="rId25"/>
-          <w:pgSz w:w="12240" w:h="15840"/>
-          <w:pgMar w:top="1701" w:right="1701" w:bottom="1701" w:left="2268" w:header="720" w:footer="720" w:gutter="0"/>
-          <w:cols w:space="720"/>
-          <w:titlePg/>
-          <w:docGrid w:linePitch="360"/>
-        </w:sectPr>
-      </w:pPr>
     </w:p>
     <w:p>
       <w:pPr>
@@ -1680,20 +1645,20 @@
     <w:p>
       <w:pPr>
         <w:sectPr>
-          <w:footerReference w:type="default" r:id="rId26"/>
-          <w:type w:val="continuous"/>
+          <w:footerReference w:type="default" r:id="rId27"/>
+          <w:footerReference w:type="first" r:id="rId28"/>
           <w:pgSz w:w="12240" w:h="15840"/>
           <w:pgMar w:top="1701" w:right="1701" w:bottom="1701" w:left="2268" w:header="720" w:footer="720" w:gutter="0"/>
           <w:cols w:space="720"/>
-          <w:titlePg/>
           <w:docGrid w:linePitch="360"/>
+          <w:pgNumType w:fmt="lowerRoman"/>
         </w:sectPr>
       </w:pPr>
     </w:p>
     <w:p>
       <w:bookmarkStart w:id="bm_lista_anexos" w:name="bm_lista_anexos"/>
       <w:pPr>
-        <w:spacing w:before="1140" w:after="480"/>
+        <w:spacing w:before="1140" w:after="480" w:line="360" w:lineRule="auto"/>
         <w:jc w:val="center"/>
       </w:pPr>
       <w:r>
@@ -1705,18 +1670,6 @@
         <w:t>LISTA DE ANEXOS</w:t>
       </w:r>
       <w:bookmarkEnd w:id="bm_lista_anexos"/>
-    </w:p>
-    <w:p>
-      <w:pPr>
-        <w:sectPr>
-          <w:footerReference w:type="default" r:id="rId27"/>
-          <w:pgSz w:w="12240" w:h="15840"/>
-          <w:pgMar w:top="1701" w:right="1701" w:bottom="1701" w:left="2268" w:header="720" w:footer="720" w:gutter="0"/>
-          <w:cols w:space="720"/>
-          <w:titlePg/>
-          <w:docGrid w:linePitch="360"/>
-        </w:sectPr>
-      </w:pPr>
     </w:p>
     <w:p>
       <w:pPr>
@@ -1780,19 +1733,19 @@
     <w:p>
       <w:pPr>
         <w:sectPr>
-          <w:footerReference w:type="default" r:id="rId28"/>
-          <w:type w:val="continuous"/>
+          <w:footerReference w:type="default" r:id="rId29"/>
+          <w:footerReference w:type="first" r:id="rId30"/>
           <w:pgSz w:w="12240" w:h="15840"/>
           <w:pgMar w:top="1701" w:right="1701" w:bottom="1701" w:left="2268" w:header="720" w:footer="720" w:gutter="0"/>
           <w:cols w:space="720"/>
-          <w:titlePg/>
           <w:docGrid w:linePitch="360"/>
+          <w:pgNumType w:fmt="lowerRoman"/>
         </w:sectPr>
       </w:pPr>
     </w:p>
     <w:p>
       <w:pPr>
-        <w:spacing w:after="0"/>
+        <w:spacing w:line="240" w:lineRule="auto" w:after="0"/>
         <w:jc w:val="center"/>
       </w:pPr>
       <w:r>
@@ -1806,7 +1759,7 @@
     </w:p>
     <w:p>
       <w:pPr>
-        <w:spacing w:after="0"/>
+        <w:spacing w:line="240" w:lineRule="auto" w:after="0"/>
         <w:jc w:val="center"/>
       </w:pPr>
       <w:r>
@@ -1820,7 +1773,7 @@
     </w:p>
     <w:p>
       <w:pPr>
-        <w:spacing w:after="0"/>
+        <w:spacing w:line="240" w:lineRule="auto" w:after="0"/>
         <w:jc w:val="center"/>
       </w:pPr>
       <w:r>
@@ -1834,7 +1787,7 @@
     </w:p>
     <w:p>
       <w:pPr>
-        <w:spacing w:after="0"/>
+        <w:spacing w:line="240" w:lineRule="auto" w:after="0"/>
         <w:jc w:val="center"/>
       </w:pPr>
       <w:r>
@@ -1848,7 +1801,7 @@
     </w:p>
     <w:p>
       <w:pPr>
-        <w:spacing w:after="0"/>
+        <w:spacing w:line="240" w:lineRule="auto" w:after="0"/>
         <w:jc w:val="center"/>
       </w:pPr>
       <w:r>
@@ -1862,12 +1815,7 @@
     </w:p>
     <w:p>
       <w:pPr>
-        <w:spacing w:after="360"/>
-      </w:pPr>
-    </w:p>
-    <w:p>
-      <w:pPr>
-        <w:spacing w:after="480"/>
+        <w:spacing w:before="480" w:after="240" w:line="360" w:lineRule="auto"/>
         <w:jc w:val="center"/>
       </w:pPr>
       <w:r>
@@ -1881,8 +1829,7 @@
     </w:p>
     <w:p>
       <w:pPr>
-        <w:spacing w:after="480"/>
-        <w:ind w:left="0"/>
+        <w:spacing w:before="120" w:after="200" w:line="240" w:lineRule="auto"/>
         <w:jc w:val="right"/>
       </w:pPr>
       <w:r>
@@ -1897,6 +1844,7 @@
       <w:r>
         <w:rPr>
           <w:rFonts w:ascii="Times New Roman" w:hAnsi="Times New Roman"/>
+          <w:b w:val="0"/>
           <w:sz w:val="24"/>
         </w:rPr>
         <w:t>Alrifaai Alrifaaie, Amaal</w:t>
@@ -1905,23 +1853,25 @@
       <w:r>
         <w:rPr>
           <w:rFonts w:ascii="Times New Roman" w:hAnsi="Times New Roman"/>
+          <w:b w:val="0"/>
           <w:sz w:val="24"/>
         </w:rPr>
-        <w:t>C.I.: 31.985.792</w:t>
+        <w:t>C.I.: V-31.985.792</w:t>
         <w:br/>
       </w:r>
       <w:r>
         <w:rPr>
           <w:rFonts w:ascii="Times New Roman" w:hAnsi="Times New Roman"/>
+          <w:b/>
           <w:sz w:val="24"/>
         </w:rPr>
-        <w:t>agosto de 2026</w:t>
+        <w:t>2026, agosto</w:t>
       </w:r>
     </w:p>
     <w:p>
       <w:bookmarkStart w:id="bm_resumen" w:name="bm_resumen"/>
       <w:pPr>
-        <w:spacing w:before="480" w:after="480"/>
+        <w:spacing w:before="0" w:after="160"/>
         <w:jc w:val="center"/>
       </w:pPr>
       <w:r>
@@ -1936,20 +1886,8 @@
     </w:p>
     <w:p>
       <w:pPr>
-        <w:sectPr>
-          <w:footerReference w:type="default" r:id="rId29"/>
-          <w:pgSz w:w="12240" w:h="15840"/>
-          <w:pgMar w:top="1701" w:right="1701" w:bottom="1701" w:left="2268" w:header="720" w:footer="720" w:gutter="0"/>
-          <w:cols w:space="720"/>
-          <w:titlePg/>
-          <w:docGrid w:linePitch="360"/>
-        </w:sectPr>
-      </w:pPr>
-    </w:p>
-    <w:p>
-      <w:pPr>
-        <w:spacing w:line="360" w:lineRule="auto" w:after="0" w:before="0"/>
-        <w:ind w:firstLine="709"/>
+        <w:spacing w:line="240" w:lineRule="auto" w:after="0" w:before="0"/>
+        <w:ind w:firstLine="0"/>
         <w:jc w:val="both"/>
       </w:pPr>
       <w:r>
@@ -1961,38 +1899,44 @@
         <w:t>El presente informe recoge las actividades desarrolladas durante diez (10) semanas de pasantías profesionales en Ingeniería de Telecomunicaciones, C.A. (IDETEL), con una primera etapa de rotación por Atención al Cliente y una segunda etapa de apoyo en el área de Administración. Durante la práctica se observó el recorrido de solicitudes de afiliación e incidencias, el registro de pagos, la facturación, el seguimiento de casos y la elaboración de reportes administrativos. La situación problemática se relaciona con la ausencia de un procedimiento formalizado y unificado para controlar las solicitudes desde su recepción hasta el cierre, lo que dificulta conocer responsables, tiempos y estatus de cada caso. El objetivo general fue evaluar el control administrativo aplicado a la gestión de solicitudes de servicios de telecomunicaciones para identificar debilidades y formular mejoras. Se realizaron observaciones directas, revisión de registros, entrevistas estructuradas al personal y un análisis causa-efecto de las fallas detectadas. Posteriormente se diseñó un flujo estandarizado, formatos de control y criterios de seguimiento mediante indicadores básicos. Se concluye que la principal necesidad consiste en formalizar el recorrido de las solicitudes y centralizar la información necesaria para su seguimiento. Se recomienda implementar progresivamente el procedimiento propuesto, asignar responsables por etapa y revisar periódicamente los tiempos de respuesta para detectar desviaciones y oportunidades de mejora.</w:t>
       </w:r>
     </w:p>
-    <w:p/>
     <w:p>
       <w:pPr>
-        <w:ind w:firstLine="709"/>
+        <w:spacing w:line="240" w:lineRule="auto" w:before="160"/>
+        <w:ind w:firstLine="0"/>
       </w:pPr>
       <w:r>
         <w:rPr>
+          <w:rFonts w:ascii="Times New Roman" w:hAnsi="Times New Roman"/>
           <w:b/>
+          <w:sz w:val="24"/>
         </w:rPr>
         <w:t xml:space="preserve">Palabras claves: </w:t>
       </w:r>
       <w:r>
+        <w:rPr>
+          <w:rFonts w:ascii="Times New Roman" w:hAnsi="Times New Roman"/>
+          <w:sz w:val="24"/>
+        </w:rPr>
         <w:t>control administrativo, solicitudes de servicio, trazabilidad, telecomunicaciones, pasantías</w:t>
       </w:r>
     </w:p>
     <w:p>
       <w:pPr>
         <w:sectPr>
-          <w:footerReference w:type="default" r:id="rId30"/>
-          <w:type w:val="continuous"/>
+          <w:footerReference w:type="default" r:id="rId31"/>
+          <w:footerReference w:type="first" r:id="rId32"/>
           <w:pgSz w:w="12240" w:h="15840"/>
           <w:pgMar w:top="1701" w:right="1701" w:bottom="1701" w:left="2268" w:header="720" w:footer="720" w:gutter="0"/>
           <w:cols w:space="720"/>
-          <w:titlePg/>
           <w:docGrid w:linePitch="360"/>
+          <w:pgNumType w:fmt="lowerRoman"/>
         </w:sectPr>
       </w:pPr>
     </w:p>
     <w:p>
       <w:bookmarkStart w:id="bm_introduccion" w:name="bm_introduccion"/>
       <w:pPr>
-        <w:spacing w:before="1140" w:after="480"/>
+        <w:spacing w:before="1140" w:after="480" w:line="360" w:lineRule="auto"/>
         <w:jc w:val="center"/>
       </w:pPr>
       <w:r>
@@ -2007,18 +1951,6 @@
     </w:p>
     <w:p>
       <w:pPr>
-        <w:sectPr>
-          <w:footerReference w:type="default" r:id="rId31"/>
-          <w:pgSz w:w="12240" w:h="15840"/>
-          <w:pgMar w:top="1701" w:right="1701" w:bottom="1701" w:left="2268" w:header="720" w:footer="720" w:gutter="0"/>
-          <w:cols w:space="720"/>
-          <w:titlePg/>
-          <w:docGrid w:linePitch="360"/>
-        </w:sectPr>
-      </w:pPr>
-    </w:p>
-    <w:p>
-      <w:pPr>
         <w:spacing w:line="360" w:lineRule="auto" w:after="0" w:before="0"/>
         <w:ind w:firstLine="709"/>
         <w:jc w:val="both"/>
@@ -2080,19 +2012,20 @@
     <w:p>
       <w:pPr>
         <w:sectPr>
-          <w:footerReference w:type="default" r:id="rId32"/>
-          <w:type w:val="continuous"/>
+          <w:footerReference w:type="default" r:id="rId33"/>
+          <w:footerReference w:type="first" r:id="rId34"/>
           <w:pgSz w:w="12240" w:h="15840"/>
           <w:pgMar w:top="1701" w:right="1701" w:bottom="1701" w:left="2268" w:header="720" w:footer="720" w:gutter="0"/>
           <w:cols w:space="720"/>
           <w:titlePg/>
           <w:docGrid w:linePitch="360"/>
+          <w:pgNumType w:start="1" w:fmt="decimal"/>
         </w:sectPr>
       </w:pPr>
     </w:p>
     <w:p>
       <w:pPr>
-        <w:spacing w:before="1140" w:after="480"/>
+        <w:spacing w:before="1140" w:after="480" w:line="360" w:lineRule="auto"/>
         <w:jc w:val="center"/>
       </w:pPr>
       <w:r>
@@ -2107,7 +2040,7 @@
     <w:p>
       <w:bookmarkStart w:id="bm_cap1" w:name="bm_cap1"/>
       <w:pPr>
-        <w:spacing w:before="480"/>
+        <w:spacing w:before="0" w:after="480" w:line="360" w:lineRule="auto"/>
         <w:jc w:val="center"/>
       </w:pPr>
       <w:r>
@@ -2119,18 +2052,6 @@
         <w:t>REALIDAD ORGANIZACIONAL</w:t>
       </w:r>
       <w:bookmarkEnd w:id="bm_cap1"/>
-    </w:p>
-    <w:p>
-      <w:pPr>
-        <w:sectPr>
-          <w:footerReference w:type="default" r:id="rId33"/>
-          <w:pgSz w:w="12240" w:h="15840"/>
-          <w:pgMar w:top="1701" w:right="1701" w:bottom="1701" w:left="2268" w:header="720" w:footer="720" w:gutter="0"/>
-          <w:cols w:space="720"/>
-          <w:titlePg/>
-          <w:docGrid w:linePitch="360"/>
-        </w:sectPr>
-      </w:pPr>
     </w:p>
     <w:p>
       <w:bookmarkStart w:id="bm_cap1_ident" w:name="bm_cap1_ident"/>
@@ -2629,7 +2550,7 @@
         <w:rPr>
           <w:rFonts w:ascii="Times New Roman" w:hAnsi="Times New Roman"/>
           <w:i/>
-          <w:sz w:val="24"/>
+          <w:sz w:val="20"/>
         </w:rPr>
         <w:t xml:space="preserve">Gráfico 1. </w:t>
       </w:r>
@@ -2637,7 +2558,7 @@
         <w:rPr>
           <w:rFonts w:ascii="Times New Roman" w:hAnsi="Times New Roman"/>
           <w:b/>
-          <w:sz w:val="24"/>
+          <w:sz w:val="20"/>
         </w:rPr>
         <w:t>Representación cartográfica y ubicación espacial de Ingeniería de Telecomunicaciones, C.A.</w:t>
       </w:r>
@@ -2717,7 +2638,7 @@
           <w:i w:val="0"/>
           <w:sz w:val="24"/>
         </w:rPr>
-        <w:t>La estructura organizativa de Ingeniería de Telecomunicaciones, C.A. es de tipo vertical, diseñada para garantizar una comunicación fluida entre los niveles directivos y operativos. A la cabeza se encuentra la Presidencia, seguida de la Gerencia General y Operaciones, de la cual se desprenden los departamentos de Supervisión de Administración, Contabilidad y Tributos, Supervisión Comercial, Área de Internet, Supervisión del NOC (Network Operations Center) y Mantenimiento de Radiocomunicación. Se presenta a continuación el organigrama general de la empresa y del Departamento de Administración.</w:t>
+        <w:t>La estructura organizativa de Ingeniería de Telecomunicaciones, C.A. es de tipo vertical y articula los niveles directivos, administrativos, comerciales y técnicos. A la cabeza se encuentra la Presidencia, seguida de la Gerencia General y Operaciones. A continuación se presentan el organigrama general de la empresa y el organigrama del área administrativa vinculada con la pasantía.</w:t>
       </w:r>
     </w:p>
     <w:p>
@@ -2770,7 +2691,7 @@
         <w:rPr>
           <w:rFonts w:ascii="Times New Roman" w:hAnsi="Times New Roman"/>
           <w:i/>
-          <w:sz w:val="24"/>
+          <w:sz w:val="20"/>
         </w:rPr>
         <w:t xml:space="preserve">Gráfico 2. </w:t>
       </w:r>
@@ -2778,7 +2699,7 @@
         <w:rPr>
           <w:rFonts w:ascii="Times New Roman" w:hAnsi="Times New Roman"/>
           <w:b/>
-          <w:sz w:val="24"/>
+          <w:sz w:val="20"/>
         </w:rPr>
         <w:t>Organigrama estructural y niveles jerárquicos de Ingeniería de Telecomunicaciones, C.A.</w:t>
       </w:r>
@@ -2834,7 +2755,7 @@
         <w:rPr>
           <w:rFonts w:ascii="Times New Roman" w:hAnsi="Times New Roman"/>
           <w:i/>
-          <w:sz w:val="24"/>
+          <w:sz w:val="20"/>
         </w:rPr>
         <w:t xml:space="preserve">Gráfico 3. </w:t>
       </w:r>
@@ -2842,29 +2763,76 @@
         <w:rPr>
           <w:rFonts w:ascii="Times New Roman" w:hAnsi="Times New Roman"/>
           <w:b/>
-          <w:sz w:val="24"/>
+          <w:sz w:val="20"/>
         </w:rPr>
         <w:t>Organigrama del Departamento de Administración.</w:t>
       </w:r>
       <w:bookmarkEnd w:id="bm_grafico3"/>
     </w:p>
     <w:p>
+      <w:bookmarkStart w:id="bm_cap1_depto" w:name="bm_cap1_depto"/>
+      <w:pPr>
+        <w:spacing w:before="480" w:after="480" w:line="360" w:lineRule="auto"/>
+        <w:jc w:val="left"/>
+      </w:pPr>
+      <w:r>
+        <w:rPr>
+          <w:rFonts w:ascii="Times New Roman" w:hAnsi="Times New Roman"/>
+          <w:b/>
+          <w:sz w:val="24"/>
+        </w:rPr>
+        <w:t>Descripción del departamento donde realizó la pasantía</w:t>
+      </w:r>
+      <w:bookmarkEnd w:id="bm_cap1_depto"/>
+    </w:p>
+    <w:p>
+      <w:pPr>
+        <w:spacing w:line="360" w:lineRule="auto" w:after="0" w:before="0"/>
+        <w:ind w:firstLine="709"/>
+        <w:jc w:val="both"/>
+      </w:pPr>
+      <w:r>
+        <w:rPr>
+          <w:rFonts w:ascii="Times New Roman" w:hAnsi="Times New Roman"/>
+          <w:i w:val="0"/>
+          <w:sz w:val="24"/>
+        </w:rPr>
+        <w:t>La experiencia de pasantía comprendió una rotación inicial por Atención al Cliente durante las primeras tres semanas y, posteriormente, la incorporación al área de Administración. Esta secuencia permitió conocer el recorrido de las solicitudes desde el contacto inicial con el suscriptor hasta su tratamiento administrativo y coordinación con las unidades técnicas.</w:t>
+      </w:r>
+    </w:p>
+    <w:p>
+      <w:pPr>
+        <w:spacing w:line="360" w:lineRule="auto" w:after="0" w:before="0"/>
+        <w:ind w:firstLine="709"/>
+        <w:jc w:val="both"/>
+      </w:pPr>
+      <w:r>
+        <w:rPr>
+          <w:rFonts w:ascii="Times New Roman" w:hAnsi="Times New Roman"/>
+          <w:i w:val="0"/>
+          <w:sz w:val="24"/>
+        </w:rPr>
+        <w:t>En el ámbito administrativo se observaron funciones relacionadas con Supervisión de Administración, Contabilidad y Tributos; Compras y Facturación; y Atención al Cliente. Las actividades incluyeron recepción y registro de solicitudes, revisión de recaudos, seguimiento de incidencias y afiliaciones, apoyo en facturación y archivo, así como coordinación de información con otras áreas de IDETEL.</w:t>
+      </w:r>
+    </w:p>
+    <w:p>
       <w:pPr>
         <w:sectPr>
-          <w:footerReference w:type="default" r:id="rId34"/>
-          <w:type w:val="continuous"/>
+          <w:footerReference w:type="default" r:id="rId35"/>
+          <w:footerReference w:type="first" r:id="rId36"/>
           <w:pgSz w:w="12240" w:h="15840"/>
           <w:pgMar w:top="1701" w:right="1701" w:bottom="1701" w:left="2268" w:header="720" w:footer="720" w:gutter="0"/>
           <w:cols w:space="720"/>
           <w:titlePg/>
           <w:docGrid w:linePitch="360"/>
+          <w:pgNumType w:fmt="decimal"/>
         </w:sectPr>
       </w:pPr>
     </w:p>
     <w:p>
       <w:bookmarkStart w:id="bm_referencias" w:name="bm_referencias"/>
       <w:pPr>
-        <w:spacing w:before="1140" w:after="480"/>
+        <w:spacing w:before="1140" w:after="480" w:line="360" w:lineRule="auto"/>
         <w:jc w:val="center"/>
       </w:pPr>
       <w:r>
@@ -2879,157 +2847,282 @@
     </w:p>
     <w:p>
       <w:pPr>
+        <w:spacing w:before="480" w:after="0"/>
+      </w:pPr>
+    </w:p>
+    <w:p>
+      <w:pPr>
+        <w:spacing w:line="240" w:lineRule="auto" w:after="480" w:before="0"/>
+        <w:ind w:left="425" w:hanging="425"/>
+        <w:jc w:val="both"/>
+      </w:pPr>
+      <w:r>
+        <w:rPr>
+          <w:rFonts w:ascii="Times New Roman" w:hAnsi="Times New Roman"/>
+          <w:b w:val="0"/>
+          <w:sz w:val="24"/>
+        </w:rPr>
+        <w:t xml:space="preserve">Arias, F. (2012). </w:t>
+      </w:r>
+      <w:r>
+        <w:rPr>
+          <w:rFonts w:ascii="Times New Roman" w:hAnsi="Times New Roman"/>
+          <w:b/>
+          <w:sz w:val="24"/>
+        </w:rPr>
+        <w:t>El proyecto de investigación: Introducción a la metodología científica (6ta ed.)</w:t>
+      </w:r>
+      <w:r>
+        <w:rPr>
+          <w:rFonts w:ascii="Times New Roman" w:hAnsi="Times New Roman"/>
+          <w:b w:val="0"/>
+          <w:sz w:val="24"/>
+        </w:rPr>
+        <w:t>. Episteme, Venezuela.</w:t>
+      </w:r>
+    </w:p>
+    <w:p>
+      <w:pPr>
+        <w:spacing w:line="240" w:lineRule="auto" w:after="480" w:before="0"/>
+        <w:ind w:left="425" w:hanging="425"/>
+        <w:jc w:val="both"/>
+      </w:pPr>
+      <w:r>
+        <w:rPr>
+          <w:rFonts w:ascii="Times New Roman" w:hAnsi="Times New Roman"/>
+          <w:b w:val="0"/>
+          <w:sz w:val="24"/>
+        </w:rPr>
+        <w:t xml:space="preserve">Chiavenato, I. (2006). </w:t>
+      </w:r>
+      <w:r>
+        <w:rPr>
+          <w:rFonts w:ascii="Times New Roman" w:hAnsi="Times New Roman"/>
+          <w:b/>
+          <w:sz w:val="24"/>
+        </w:rPr>
+        <w:t>Introducción a la teoría general de la administración (7ma ed.)</w:t>
+      </w:r>
+      <w:r>
+        <w:rPr>
+          <w:rFonts w:ascii="Times New Roman" w:hAnsi="Times New Roman"/>
+          <w:b w:val="0"/>
+          <w:sz w:val="24"/>
+        </w:rPr>
+        <w:t>. McGraw-Hill, México.</w:t>
+      </w:r>
+    </w:p>
+    <w:p>
+      <w:pPr>
+        <w:spacing w:line="240" w:lineRule="auto" w:after="480" w:before="0"/>
+        <w:ind w:left="425" w:hanging="425"/>
+        <w:jc w:val="both"/>
+      </w:pPr>
+      <w:r>
+        <w:rPr>
+          <w:rFonts w:ascii="Times New Roman" w:hAnsi="Times New Roman"/>
+          <w:b w:val="0"/>
+          <w:sz w:val="24"/>
+        </w:rPr>
+        <w:t xml:space="preserve">Harrington, H. J. (1993). </w:t>
+      </w:r>
+      <w:r>
+        <w:rPr>
+          <w:rFonts w:ascii="Times New Roman" w:hAnsi="Times New Roman"/>
+          <w:b/>
+          <w:sz w:val="24"/>
+        </w:rPr>
+        <w:t>Mejoramiento de los procesos de la empresa</w:t>
+      </w:r>
+      <w:r>
+        <w:rPr>
+          <w:rFonts w:ascii="Times New Roman" w:hAnsi="Times New Roman"/>
+          <w:b w:val="0"/>
+          <w:sz w:val="24"/>
+        </w:rPr>
+        <w:t>. McGraw-Hill, Colombia.</w:t>
+      </w:r>
+    </w:p>
+    <w:p>
+      <w:pPr>
+        <w:spacing w:line="240" w:lineRule="auto" w:after="480" w:before="0"/>
+        <w:ind w:left="425" w:hanging="425"/>
+        <w:jc w:val="both"/>
+      </w:pPr>
+      <w:r>
+        <w:rPr>
+          <w:rFonts w:ascii="Times New Roman" w:hAnsi="Times New Roman"/>
+          <w:b w:val="0"/>
+          <w:sz w:val="24"/>
+        </w:rPr>
+        <w:t xml:space="preserve">Laudon, K., y Laudon, J. (2016). </w:t>
+      </w:r>
+      <w:r>
+        <w:rPr>
+          <w:rFonts w:ascii="Times New Roman" w:hAnsi="Times New Roman"/>
+          <w:b/>
+          <w:sz w:val="24"/>
+        </w:rPr>
+        <w:t>Sistemas de información gerencial (14va ed.)</w:t>
+      </w:r>
+      <w:r>
+        <w:rPr>
+          <w:rFonts w:ascii="Times New Roman" w:hAnsi="Times New Roman"/>
+          <w:b w:val="0"/>
+          <w:sz w:val="24"/>
+        </w:rPr>
+        <w:t>. Pearson Educación, México.</w:t>
+      </w:r>
+    </w:p>
+    <w:p>
+      <w:pPr>
+        <w:spacing w:line="240" w:lineRule="auto" w:after="480" w:before="0"/>
+        <w:ind w:left="425" w:hanging="425"/>
+        <w:jc w:val="both"/>
+      </w:pPr>
+      <w:r>
+        <w:rPr>
+          <w:rFonts w:ascii="Times New Roman" w:hAnsi="Times New Roman"/>
+          <w:b w:val="0"/>
+          <w:sz w:val="24"/>
+        </w:rPr>
+        <w:t xml:space="preserve">Parasuraman, A., Zeithaml, V., y Berry, L. (1988). </w:t>
+      </w:r>
+      <w:r>
+        <w:rPr>
+          <w:rFonts w:ascii="Times New Roman" w:hAnsi="Times New Roman"/>
+          <w:b/>
+          <w:sz w:val="24"/>
+        </w:rPr>
+        <w:t>SERVQUAL: A multiple-item scale for measuring consumer perceptions of service quality</w:t>
+      </w:r>
+      <w:r>
+        <w:rPr>
+          <w:rFonts w:ascii="Times New Roman" w:hAnsi="Times New Roman"/>
+          <w:b w:val="0"/>
+          <w:sz w:val="24"/>
+        </w:rPr>
+        <w:t>. Journal of Retailing, 64(1), 12-40.</w:t>
+      </w:r>
+    </w:p>
+    <w:p>
+      <w:pPr>
+        <w:spacing w:line="240" w:lineRule="auto" w:after="480" w:before="0"/>
+        <w:ind w:left="425" w:hanging="425"/>
+        <w:jc w:val="both"/>
+      </w:pPr>
+      <w:r>
+        <w:rPr>
+          <w:rFonts w:ascii="Times New Roman" w:hAnsi="Times New Roman"/>
+          <w:b w:val="0"/>
+          <w:sz w:val="24"/>
+        </w:rPr>
+        <w:t xml:space="preserve">Robbins, S., y Coulter, M. (2010). </w:t>
+      </w:r>
+      <w:r>
+        <w:rPr>
+          <w:rFonts w:ascii="Times New Roman" w:hAnsi="Times New Roman"/>
+          <w:b/>
+          <w:sz w:val="24"/>
+        </w:rPr>
+        <w:t>Administración (10ma ed.)</w:t>
+      </w:r>
+      <w:r>
+        <w:rPr>
+          <w:rFonts w:ascii="Times New Roman" w:hAnsi="Times New Roman"/>
+          <w:b w:val="0"/>
+          <w:sz w:val="24"/>
+        </w:rPr>
+        <w:t>. Pearson Educación, México.</w:t>
+      </w:r>
+    </w:p>
+    <w:p>
+      <w:pPr>
+        <w:spacing w:line="240" w:lineRule="auto" w:after="480" w:before="0"/>
+        <w:ind w:left="425" w:hanging="425"/>
+        <w:jc w:val="both"/>
+      </w:pPr>
+      <w:r>
+        <w:rPr>
+          <w:rFonts w:ascii="Times New Roman" w:hAnsi="Times New Roman"/>
+          <w:b w:val="0"/>
+          <w:sz w:val="24"/>
+        </w:rPr>
+        <w:t xml:space="preserve">Universidad Pedagógica Experimental Libertador. (2016). </w:t>
+      </w:r>
+      <w:r>
+        <w:rPr>
+          <w:rFonts w:ascii="Times New Roman" w:hAnsi="Times New Roman"/>
+          <w:b/>
+          <w:sz w:val="24"/>
+        </w:rPr>
+        <w:t>Manual de trabajos de grado de especialización y maestría y tesis doctorales (5ta ed.)</w:t>
+      </w:r>
+      <w:r>
+        <w:rPr>
+          <w:rFonts w:ascii="Times New Roman" w:hAnsi="Times New Roman"/>
+          <w:b w:val="0"/>
+          <w:sz w:val="24"/>
+        </w:rPr>
+        <w:t>. FEDUPEL, Venezuela.</w:t>
+      </w:r>
+    </w:p>
+    <w:p>
+      <w:pPr>
+        <w:spacing w:line="240" w:lineRule="auto" w:after="480" w:before="0"/>
+        <w:ind w:left="425" w:hanging="425"/>
+        <w:jc w:val="both"/>
+      </w:pPr>
+      <w:r>
+        <w:rPr>
+          <w:rFonts w:ascii="Times New Roman" w:hAnsi="Times New Roman"/>
+          <w:b w:val="0"/>
+          <w:sz w:val="24"/>
+        </w:rPr>
+        <w:t xml:space="preserve">Zeithaml, V., Parasuraman, A., y Berry, L. (1993). </w:t>
+      </w:r>
+      <w:r>
+        <w:rPr>
+          <w:rFonts w:ascii="Times New Roman" w:hAnsi="Times New Roman"/>
+          <w:b/>
+          <w:sz w:val="24"/>
+        </w:rPr>
+        <w:t>Calidad total en la gestión de servicios</w:t>
+      </w:r>
+      <w:r>
+        <w:rPr>
+          <w:rFonts w:ascii="Times New Roman" w:hAnsi="Times New Roman"/>
+          <w:b w:val="0"/>
+          <w:sz w:val="24"/>
+        </w:rPr>
+        <w:t>. Díaz de Santos, España.</w:t>
+      </w:r>
+    </w:p>
+    <w:p>
+      <w:pPr>
         <w:sectPr>
-          <w:footerReference w:type="default" r:id="rId35"/>
+          <w:footerReference w:type="default" r:id="rId37"/>
+          <w:footerReference w:type="first" r:id="rId38"/>
           <w:pgSz w:w="12240" w:h="15840"/>
           <w:pgMar w:top="1701" w:right="1701" w:bottom="1701" w:left="2268" w:header="720" w:footer="720" w:gutter="0"/>
           <w:cols w:space="720"/>
           <w:titlePg/>
           <w:docGrid w:linePitch="360"/>
-        </w:sectPr>
-      </w:pPr>
-    </w:p>
-    <w:p>
-      <w:pPr>
-        <w:spacing w:before="480" w:after="0"/>
-      </w:pPr>
-    </w:p>
-    <w:p>
-      <w:pPr>
-        <w:spacing w:line="240" w:lineRule="auto" w:after="480" w:before="0"/>
-        <w:ind w:left="425" w:hanging="425"/>
-        <w:jc w:val="both"/>
-      </w:pPr>
-      <w:r>
-        <w:rPr>
-          <w:rFonts w:ascii="Times New Roman" w:hAnsi="Times New Roman"/>
-          <w:sz w:val="24"/>
-        </w:rPr>
-        <w:t>Arias, F. (2012). El proyecto de investigación: Introducción a la metodología científica (6ta ed.). Episteme, Venezuela.</w:t>
-      </w:r>
-    </w:p>
-    <w:p>
-      <w:pPr>
-        <w:spacing w:line="240" w:lineRule="auto" w:after="480" w:before="0"/>
-        <w:ind w:left="425" w:hanging="425"/>
-        <w:jc w:val="both"/>
-      </w:pPr>
-      <w:r>
-        <w:rPr>
-          <w:rFonts w:ascii="Times New Roman" w:hAnsi="Times New Roman"/>
-          <w:sz w:val="24"/>
-        </w:rPr>
-        <w:t>Chiavenato, I. (2006). Introducción a la teoría general de la administración (7ma ed.). McGraw-Hill, México.</w:t>
-      </w:r>
-    </w:p>
-    <w:p>
-      <w:pPr>
-        <w:spacing w:line="240" w:lineRule="auto" w:after="480" w:before="0"/>
-        <w:ind w:left="425" w:hanging="425"/>
-        <w:jc w:val="both"/>
-      </w:pPr>
-      <w:r>
-        <w:rPr>
-          <w:rFonts w:ascii="Times New Roman" w:hAnsi="Times New Roman"/>
-          <w:sz w:val="24"/>
-        </w:rPr>
-        <w:t>Harrington, H. J. (1993). Mejoramiento de los procesos de la empresa. McGraw-Hill, Colombia.</w:t>
-      </w:r>
-    </w:p>
-    <w:p>
-      <w:pPr>
-        <w:spacing w:line="240" w:lineRule="auto" w:after="480" w:before="0"/>
-        <w:ind w:left="425" w:hanging="425"/>
-        <w:jc w:val="both"/>
-      </w:pPr>
-      <w:r>
-        <w:rPr>
-          <w:rFonts w:ascii="Times New Roman" w:hAnsi="Times New Roman"/>
-          <w:sz w:val="24"/>
-        </w:rPr>
-        <w:t>Laudon, K., y Laudon, J. (2016). Sistemas de información gerencial (14va ed.). Pearson Educación, México.</w:t>
-      </w:r>
-    </w:p>
-    <w:p>
-      <w:pPr>
-        <w:spacing w:line="240" w:lineRule="auto" w:after="480" w:before="0"/>
-        <w:ind w:left="425" w:hanging="425"/>
-        <w:jc w:val="both"/>
-      </w:pPr>
-      <w:r>
-        <w:rPr>
-          <w:rFonts w:ascii="Times New Roman" w:hAnsi="Times New Roman"/>
-          <w:sz w:val="24"/>
-        </w:rPr>
-        <w:t>Parasuraman, A., Zeithaml, V., y Berry, L. (1988). SERVQUAL: A multiple-item scale for measuring consumer perceptions of service quality. Journal of Retailing, 64(1), 12-40.</w:t>
-      </w:r>
-    </w:p>
-    <w:p>
-      <w:pPr>
-        <w:spacing w:line="240" w:lineRule="auto" w:after="480" w:before="0"/>
-        <w:ind w:left="425" w:hanging="425"/>
-        <w:jc w:val="both"/>
-      </w:pPr>
-      <w:r>
-        <w:rPr>
-          <w:rFonts w:ascii="Times New Roman" w:hAnsi="Times New Roman"/>
-          <w:sz w:val="24"/>
-        </w:rPr>
-        <w:t>Robbins, S., y Coulter, M. (2010). Administración (10ma ed.). Pearson Educación, México.</w:t>
-      </w:r>
-    </w:p>
-    <w:p>
-      <w:pPr>
-        <w:spacing w:line="240" w:lineRule="auto" w:after="480" w:before="0"/>
-        <w:ind w:left="425" w:hanging="425"/>
-        <w:jc w:val="both"/>
-      </w:pPr>
-      <w:r>
-        <w:rPr>
-          <w:rFonts w:ascii="Times New Roman" w:hAnsi="Times New Roman"/>
-          <w:sz w:val="24"/>
-        </w:rPr>
-        <w:t>Universidad Pedagógica Experimental Libertador. (2016). Manual de trabajos de grado de especialización y maestría y tesis doctorales (5ta ed.). FEDUPEL, Venezuela.</w:t>
-      </w:r>
-    </w:p>
-    <w:p>
-      <w:pPr>
-        <w:spacing w:line="240" w:lineRule="auto" w:after="480" w:before="0"/>
-        <w:ind w:left="425" w:hanging="425"/>
-        <w:jc w:val="both"/>
-      </w:pPr>
-      <w:r>
-        <w:rPr>
-          <w:rFonts w:ascii="Times New Roman" w:hAnsi="Times New Roman"/>
-          <w:sz w:val="24"/>
-        </w:rPr>
-        <w:t>Zeithaml, V., Parasuraman, A., y Berry, L. (1993). Calidad total en la gestión de servicios. Díaz de Santos, España.</w:t>
-      </w:r>
-    </w:p>
-    <w:p>
-      <w:pPr>
-        <w:sectPr>
-          <w:footerReference w:type="default" r:id="rId36"/>
-          <w:type w:val="continuous"/>
-          <w:pgSz w:w="12240" w:h="15840"/>
-          <w:pgMar w:top="1701" w:right="1701" w:bottom="1701" w:left="2268" w:header="720" w:footer="720" w:gutter="0"/>
-          <w:cols w:space="720"/>
-          <w:titlePg/>
-          <w:docGrid w:linePitch="360"/>
+          <w:pgNumType w:fmt="decimal"/>
         </w:sectPr>
       </w:pPr>
     </w:p>
     <w:p>
       <w:bookmarkStart w:id="bm_anexos" w:name="bm_anexos"/>
       <w:pPr>
-        <w:spacing w:before="4740"/>
+        <w:spacing w:before="4400"/>
         <w:jc w:val="center"/>
       </w:pPr>
       <w:r>
         <w:rPr>
           <w:rFonts w:ascii="Times New Roman" w:hAnsi="Times New Roman"/>
           <w:b/>
-          <w:sz w:val="32"/>
+          <w:sz w:val="24"/>
         </w:rPr>
         <w:t>ANEXOS</w:t>
       </w:r>
@@ -3038,12 +3131,13 @@
     <w:p>
       <w:pPr>
         <w:sectPr>
-          <w:footerReference w:type="default" r:id="rId37"/>
+          <w:footerReference w:type="default" r:id="rId39"/>
+          <w:footerReference w:type="first" r:id="rId40"/>
           <w:pgSz w:w="12240" w:h="15840"/>
           <w:pgMar w:top="1701" w:right="1701" w:bottom="1701" w:left="2268" w:header="720" w:footer="720" w:gutter="0"/>
           <w:cols w:space="720"/>
-          <w:titlePg/>
           <w:docGrid w:linePitch="360"/>
+          <w:pgNumType w:fmt="decimal"/>
         </w:sectPr>
       </w:pPr>
     </w:p>
@@ -3117,12 +3211,13 @@
       </w:r>
     </w:p>
     <w:sectPr>
-      <w:footerReference w:type="default" r:id="rId38"/>
+      <w:footerReference w:type="default" r:id="rId41"/>
+      <w:footerReference w:type="first" r:id="rId42"/>
       <w:pgSz w:w="12240" w:h="15840"/>
       <w:pgMar w:top="1701" w:right="1701" w:bottom="1701" w:left="2268" w:header="720" w:footer="720" w:gutter="0"/>
       <w:cols w:space="720"/>
-      <w:titlePg/>
       <w:docGrid w:linePitch="360"/>
+      <w:pgNumType w:fmt="decimal"/>
     </w:sectPr>
   </w:body>
 </w:document>
@@ -3134,6 +3229,7 @@
     <w:pPr>
       <w:pStyle w:val="Footer"/>
     </w:pPr>
+    <w:r/>
   </w:p>
 </w:ftr>
 </file>
@@ -3143,18 +3239,8 @@
   <w:p>
     <w:pPr>
       <w:pStyle w:val="Footer"/>
-      <w:jc w:val="center"/>
-    </w:pPr>
-    <w:r>
-      <w:rPr>
-        <w:rFonts w:ascii="Times New Roman" w:hAnsi="Times New Roman"/>
-        <w:sz w:val="24"/>
-      </w:rPr>
-      <w:fldChar w:fldCharType="begin"/>
-      <w:instrText xml:space="preserve"> PAGE \* roman </w:instrText>
-      <w:fldChar w:fldCharType="separate"/>
-      <w:fldChar w:fldCharType="end"/>
-    </w:r>
+    </w:pPr>
+    <w:r/>
   </w:p>
 </w:ftr>
 </file>
@@ -3166,6 +3252,7 @@
       <w:pStyle w:val="Footer"/>
       <w:jc w:val="center"/>
     </w:pPr>
+    <w:r/>
     <w:r>
       <w:rPr>
         <w:rFonts w:ascii="Times New Roman" w:hAnsi="Times New Roman"/>
@@ -3185,18 +3272,8 @@
   <w:p>
     <w:pPr>
       <w:pStyle w:val="Footer"/>
-      <w:jc w:val="center"/>
-    </w:pPr>
-    <w:r>
-      <w:rPr>
-        <w:rFonts w:ascii="Times New Roman" w:hAnsi="Times New Roman"/>
-        <w:sz w:val="24"/>
-      </w:rPr>
-      <w:fldChar w:fldCharType="begin"/>
-      <w:instrText xml:space="preserve"> PAGE \* roman </w:instrText>
-      <w:fldChar w:fldCharType="separate"/>
-      <w:fldChar w:fldCharType="end"/>
-    </w:r>
+    </w:pPr>
+    <w:r/>
   </w:p>
 </w:ftr>
 </file>
@@ -3208,6 +3285,7 @@
       <w:pStyle w:val="Footer"/>
       <w:jc w:val="center"/>
     </w:pPr>
+    <w:r/>
     <w:r>
       <w:rPr>
         <w:rFonts w:ascii="Times New Roman" w:hAnsi="Times New Roman"/>
@@ -3227,18 +3305,8 @@
   <w:p>
     <w:pPr>
       <w:pStyle w:val="Footer"/>
-      <w:jc w:val="center"/>
-    </w:pPr>
-    <w:r>
-      <w:rPr>
-        <w:rFonts w:ascii="Times New Roman" w:hAnsi="Times New Roman"/>
-        <w:sz w:val="24"/>
-      </w:rPr>
-      <w:fldChar w:fldCharType="begin"/>
-      <w:instrText xml:space="preserve"> PAGE \* roman </w:instrText>
-      <w:fldChar w:fldCharType="separate"/>
-      <w:fldChar w:fldCharType="end"/>
-    </w:r>
+    </w:pPr>
+    <w:r/>
   </w:p>
 </w:ftr>
 </file>
@@ -3250,6 +3318,7 @@
       <w:pStyle w:val="Footer"/>
       <w:jc w:val="center"/>
     </w:pPr>
+    <w:r/>
     <w:r>
       <w:rPr>
         <w:rFonts w:ascii="Times New Roman" w:hAnsi="Times New Roman"/>
@@ -3269,18 +3338,8 @@
   <w:p>
     <w:pPr>
       <w:pStyle w:val="Footer"/>
-      <w:jc w:val="center"/>
-    </w:pPr>
-    <w:r>
-      <w:rPr>
-        <w:rFonts w:ascii="Times New Roman" w:hAnsi="Times New Roman"/>
-        <w:sz w:val="24"/>
-      </w:rPr>
-      <w:fldChar w:fldCharType="begin"/>
-      <w:instrText xml:space="preserve"> PAGE \* roman </w:instrText>
-      <w:fldChar w:fldCharType="separate"/>
-      <w:fldChar w:fldCharType="end"/>
-    </w:r>
+    </w:pPr>
+    <w:r/>
   </w:p>
 </w:ftr>
 </file>
@@ -3292,6 +3351,7 @@
       <w:pStyle w:val="Footer"/>
       <w:jc w:val="center"/>
     </w:pPr>
+    <w:r/>
     <w:r>
       <w:rPr>
         <w:rFonts w:ascii="Times New Roman" w:hAnsi="Times New Roman"/>
@@ -3311,18 +3371,8 @@
   <w:p>
     <w:pPr>
       <w:pStyle w:val="Footer"/>
-      <w:jc w:val="center"/>
-    </w:pPr>
-    <w:r>
-      <w:rPr>
-        <w:rFonts w:ascii="Times New Roman" w:hAnsi="Times New Roman"/>
-        <w:sz w:val="24"/>
-      </w:rPr>
-      <w:fldChar w:fldCharType="begin"/>
-      <w:instrText xml:space="preserve"> PAGE \* roman </w:instrText>
-      <w:fldChar w:fldCharType="separate"/>
-      <w:fldChar w:fldCharType="end"/>
-    </w:r>
+    </w:pPr>
+    <w:r/>
   </w:p>
 </w:ftr>
 </file>
@@ -3334,6 +3384,7 @@
       <w:pStyle w:val="Footer"/>
       <w:jc w:val="center"/>
     </w:pPr>
+    <w:r/>
     <w:r>
       <w:rPr>
         <w:rFonts w:ascii="Times New Roman" w:hAnsi="Times New Roman"/>
@@ -3354,6 +3405,7 @@
     <w:pPr>
       <w:pStyle w:val="Footer"/>
     </w:pPr>
+    <w:r/>
   </w:p>
 </w:ftr>
 </file>
@@ -3363,18 +3415,8 @@
   <w:p>
     <w:pPr>
       <w:pStyle w:val="Footer"/>
-      <w:jc w:val="center"/>
-    </w:pPr>
-    <w:r>
-      <w:rPr>
-        <w:rFonts w:ascii="Times New Roman" w:hAnsi="Times New Roman"/>
-        <w:sz w:val="24"/>
-      </w:rPr>
-      <w:fldChar w:fldCharType="begin"/>
-      <w:instrText xml:space="preserve"> PAGE </w:instrText>
-      <w:fldChar w:fldCharType="separate"/>
-      <w:fldChar w:fldCharType="end"/>
-    </w:r>
+    </w:pPr>
+    <w:r/>
   </w:p>
 </w:ftr>
 </file>
@@ -3386,6 +3428,7 @@
       <w:pStyle w:val="Footer"/>
       <w:jc w:val="center"/>
     </w:pPr>
+    <w:r/>
     <w:r>
       <w:rPr>
         <w:rFonts w:ascii="Times New Roman" w:hAnsi="Times New Roman"/>
@@ -3405,18 +3448,8 @@
   <w:p>
     <w:pPr>
       <w:pStyle w:val="Footer"/>
-      <w:jc w:val="center"/>
-    </w:pPr>
-    <w:r>
-      <w:rPr>
-        <w:rFonts w:ascii="Times New Roman" w:hAnsi="Times New Roman"/>
-        <w:sz w:val="24"/>
-      </w:rPr>
-      <w:fldChar w:fldCharType="begin"/>
-      <w:instrText xml:space="preserve"> PAGE </w:instrText>
-      <w:fldChar w:fldCharType="separate"/>
-      <w:fldChar w:fldCharType="end"/>
-    </w:r>
+    </w:pPr>
+    <w:r/>
   </w:p>
 </w:ftr>
 </file>
@@ -3428,6 +3461,7 @@
       <w:pStyle w:val="Footer"/>
       <w:jc w:val="center"/>
     </w:pPr>
+    <w:r/>
     <w:r>
       <w:rPr>
         <w:rFonts w:ascii="Times New Roman" w:hAnsi="Times New Roman"/>
@@ -3447,8 +3481,20 @@
   <w:p>
     <w:pPr>
       <w:pStyle w:val="Footer"/>
+    </w:pPr>
+    <w:r/>
+  </w:p>
+</w:ftr>
+</file>
+
+<file path=word/footer25.xml><?xml version="1.0" encoding="utf-8"?>
+<w:ftr xmlns:m="http://schemas.openxmlformats.org/officeDocument/2006/math" xmlns:mc="http://schemas.openxmlformats.org/markup-compatibility/2006" xmlns:mo="http://schemas.microsoft.com/office/mac/office/2008/main" xmlns:mv="urn:schemas-microsoft-com:mac:vml" xmlns:o="urn:schemas-microsoft-com:office:office" xmlns:r="http://schemas.openxmlformats.org/officeDocument/2006/relationships" xmlns:v="urn:schemas-microsoft-com:vml" xmlns:w10="urn:schemas-microsoft-com:office:word" xmlns:w14="http://schemas.microsoft.com/office/word/2010/wordml" xmlns:w="http://schemas.openxmlformats.org/wordprocessingml/2006/main" xmlns:wne="http://schemas.microsoft.com/office/word/2006/wordml" xmlns:wp14="http://schemas.microsoft.com/office/word/2010/wordprocessingDrawing" xmlns:wp="http://schemas.openxmlformats.org/drawingml/2006/wordprocessingDrawing" xmlns:wpc="http://schemas.microsoft.com/office/word/2010/wordprocessingCanvas" xmlns:wpg="http://schemas.microsoft.com/office/word/2010/wordprocessingGroup" xmlns:wpi="http://schemas.microsoft.com/office/word/2010/wordprocessingInk" xmlns:wps="http://schemas.microsoft.com/office/word/2010/wordprocessingShape" mc:Ignorable="w14 wp14">
+  <w:p>
+    <w:pPr>
+      <w:pStyle w:val="Footer"/>
       <w:jc w:val="center"/>
     </w:pPr>
+    <w:r/>
     <w:r>
       <w:rPr>
         <w:rFonts w:ascii="Times New Roman" w:hAnsi="Times New Roman"/>
@@ -3463,6 +3509,50 @@
 </w:ftr>
 </file>
 
+<file path=word/footer26.xml><?xml version="1.0" encoding="utf-8"?>
+<w:ftr xmlns:m="http://schemas.openxmlformats.org/officeDocument/2006/math" xmlns:mc="http://schemas.openxmlformats.org/markup-compatibility/2006" xmlns:mo="http://schemas.microsoft.com/office/mac/office/2008/main" xmlns:mv="urn:schemas-microsoft-com:mac:vml" xmlns:o="urn:schemas-microsoft-com:office:office" xmlns:r="http://schemas.openxmlformats.org/officeDocument/2006/relationships" xmlns:v="urn:schemas-microsoft-com:vml" xmlns:w10="urn:schemas-microsoft-com:office:word" xmlns:w14="http://schemas.microsoft.com/office/word/2010/wordml" xmlns:w="http://schemas.openxmlformats.org/wordprocessingml/2006/main" xmlns:wne="http://schemas.microsoft.com/office/word/2006/wordml" xmlns:wp14="http://schemas.microsoft.com/office/word/2010/wordprocessingDrawing" xmlns:wp="http://schemas.openxmlformats.org/drawingml/2006/wordprocessingDrawing" xmlns:wpc="http://schemas.microsoft.com/office/word/2010/wordprocessingCanvas" xmlns:wpg="http://schemas.microsoft.com/office/word/2010/wordprocessingGroup" xmlns:wpi="http://schemas.microsoft.com/office/word/2010/wordprocessingInk" xmlns:wps="http://schemas.microsoft.com/office/word/2010/wordprocessingShape" mc:Ignorable="w14 wp14">
+  <w:p>
+    <w:pPr>
+      <w:pStyle w:val="Footer"/>
+    </w:pPr>
+    <w:r/>
+  </w:p>
+</w:ftr>
+</file>
+
+<file path=word/footer27.xml><?xml version="1.0" encoding="utf-8"?>
+<w:ftr xmlns:m="http://schemas.openxmlformats.org/officeDocument/2006/math" xmlns:mc="http://schemas.openxmlformats.org/markup-compatibility/2006" xmlns:mo="http://schemas.microsoft.com/office/mac/office/2008/main" xmlns:mv="urn:schemas-microsoft-com:mac:vml" xmlns:o="urn:schemas-microsoft-com:office:office" xmlns:r="http://schemas.openxmlformats.org/officeDocument/2006/relationships" xmlns:v="urn:schemas-microsoft-com:vml" xmlns:w10="urn:schemas-microsoft-com:office:word" xmlns:w14="http://schemas.microsoft.com/office/word/2010/wordml" xmlns:w="http://schemas.openxmlformats.org/wordprocessingml/2006/main" xmlns:wne="http://schemas.microsoft.com/office/word/2006/wordml" xmlns:wp14="http://schemas.microsoft.com/office/word/2010/wordprocessingDrawing" xmlns:wp="http://schemas.openxmlformats.org/drawingml/2006/wordprocessingDrawing" xmlns:wpc="http://schemas.microsoft.com/office/word/2010/wordprocessingCanvas" xmlns:wpg="http://schemas.microsoft.com/office/word/2010/wordprocessingGroup" xmlns:wpi="http://schemas.microsoft.com/office/word/2010/wordprocessingInk" xmlns:wps="http://schemas.microsoft.com/office/word/2010/wordprocessingShape" mc:Ignorable="w14 wp14">
+  <w:p>
+    <w:pPr>
+      <w:pStyle w:val="Footer"/>
+      <w:jc w:val="center"/>
+    </w:pPr>
+    <w:r/>
+    <w:r>
+      <w:rPr>
+        <w:rFonts w:ascii="Times New Roman" w:hAnsi="Times New Roman"/>
+        <w:sz w:val="24"/>
+      </w:rPr>
+      <w:fldChar w:fldCharType="begin"/>
+      <w:instrText xml:space="preserve"> PAGE </w:instrText>
+      <w:fldChar w:fldCharType="separate"/>
+      <w:fldChar w:fldCharType="end"/>
+    </w:r>
+  </w:p>
+</w:ftr>
+</file>
+
+<file path=word/footer28.xml><?xml version="1.0" encoding="utf-8"?>
+<w:ftr xmlns:m="http://schemas.openxmlformats.org/officeDocument/2006/math" xmlns:mc="http://schemas.openxmlformats.org/markup-compatibility/2006" xmlns:mo="http://schemas.microsoft.com/office/mac/office/2008/main" xmlns:mv="urn:schemas-microsoft-com:mac:vml" xmlns:o="urn:schemas-microsoft-com:office:office" xmlns:r="http://schemas.openxmlformats.org/officeDocument/2006/relationships" xmlns:v="urn:schemas-microsoft-com:vml" xmlns:w10="urn:schemas-microsoft-com:office:word" xmlns:w14="http://schemas.microsoft.com/office/word/2010/wordml" xmlns:w="http://schemas.openxmlformats.org/wordprocessingml/2006/main" xmlns:wne="http://schemas.microsoft.com/office/word/2006/wordml" xmlns:wp14="http://schemas.microsoft.com/office/word/2010/wordprocessingDrawing" xmlns:wp="http://schemas.openxmlformats.org/drawingml/2006/wordprocessingDrawing" xmlns:wpc="http://schemas.microsoft.com/office/word/2010/wordprocessingCanvas" xmlns:wpg="http://schemas.microsoft.com/office/word/2010/wordprocessingGroup" xmlns:wpi="http://schemas.microsoft.com/office/word/2010/wordprocessingInk" xmlns:wps="http://schemas.microsoft.com/office/word/2010/wordprocessingShape" mc:Ignorable="w14 wp14">
+  <w:p>
+    <w:pPr>
+      <w:pStyle w:val="Footer"/>
+    </w:pPr>
+    <w:r/>
+  </w:p>
+</w:ftr>
+</file>
+
 <file path=word/footer3.xml><?xml version="1.0" encoding="utf-8"?>
 <w:ftr xmlns:m="http://schemas.openxmlformats.org/officeDocument/2006/math" xmlns:mc="http://schemas.openxmlformats.org/markup-compatibility/2006" xmlns:mo="http://schemas.microsoft.com/office/mac/office/2008/main" xmlns:mv="urn:schemas-microsoft-com:mac:vml" xmlns:o="urn:schemas-microsoft-com:office:office" xmlns:r="http://schemas.openxmlformats.org/officeDocument/2006/relationships" xmlns:v="urn:schemas-microsoft-com:vml" xmlns:w10="urn:schemas-microsoft-com:office:word" xmlns:w14="http://schemas.microsoft.com/office/word/2010/wordml" xmlns:w="http://schemas.openxmlformats.org/wordprocessingml/2006/main" xmlns:wne="http://schemas.microsoft.com/office/word/2006/wordml" xmlns:wp14="http://schemas.microsoft.com/office/word/2010/wordprocessingDrawing" xmlns:wp="http://schemas.openxmlformats.org/drawingml/2006/wordprocessingDrawing" xmlns:wpc="http://schemas.microsoft.com/office/word/2010/wordprocessingCanvas" xmlns:wpg="http://schemas.microsoft.com/office/word/2010/wordprocessingGroup" xmlns:wpi="http://schemas.microsoft.com/office/word/2010/wordprocessingInk" xmlns:wps="http://schemas.microsoft.com/office/word/2010/wordprocessingShape" mc:Ignorable="w14 wp14">
   <w:p>
@@ -3470,6 +3560,7 @@
       <w:pStyle w:val="Footer"/>
       <w:jc w:val="center"/>
     </w:pPr>
+    <w:r/>
     <w:r>
       <w:rPr>
         <w:rFonts w:ascii="Times New Roman" w:hAnsi="Times New Roman"/>
@@ -3489,8 +3580,20 @@
   <w:p>
     <w:pPr>
       <w:pStyle w:val="Footer"/>
+    </w:pPr>
+    <w:r/>
+  </w:p>
+</w:ftr>
+</file>
+
+<file path=word/footer5.xml><?xml version="1.0" encoding="utf-8"?>
+<w:ftr xmlns:m="http://schemas.openxmlformats.org/officeDocument/2006/math" xmlns:mc="http://schemas.openxmlformats.org/markup-compatibility/2006" xmlns:mo="http://schemas.microsoft.com/office/mac/office/2008/main" xmlns:mv="urn:schemas-microsoft-com:mac:vml" xmlns:o="urn:schemas-microsoft-com:office:office" xmlns:r="http://schemas.openxmlformats.org/officeDocument/2006/relationships" xmlns:v="urn:schemas-microsoft-com:vml" xmlns:w10="urn:schemas-microsoft-com:office:word" xmlns:w14="http://schemas.microsoft.com/office/word/2010/wordml" xmlns:w="http://schemas.openxmlformats.org/wordprocessingml/2006/main" xmlns:wne="http://schemas.microsoft.com/office/word/2006/wordml" xmlns:wp14="http://schemas.microsoft.com/office/word/2010/wordprocessingDrawing" xmlns:wp="http://schemas.openxmlformats.org/drawingml/2006/wordprocessingDrawing" xmlns:wpc="http://schemas.microsoft.com/office/word/2010/wordprocessingCanvas" xmlns:wpg="http://schemas.microsoft.com/office/word/2010/wordprocessingGroup" xmlns:wpi="http://schemas.microsoft.com/office/word/2010/wordprocessingInk" xmlns:wps="http://schemas.microsoft.com/office/word/2010/wordprocessingShape" mc:Ignorable="w14 wp14">
+  <w:p>
+    <w:pPr>
+      <w:pStyle w:val="Footer"/>
       <w:jc w:val="center"/>
     </w:pPr>
+    <w:r/>
     <w:r>
       <w:rPr>
         <w:rFonts w:ascii="Times New Roman" w:hAnsi="Times New Roman"/>
@@ -3505,22 +3608,13 @@
 </w:ftr>
 </file>
 
-<file path=word/footer5.xml><?xml version="1.0" encoding="utf-8"?>
-<w:ftr xmlns:m="http://schemas.openxmlformats.org/officeDocument/2006/math" xmlns:mc="http://schemas.openxmlformats.org/markup-compatibility/2006" xmlns:mo="http://schemas.microsoft.com/office/mac/office/2008/main" xmlns:mv="urn:schemas-microsoft-com:mac:vml" xmlns:o="urn:schemas-microsoft-com:office:office" xmlns:r="http://schemas.openxmlformats.org/officeDocument/2006/relationships" xmlns:v="urn:schemas-microsoft-com:vml" xmlns:w10="urn:schemas-microsoft-com:office:word" xmlns:w14="http://schemas.microsoft.com/office/word/2010/wordml" xmlns:w="http://schemas.openxmlformats.org/wordprocessingml/2006/main" xmlns:wne="http://schemas.microsoft.com/office/word/2006/wordml" xmlns:wp14="http://schemas.microsoft.com/office/word/2010/wordprocessingDrawing" xmlns:wp="http://schemas.openxmlformats.org/drawingml/2006/wordprocessingDrawing" xmlns:wpc="http://schemas.microsoft.com/office/word/2010/wordprocessingCanvas" xmlns:wpg="http://schemas.microsoft.com/office/word/2010/wordprocessingGroup" xmlns:wpi="http://schemas.microsoft.com/office/word/2010/wordprocessingInk" xmlns:wps="http://schemas.microsoft.com/office/word/2010/wordprocessingShape" mc:Ignorable="w14 wp14">
-  <w:p>
-    <w:pPr>
-      <w:pStyle w:val="Footer"/>
-    </w:pPr>
-  </w:p>
-</w:ftr>
-</file>
-
 <file path=word/footer6.xml><?xml version="1.0" encoding="utf-8"?>
 <w:ftr xmlns:m="http://schemas.openxmlformats.org/officeDocument/2006/math" xmlns:mc="http://schemas.openxmlformats.org/markup-compatibility/2006" xmlns:mo="http://schemas.microsoft.com/office/mac/office/2008/main" xmlns:mv="urn:schemas-microsoft-com:mac:vml" xmlns:o="urn:schemas-microsoft-com:office:office" xmlns:r="http://schemas.openxmlformats.org/officeDocument/2006/relationships" xmlns:v="urn:schemas-microsoft-com:vml" xmlns:w10="urn:schemas-microsoft-com:office:word" xmlns:w14="http://schemas.microsoft.com/office/word/2010/wordml" xmlns:w="http://schemas.openxmlformats.org/wordprocessingml/2006/main" xmlns:wne="http://schemas.microsoft.com/office/word/2006/wordml" xmlns:wp14="http://schemas.microsoft.com/office/word/2010/wordprocessingDrawing" xmlns:wp="http://schemas.openxmlformats.org/drawingml/2006/wordprocessingDrawing" xmlns:wpc="http://schemas.microsoft.com/office/word/2010/wordprocessingCanvas" xmlns:wpg="http://schemas.microsoft.com/office/word/2010/wordprocessingGroup" xmlns:wpi="http://schemas.microsoft.com/office/word/2010/wordprocessingInk" xmlns:wps="http://schemas.microsoft.com/office/word/2010/wordprocessingShape" mc:Ignorable="w14 wp14">
   <w:p>
     <w:pPr>
       <w:pStyle w:val="Footer"/>
     </w:pPr>
+    <w:r/>
   </w:p>
 </w:ftr>
 </file>
@@ -3532,6 +3626,7 @@
       <w:pStyle w:val="Footer"/>
       <w:jc w:val="center"/>
     </w:pPr>
+    <w:r/>
     <w:r>
       <w:rPr>
         <w:rFonts w:ascii="Times New Roman" w:hAnsi="Times New Roman"/>
@@ -3551,18 +3646,8 @@
   <w:p>
     <w:pPr>
       <w:pStyle w:val="Footer"/>
-      <w:jc w:val="center"/>
-    </w:pPr>
-    <w:r>
-      <w:rPr>
-        <w:rFonts w:ascii="Times New Roman" w:hAnsi="Times New Roman"/>
-        <w:sz w:val="24"/>
-      </w:rPr>
-      <w:fldChar w:fldCharType="begin"/>
-      <w:instrText xml:space="preserve"> PAGE \* roman </w:instrText>
-      <w:fldChar w:fldCharType="separate"/>
-      <w:fldChar w:fldCharType="end"/>
-    </w:r>
+    </w:pPr>
+    <w:r/>
   </w:p>
 </w:ftr>
 </file>
@@ -3574,6 +3659,7 @@
       <w:pStyle w:val="Footer"/>
       <w:jc w:val="center"/>
     </w:pPr>
+    <w:r/>
     <w:r>
       <w:rPr>
         <w:rFonts w:ascii="Times New Roman" w:hAnsi="Times New Roman"/>

</xml_diff>

<commit_message>
Recompilar todos los entregables
</commit_message>
<xml_diff>
--- a/amaal/reportes/Informe_Pasantia_IUTECP_BORRADOR1.docx
+++ b/amaal/reportes/Informe_Pasantia_IUTECP_BORRADOR1.docx
@@ -4,7 +4,7 @@
   <w:body>
     <w:p>
       <w:pPr>
-        <w:spacing w:line="240" w:lineRule="auto" w:before="0" w:after="0"/>
+        <w:spacing w:line="276" w:lineRule="auto" w:before="0" w:after="0"/>
         <w:jc w:val="center"/>
       </w:pPr>
       <w:r>
@@ -54,7 +54,7 @@
     </w:p>
     <w:p>
       <w:pPr>
-        <w:spacing w:before="400" w:after="240"/>
+        <w:spacing w:before="947" w:after="1242"/>
         <w:jc w:val="center"/>
       </w:pPr>
       <w:r>
@@ -94,7 +94,7 @@
     </w:p>
     <w:p>
       <w:pPr>
-        <w:spacing w:line="360" w:lineRule="auto" w:before="1080" w:after="0"/>
+        <w:spacing w:line="276" w:lineRule="auto" w:before="0" w:after="0"/>
         <w:jc w:val="center"/>
       </w:pPr>
       <w:r>
@@ -108,7 +108,7 @@
     </w:p>
     <w:p>
       <w:pPr>
-        <w:spacing w:line="240" w:lineRule="auto" w:before="2100"/>
+        <w:spacing w:line="276" w:lineRule="auto" w:before="3158" w:after="0"/>
         <w:jc w:val="right"/>
       </w:pPr>
       <w:r>
@@ -123,7 +123,7 @@
       <w:r>
         <w:rPr>
           <w:rFonts w:ascii="Times New Roman" w:hAnsi="Times New Roman"/>
-          <w:b w:val="0"/>
+          <w:b/>
           <w:sz w:val="24"/>
         </w:rPr>
         <w:t>Alrifaai Alrifaaie, Amaal</w:t>
@@ -132,7 +132,7 @@
       <w:r>
         <w:rPr>
           <w:rFonts w:ascii="Times New Roman" w:hAnsi="Times New Roman"/>
-          <w:b w:val="0"/>
+          <w:b/>
           <w:sz w:val="24"/>
         </w:rPr>
         <w:t>C.I.: 31.985.792</w:t>
@@ -140,7 +140,7 @@
     </w:p>
     <w:p>
       <w:pPr>
-        <w:spacing w:before="1240"/>
+        <w:spacing w:line="276" w:lineRule="auto" w:before="1579" w:after="0"/>
         <w:jc w:val="center"/>
       </w:pPr>
       <w:r>
@@ -154,8 +154,7 @@
     <w:p>
       <w:pPr>
         <w:sectPr>
-          <w:footerReference w:type="default" r:id="rId15"/>
-          <w:footerReference w:type="first" r:id="rId16"/>
+          <w:footerReference w:type="default" r:id="rId16"/>
           <w:pgSz w:w="12240" w:h="15840"/>
           <w:pgMar w:top="1701" w:right="1701" w:bottom="1701" w:left="2268" w:header="720" w:footer="720" w:gutter="0"/>
           <w:cols w:space="720"/>
@@ -165,7 +164,7 @@
     </w:p>
     <w:p>
       <w:pPr>
-        <w:spacing w:line="240" w:lineRule="auto" w:before="0" w:after="0"/>
+        <w:spacing w:line="276" w:lineRule="auto" w:before="0" w:after="0"/>
         <w:jc w:val="center"/>
       </w:pPr>
       <w:r>
@@ -215,7 +214,7 @@
     </w:p>
     <w:p>
       <w:pPr>
-        <w:spacing w:line="360" w:lineRule="auto" w:before="1280" w:after="0"/>
+        <w:spacing w:line="276" w:lineRule="auto" w:before="3053" w:after="0"/>
         <w:jc w:val="center"/>
       </w:pPr>
       <w:r>
@@ -229,21 +228,7 @@
     </w:p>
     <w:p>
       <w:pPr>
-        <w:spacing w:line="360" w:lineRule="auto" w:before="440" w:after="0"/>
-        <w:jc w:val="center"/>
-      </w:pPr>
-      <w:r>
-        <w:rPr>
-          <w:rFonts w:ascii="Times New Roman" w:hAnsi="Times New Roman"/>
-          <w:b/>
-          <w:sz w:val="24"/>
-        </w:rPr>
-        <w:t>Informe de pasantías para obtener el título de Técnico Superior Universitario en la especialidad de: Administración</w:t>
-      </w:r>
-    </w:p>
-    <w:p>
-      <w:pPr>
-        <w:spacing w:before="2100" w:after="0" w:line="20" w:lineRule="exact"/>
+        <w:spacing w:before="2544" w:after="0" w:line="20" w:lineRule="exact"/>
       </w:pPr>
     </w:p>
     <w:tbl>
@@ -268,10 +253,11 @@
         <w:tc>
           <w:tcPr>
             <w:tcW w:type="dxa" w:w="4133"/>
+            <w:vAlign w:val="top"/>
           </w:tcPr>
           <w:p>
             <w:pPr>
-              <w:spacing w:line="240" w:lineRule="auto"/>
+              <w:spacing w:line="276" w:lineRule="auto"/>
               <w:jc w:val="left"/>
             </w:pPr>
             <w:r>
@@ -286,7 +272,7 @@
             <w:r>
               <w:rPr>
                 <w:rFonts w:ascii="Times New Roman" w:hAnsi="Times New Roman"/>
-                <w:b w:val="0"/>
+                <w:b/>
                 <w:sz w:val="24"/>
               </w:rPr>
               <w:t>Mata, Lenny</w:t>
@@ -295,7 +281,7 @@
             <w:r>
               <w:rPr>
                 <w:rFonts w:ascii="Times New Roman" w:hAnsi="Times New Roman"/>
-                <w:b w:val="0"/>
+                <w:b/>
                 <w:sz w:val="24"/>
               </w:rPr>
               <w:t>C.I.: 8969750</w:t>
@@ -304,7 +290,7 @@
             <w:r>
               <w:rPr>
                 <w:rFonts w:ascii="Times New Roman" w:hAnsi="Times New Roman"/>
-                <w:b w:val="0"/>
+                <w:b/>
                 <w:sz w:val="24"/>
               </w:rPr>
               <w:br/>
@@ -321,7 +307,7 @@
             <w:r>
               <w:rPr>
                 <w:rFonts w:ascii="Times New Roman" w:hAnsi="Times New Roman"/>
-                <w:b w:val="0"/>
+                <w:b/>
                 <w:sz w:val="24"/>
               </w:rPr>
               <w:t>Dra. Álvarez, Carmen</w:t>
@@ -330,7 +316,7 @@
             <w:r>
               <w:rPr>
                 <w:rFonts w:ascii="Times New Roman" w:hAnsi="Times New Roman"/>
-                <w:b w:val="0"/>
+                <w:b/>
                 <w:sz w:val="24"/>
               </w:rPr>
               <w:t>C.I.: 14.452.956</w:t>
@@ -340,10 +326,11 @@
         <w:tc>
           <w:tcPr>
             <w:tcW w:type="dxa" w:w="4139"/>
+            <w:vAlign w:val="top"/>
           </w:tcPr>
           <w:p>
             <w:pPr>
-              <w:spacing w:line="240" w:lineRule="auto"/>
+              <w:spacing w:line="276" w:lineRule="auto"/>
               <w:jc w:val="right"/>
             </w:pPr>
             <w:r>
@@ -358,7 +345,7 @@
             <w:r>
               <w:rPr>
                 <w:rFonts w:ascii="Times New Roman" w:hAnsi="Times New Roman"/>
-                <w:b w:val="0"/>
+                <w:b/>
                 <w:sz w:val="24"/>
               </w:rPr>
               <w:t>Alrifaai Alrifaaie, Amaal</w:t>
@@ -367,7 +354,7 @@
             <w:r>
               <w:rPr>
                 <w:rFonts w:ascii="Times New Roman" w:hAnsi="Times New Roman"/>
-                <w:b w:val="0"/>
+                <w:b/>
                 <w:sz w:val="24"/>
               </w:rPr>
               <w:t>C.I.: 31.985.792</w:t>
@@ -378,7 +365,7 @@
     </w:tbl>
     <w:p>
       <w:pPr>
-        <w:spacing w:before="800"/>
+        <w:spacing w:line="276" w:lineRule="auto" w:before="1272" w:after="0"/>
         <w:jc w:val="center"/>
       </w:pPr>
       <w:r>
@@ -393,12 +380,11 @@
       <w:pPr>
         <w:sectPr>
           <w:footerReference w:type="default" r:id="rId17"/>
-          <w:footerReference w:type="first" r:id="rId18"/>
           <w:pgSz w:w="12240" w:h="15840"/>
           <w:pgMar w:top="1701" w:right="1701" w:bottom="1701" w:left="2268" w:header="720" w:footer="720" w:gutter="0"/>
           <w:cols w:space="720"/>
+          <w:titlePg/>
           <w:docGrid w:linePitch="360"/>
-          <w:pgNumType w:start="2" w:fmt="lowerRoman"/>
         </w:sectPr>
       </w:pPr>
     </w:p>
@@ -589,13 +575,12 @@
     <w:p>
       <w:pPr>
         <w:sectPr>
-          <w:footerReference w:type="default" r:id="rId19"/>
-          <w:footerReference w:type="first" r:id="rId20"/>
+          <w:footerReference w:type="default" r:id="rId18"/>
           <w:pgSz w:w="12240" w:h="15840"/>
           <w:pgMar w:top="1701" w:right="1701" w:bottom="1701" w:left="2268" w:header="720" w:footer="720" w:gutter="0"/>
           <w:cols w:space="720"/>
+          <w:titlePg/>
           <w:docGrid w:linePitch="360"/>
-          <w:pgNumType w:fmt="lowerRoman"/>
         </w:sectPr>
       </w:pPr>
     </w:p>
@@ -759,20 +744,18 @@
     <w:p>
       <w:pPr>
         <w:sectPr>
-          <w:footerReference w:type="default" r:id="rId21"/>
-          <w:footerReference w:type="first" r:id="rId22"/>
+          <w:footerReference w:type="default" r:id="rId19"/>
           <w:pgSz w:w="12240" w:h="15840"/>
           <w:pgMar w:top="1701" w:right="1701" w:bottom="1701" w:left="2268" w:header="720" w:footer="720" w:gutter="0"/>
           <w:cols w:space="720"/>
+          <w:titlePg/>
           <w:docGrid w:linePitch="360"/>
-          <w:pgNumType w:fmt="lowerRoman"/>
         </w:sectPr>
       </w:pPr>
     </w:p>
     <w:p>
-      <w:bookmarkStart w:id="bm_indice" w:name="bm_indice"/>
-      <w:pPr>
-        <w:spacing w:before="1140" w:after="480" w:line="360" w:lineRule="auto"/>
+      <w:pPr>
+        <w:spacing w:before="1140" w:after="480"/>
         <w:jc w:val="center"/>
       </w:pPr>
       <w:r>
@@ -783,11 +766,22 @@
         </w:rPr>
         <w:t>ÍNDICE DE CONTENIDO</w:t>
       </w:r>
-      <w:bookmarkEnd w:id="bm_indice"/>
     </w:p>
     <w:p>
       <w:pPr>
-        <w:spacing w:after="80"/>
+        <w:sectPr>
+          <w:footerReference w:type="default" r:id="rId20"/>
+          <w:pgSz w:w="12240" w:h="15840"/>
+          <w:pgMar w:top="1701" w:right="1701" w:bottom="1701" w:left="2268" w:header="720" w:footer="720" w:gutter="0"/>
+          <w:cols w:space="720"/>
+          <w:titlePg/>
+          <w:docGrid w:linePitch="360"/>
+        </w:sectPr>
+      </w:pPr>
+    </w:p>
+    <w:p>
+      <w:pPr>
+        <w:spacing w:after="240"/>
         <w:jc w:val="right"/>
       </w:pPr>
       <w:r>
@@ -804,33 +798,7 @@
         <w:tabs>
           <w:tab w:pos="8271" w:val="right" w:leader="dot"/>
         </w:tabs>
-        <w:spacing w:line="240" w:lineRule="auto" w:before="0" w:after="0"/>
-        <w:ind w:left="0"/>
-      </w:pPr>
-      <w:r>
-        <w:rPr>
-          <w:rFonts w:ascii="Times New Roman" w:hAnsi="Times New Roman"/>
-          <w:b w:val="0"/>
-          <w:sz w:val="24"/>
-        </w:rPr>
-        <w:t>CONTRAPORTADA</w:t>
-        <w:tab/>
-      </w:r>
-      <w:r>
-        <w:rPr>
-          <w:rFonts w:ascii="Times New Roman" w:hAnsi="Times New Roman"/>
-          <w:b w:val="0"/>
-          <w:sz w:val="24"/>
-        </w:rPr>
-        <w:t>ii</w:t>
-      </w:r>
-    </w:p>
-    <w:p>
-      <w:pPr>
-        <w:tabs>
-          <w:tab w:pos="8271" w:val="right" w:leader="dot"/>
-        </w:tabs>
-        <w:spacing w:line="240" w:lineRule="auto" w:before="0" w:after="0"/>
+        <w:spacing w:line="360" w:lineRule="auto" w:before="0" w:after="80"/>
         <w:ind w:left="0"/>
       </w:pPr>
       <w:r>
@@ -848,7 +816,11 @@
           <w:b w:val="0"/>
           <w:sz w:val="24"/>
         </w:rPr>
-        <w:t>iii</w:t>
+        <w:fldChar w:fldCharType="begin"/>
+        <w:instrText xml:space="preserve"> PAGEREF bm_aprob_ind \h </w:instrText>
+        <w:fldChar w:fldCharType="separate"/>
+        <w:t>?</w:t>
+        <w:fldChar w:fldCharType="end"/>
       </w:r>
     </w:p>
     <w:p>
@@ -856,7 +828,7 @@
         <w:tabs>
           <w:tab w:pos="8271" w:val="right" w:leader="dot"/>
         </w:tabs>
-        <w:spacing w:line="240" w:lineRule="auto" w:before="0" w:after="0"/>
+        <w:spacing w:line="360" w:lineRule="auto" w:before="0" w:after="80"/>
         <w:ind w:left="0"/>
       </w:pPr>
       <w:r>
@@ -874,7 +846,11 @@
           <w:b w:val="0"/>
           <w:sz w:val="24"/>
         </w:rPr>
-        <w:t>iv</w:t>
+        <w:fldChar w:fldCharType="begin"/>
+        <w:instrText xml:space="preserve"> PAGEREF bm_aprob_acad \h </w:instrText>
+        <w:fldChar w:fldCharType="separate"/>
+        <w:t>?</w:t>
+        <w:fldChar w:fldCharType="end"/>
       </w:r>
     </w:p>
     <w:p>
@@ -882,33 +858,7 @@
         <w:tabs>
           <w:tab w:pos="8271" w:val="right" w:leader="dot"/>
         </w:tabs>
-        <w:spacing w:line="240" w:lineRule="auto" w:before="0" w:after="0"/>
-        <w:ind w:left="0"/>
-      </w:pPr>
-      <w:r>
-        <w:rPr>
-          <w:rFonts w:ascii="Times New Roman" w:hAnsi="Times New Roman"/>
-          <w:b w:val="0"/>
-          <w:sz w:val="24"/>
-        </w:rPr>
-        <w:t>ÍNDICE DE CONTENIDO</w:t>
-        <w:tab/>
-      </w:r>
-      <w:r>
-        <w:rPr>
-          <w:rFonts w:ascii="Times New Roman" w:hAnsi="Times New Roman"/>
-          <w:b w:val="0"/>
-          <w:sz w:val="24"/>
-        </w:rPr>
-        <w:t>v</w:t>
-      </w:r>
-    </w:p>
-    <w:p>
-      <w:pPr>
-        <w:tabs>
-          <w:tab w:pos="8271" w:val="right" w:leader="dot"/>
-        </w:tabs>
-        <w:spacing w:line="240" w:lineRule="auto" w:before="0" w:after="0"/>
+        <w:spacing w:line="360" w:lineRule="auto" w:before="0" w:after="80"/>
         <w:ind w:left="0"/>
       </w:pPr>
       <w:r>
@@ -926,7 +876,11 @@
           <w:b w:val="0"/>
           <w:sz w:val="24"/>
         </w:rPr>
-        <w:t>vi</w:t>
+        <w:fldChar w:fldCharType="begin"/>
+        <w:instrText xml:space="preserve"> PAGEREF bm_lista_cuadros \h </w:instrText>
+        <w:fldChar w:fldCharType="separate"/>
+        <w:t>?</w:t>
+        <w:fldChar w:fldCharType="end"/>
       </w:r>
     </w:p>
     <w:p>
@@ -934,7 +888,37 @@
         <w:tabs>
           <w:tab w:pos="8271" w:val="right" w:leader="dot"/>
         </w:tabs>
-        <w:spacing w:line="240" w:lineRule="auto" w:before="0" w:after="0"/>
+        <w:spacing w:line="360" w:lineRule="auto" w:before="0" w:after="80"/>
+        <w:ind w:left="0"/>
+      </w:pPr>
+      <w:r>
+        <w:rPr>
+          <w:rFonts w:ascii="Times New Roman" w:hAnsi="Times New Roman"/>
+          <w:b w:val="0"/>
+          <w:sz w:val="24"/>
+        </w:rPr>
+        <w:t>LISTA DE FIGURAS</w:t>
+        <w:tab/>
+      </w:r>
+      <w:r>
+        <w:rPr>
+          <w:rFonts w:ascii="Times New Roman" w:hAnsi="Times New Roman"/>
+          <w:b w:val="0"/>
+          <w:sz w:val="24"/>
+        </w:rPr>
+        <w:fldChar w:fldCharType="begin"/>
+        <w:instrText xml:space="preserve"> PAGEREF bm_lista_figuras \h </w:instrText>
+        <w:fldChar w:fldCharType="separate"/>
+        <w:t>?</w:t>
+        <w:fldChar w:fldCharType="end"/>
+      </w:r>
+    </w:p>
+    <w:p>
+      <w:pPr>
+        <w:tabs>
+          <w:tab w:pos="8271" w:val="right" w:leader="dot"/>
+        </w:tabs>
+        <w:spacing w:line="360" w:lineRule="auto" w:before="0" w:after="80"/>
         <w:ind w:left="0"/>
       </w:pPr>
       <w:r>
@@ -952,7 +936,11 @@
           <w:b w:val="0"/>
           <w:sz w:val="24"/>
         </w:rPr>
-        <w:t>vii</w:t>
+        <w:fldChar w:fldCharType="begin"/>
+        <w:instrText xml:space="preserve"> PAGEREF bm_lista_graficos \h </w:instrText>
+        <w:fldChar w:fldCharType="separate"/>
+        <w:t>?</w:t>
+        <w:fldChar w:fldCharType="end"/>
       </w:r>
     </w:p>
     <w:p>
@@ -960,7 +948,7 @@
         <w:tabs>
           <w:tab w:pos="8271" w:val="right" w:leader="dot"/>
         </w:tabs>
-        <w:spacing w:line="240" w:lineRule="auto" w:before="0" w:after="0"/>
+        <w:spacing w:line="360" w:lineRule="auto" w:before="0" w:after="80"/>
         <w:ind w:left="0"/>
       </w:pPr>
       <w:r>
@@ -978,7 +966,11 @@
           <w:b w:val="0"/>
           <w:sz w:val="24"/>
         </w:rPr>
-        <w:t>viii</w:t>
+        <w:fldChar w:fldCharType="begin"/>
+        <w:instrText xml:space="preserve"> PAGEREF bm_lista_anexos \h </w:instrText>
+        <w:fldChar w:fldCharType="separate"/>
+        <w:t>?</w:t>
+        <w:fldChar w:fldCharType="end"/>
       </w:r>
     </w:p>
     <w:p>
@@ -986,7 +978,7 @@
         <w:tabs>
           <w:tab w:pos="8271" w:val="right" w:leader="dot"/>
         </w:tabs>
-        <w:spacing w:line="240" w:lineRule="auto" w:before="0" w:after="0"/>
+        <w:spacing w:line="360" w:lineRule="auto" w:before="0" w:after="80"/>
         <w:ind w:left="0"/>
       </w:pPr>
       <w:r>
@@ -1004,7 +996,11 @@
           <w:b w:val="0"/>
           <w:sz w:val="24"/>
         </w:rPr>
-        <w:t>ix</w:t>
+        <w:fldChar w:fldCharType="begin"/>
+        <w:instrText xml:space="preserve"> PAGEREF bm_resumen \h </w:instrText>
+        <w:fldChar w:fldCharType="separate"/>
+        <w:t>?</w:t>
+        <w:fldChar w:fldCharType="end"/>
       </w:r>
     </w:p>
     <w:p>
@@ -1012,7 +1008,7 @@
         <w:tabs>
           <w:tab w:pos="8271" w:val="right" w:leader="dot"/>
         </w:tabs>
-        <w:spacing w:line="240" w:lineRule="auto" w:before="0" w:after="0"/>
+        <w:spacing w:line="360" w:lineRule="auto" w:before="0" w:after="80"/>
         <w:ind w:left="0"/>
       </w:pPr>
       <w:r>
@@ -1030,12 +1026,16 @@
           <w:b w:val="0"/>
           <w:sz w:val="24"/>
         </w:rPr>
-        <w:t>1</w:t>
+        <w:fldChar w:fldCharType="begin"/>
+        <w:instrText xml:space="preserve"> PAGEREF bm_introduccion \h </w:instrText>
+        <w:fldChar w:fldCharType="separate"/>
+        <w:t>?</w:t>
+        <w:fldChar w:fldCharType="end"/>
       </w:r>
     </w:p>
     <w:p>
       <w:pPr>
-        <w:spacing w:before="80" w:after="0"/>
+        <w:spacing w:before="240" w:after="120"/>
       </w:pPr>
       <w:r>
         <w:rPr>
@@ -1049,7 +1049,7 @@
         <w:tabs>
           <w:tab w:pos="8271" w:val="right" w:leader="dot"/>
         </w:tabs>
-        <w:spacing w:line="240" w:lineRule="auto" w:before="0" w:after="0"/>
+        <w:spacing w:line="360" w:lineRule="auto" w:before="0" w:after="80"/>
         <w:ind w:left="0"/>
       </w:pPr>
       <w:r>
@@ -1079,7 +1079,7 @@
         <w:tabs>
           <w:tab w:pos="8271" w:val="right" w:leader="dot"/>
         </w:tabs>
-        <w:spacing w:line="240" w:lineRule="auto" w:before="0" w:after="0"/>
+        <w:spacing w:line="360" w:lineRule="auto" w:before="0" w:after="80"/>
         <w:ind w:left="283"/>
       </w:pPr>
       <w:r>
@@ -1109,7 +1109,7 @@
         <w:tabs>
           <w:tab w:pos="8271" w:val="right" w:leader="dot"/>
         </w:tabs>
-        <w:spacing w:line="240" w:lineRule="auto" w:before="0" w:after="0"/>
+        <w:spacing w:line="360" w:lineRule="auto" w:before="0" w:after="80"/>
         <w:ind w:left="283"/>
       </w:pPr>
       <w:r>
@@ -1139,7 +1139,7 @@
         <w:tabs>
           <w:tab w:pos="8271" w:val="right" w:leader="dot"/>
         </w:tabs>
-        <w:spacing w:line="240" w:lineRule="auto" w:before="0" w:after="0"/>
+        <w:spacing w:line="360" w:lineRule="auto" w:before="0" w:after="80"/>
         <w:ind w:left="283"/>
       </w:pPr>
       <w:r>
@@ -1169,7 +1169,7 @@
         <w:tabs>
           <w:tab w:pos="8271" w:val="right" w:leader="dot"/>
         </w:tabs>
-        <w:spacing w:line="240" w:lineRule="auto" w:before="0" w:after="0"/>
+        <w:spacing w:line="360" w:lineRule="auto" w:before="0" w:after="80"/>
         <w:ind w:left="283"/>
       </w:pPr>
       <w:r>
@@ -1199,7 +1199,7 @@
         <w:tabs>
           <w:tab w:pos="8271" w:val="right" w:leader="dot"/>
         </w:tabs>
-        <w:spacing w:line="240" w:lineRule="auto" w:before="0" w:after="0"/>
+        <w:spacing w:line="360" w:lineRule="auto" w:before="0" w:after="80"/>
         <w:ind w:left="283"/>
       </w:pPr>
       <w:r>
@@ -1229,7 +1229,7 @@
         <w:tabs>
           <w:tab w:pos="8271" w:val="right" w:leader="dot"/>
         </w:tabs>
-        <w:spacing w:line="240" w:lineRule="auto" w:before="0" w:after="0"/>
+        <w:spacing w:line="360" w:lineRule="auto" w:before="0" w:after="80"/>
         <w:ind w:left="283"/>
       </w:pPr>
       <w:r>
@@ -1259,7 +1259,7 @@
         <w:tabs>
           <w:tab w:pos="8271" w:val="right" w:leader="dot"/>
         </w:tabs>
-        <w:spacing w:line="240" w:lineRule="auto" w:before="0" w:after="0"/>
+        <w:spacing w:line="360" w:lineRule="auto" w:before="0" w:after="80"/>
         <w:ind w:left="283"/>
       </w:pPr>
       <w:r>
@@ -1289,7 +1289,7 @@
         <w:tabs>
           <w:tab w:pos="8271" w:val="right" w:leader="dot"/>
         </w:tabs>
-        <w:spacing w:line="240" w:lineRule="auto" w:before="0" w:after="0"/>
+        <w:spacing w:line="360" w:lineRule="auto" w:before="0" w:after="80"/>
         <w:ind w:left="283"/>
       </w:pPr>
       <w:r>
@@ -1319,7 +1319,7 @@
         <w:tabs>
           <w:tab w:pos="8271" w:val="right" w:leader="dot"/>
         </w:tabs>
-        <w:spacing w:line="240" w:lineRule="auto" w:before="0" w:after="0"/>
+        <w:spacing w:line="360" w:lineRule="auto" w:before="0" w:after="80"/>
         <w:ind w:left="283"/>
       </w:pPr>
       <w:r>
@@ -1349,37 +1349,7 @@
         <w:tabs>
           <w:tab w:pos="8271" w:val="right" w:leader="dot"/>
         </w:tabs>
-        <w:spacing w:line="240" w:lineRule="auto" w:before="0" w:after="0"/>
-        <w:ind w:left="283"/>
-      </w:pPr>
-      <w:r>
-        <w:rPr>
-          <w:rFonts w:ascii="Times New Roman" w:hAnsi="Times New Roman"/>
-          <w:b w:val="0"/>
-          <w:sz w:val="24"/>
-        </w:rPr>
-        <w:t>Descripción del departamento donde realizó la pasantía</w:t>
-        <w:tab/>
-      </w:r>
-      <w:r>
-        <w:rPr>
-          <w:rFonts w:ascii="Times New Roman" w:hAnsi="Times New Roman"/>
-          <w:b w:val="0"/>
-          <w:sz w:val="24"/>
-        </w:rPr>
-        <w:fldChar w:fldCharType="begin"/>
-        <w:instrText xml:space="preserve"> PAGEREF bm_cap1_depto \h </w:instrText>
-        <w:fldChar w:fldCharType="separate"/>
-        <w:t>?</w:t>
-        <w:fldChar w:fldCharType="end"/>
-      </w:r>
-    </w:p>
-    <w:p>
-      <w:pPr>
-        <w:tabs>
-          <w:tab w:pos="8271" w:val="right" w:leader="dot"/>
-        </w:tabs>
-        <w:spacing w:line="240" w:lineRule="auto" w:before="0" w:after="0"/>
+        <w:spacing w:line="360" w:lineRule="auto" w:before="0" w:after="80"/>
         <w:ind w:left="0"/>
       </w:pPr>
       <w:r>
@@ -1409,7 +1379,7 @@
         <w:tabs>
           <w:tab w:pos="8271" w:val="right" w:leader="dot"/>
         </w:tabs>
-        <w:spacing w:line="240" w:lineRule="auto" w:before="0" w:after="0"/>
+        <w:spacing w:line="360" w:lineRule="auto" w:before="0" w:after="80"/>
         <w:ind w:left="0"/>
       </w:pPr>
       <w:r>
@@ -1437,20 +1407,20 @@
     <w:p>
       <w:pPr>
         <w:sectPr>
-          <w:footerReference w:type="default" r:id="rId23"/>
-          <w:footerReference w:type="first" r:id="rId24"/>
+          <w:footerReference w:type="default" r:id="rId21"/>
+          <w:type w:val="continuous"/>
           <w:pgSz w:w="12240" w:h="15840"/>
           <w:pgMar w:top="1701" w:right="1701" w:bottom="1701" w:left="2268" w:header="720" w:footer="720" w:gutter="0"/>
           <w:cols w:space="720"/>
+          <w:titlePg/>
           <w:docGrid w:linePitch="360"/>
-          <w:pgNumType w:fmt="lowerRoman"/>
         </w:sectPr>
       </w:pPr>
     </w:p>
     <w:p>
       <w:bookmarkStart w:id="bm_lista_cuadros" w:name="bm_lista_cuadros"/>
       <w:pPr>
-        <w:spacing w:before="1140" w:after="480" w:line="360" w:lineRule="auto"/>
+        <w:spacing w:before="1140" w:after="480"/>
         <w:jc w:val="center"/>
       </w:pPr>
       <w:r>
@@ -1462,6 +1432,18 @@
         <w:t>LISTA DE CUADROS</w:t>
       </w:r>
       <w:bookmarkEnd w:id="bm_lista_cuadros"/>
+    </w:p>
+    <w:p>
+      <w:pPr>
+        <w:sectPr>
+          <w:footerReference w:type="default" r:id="rId22"/>
+          <w:pgSz w:w="12240" w:h="15840"/>
+          <w:pgMar w:top="1701" w:right="1701" w:bottom="1701" w:left="2268" w:header="720" w:footer="720" w:gutter="0"/>
+          <w:cols w:space="720"/>
+          <w:titlePg/>
+          <w:docGrid w:linePitch="360"/>
+        </w:sectPr>
+      </w:pPr>
     </w:p>
     <w:p>
       <w:pPr>
@@ -1493,20 +1475,61 @@
     <w:p>
       <w:pPr>
         <w:sectPr>
-          <w:footerReference w:type="default" r:id="rId25"/>
-          <w:footerReference w:type="first" r:id="rId26"/>
+          <w:footerReference w:type="default" r:id="rId23"/>
+          <w:type w:val="continuous"/>
           <w:pgSz w:w="12240" w:h="15840"/>
           <w:pgMar w:top="1701" w:right="1701" w:bottom="1701" w:left="2268" w:header="720" w:footer="720" w:gutter="0"/>
           <w:cols w:space="720"/>
+          <w:titlePg/>
           <w:docGrid w:linePitch="360"/>
-          <w:pgNumType w:fmt="lowerRoman"/>
+        </w:sectPr>
+      </w:pPr>
+    </w:p>
+    <w:p>
+      <w:bookmarkStart w:id="bm_lista_figuras" w:name="bm_lista_figuras"/>
+      <w:pPr>
+        <w:spacing w:before="1140" w:after="480"/>
+        <w:jc w:val="center"/>
+      </w:pPr>
+      <w:r>
+        <w:rPr>
+          <w:rFonts w:ascii="Times New Roman" w:hAnsi="Times New Roman"/>
+          <w:b/>
+          <w:sz w:val="24"/>
+        </w:rPr>
+        <w:t>LISTA DE FIGURAS</w:t>
+      </w:r>
+      <w:bookmarkEnd w:id="bm_lista_figuras"/>
+    </w:p>
+    <w:p>
+      <w:pPr>
+        <w:sectPr>
+          <w:footerReference w:type="default" r:id="rId24"/>
+          <w:pgSz w:w="12240" w:h="15840"/>
+          <w:pgMar w:top="1701" w:right="1701" w:bottom="1701" w:left="2268" w:header="720" w:footer="720" w:gutter="0"/>
+          <w:cols w:space="720"/>
+          <w:titlePg/>
+          <w:docGrid w:linePitch="360"/>
+        </w:sectPr>
+      </w:pPr>
+    </w:p>
+    <w:p>
+      <w:pPr>
+        <w:sectPr>
+          <w:footerReference w:type="default" r:id="rId25"/>
+          <w:type w:val="continuous"/>
+          <w:pgSz w:w="12240" w:h="15840"/>
+          <w:pgMar w:top="1701" w:right="1701" w:bottom="1701" w:left="2268" w:header="720" w:footer="720" w:gutter="0"/>
+          <w:cols w:space="720"/>
+          <w:titlePg/>
+          <w:docGrid w:linePitch="360"/>
         </w:sectPr>
       </w:pPr>
     </w:p>
     <w:p>
       <w:bookmarkStart w:id="bm_lista_graficos" w:name="bm_lista_graficos"/>
       <w:pPr>
-        <w:spacing w:before="1140" w:after="480" w:line="360" w:lineRule="auto"/>
+        <w:spacing w:before="1140" w:after="480"/>
         <w:jc w:val="center"/>
       </w:pPr>
       <w:r>
@@ -1518,6 +1541,18 @@
         <w:t>LISTA DE GRÁFICOS</w:t>
       </w:r>
       <w:bookmarkEnd w:id="bm_lista_graficos"/>
+    </w:p>
+    <w:p>
+      <w:pPr>
+        <w:sectPr>
+          <w:footerReference w:type="default" r:id="rId26"/>
+          <w:pgSz w:w="12240" w:h="15840"/>
+          <w:pgMar w:top="1701" w:right="1701" w:bottom="1701" w:left="2268" w:header="720" w:footer="720" w:gutter="0"/>
+          <w:cols w:space="720"/>
+          <w:titlePg/>
+          <w:docGrid w:linePitch="360"/>
+        </w:sectPr>
+      </w:pPr>
     </w:p>
     <w:p>
       <w:pPr>
@@ -1562,7 +1597,7 @@
         </w:rPr>
         <w:t>1</w:t>
         <w:tab/>
-        <w:t>Representación cartográfica y ubicación espacial de Ingeniería de Telecomunicaciones, C.A.</w:t>
+        <w:t>Logotipo de Ingeniería de Telecomunicaciones, C.A.</w:t>
         <w:tab/>
       </w:r>
       <w:r>
@@ -1594,7 +1629,7 @@
         </w:rPr>
         <w:t>2</w:t>
         <w:tab/>
-        <w:t>Organigrama estructural y niveles jerárquicos de Ingeniería de Telecomunicaciones, C.A.</w:t>
+        <w:t>Representación cartográfica y ubicación espacial de Ingeniería de Telecomunicaciones, C.A.</w:t>
         <w:tab/>
       </w:r>
       <w:r>
@@ -1626,7 +1661,7 @@
         </w:rPr>
         <w:t>3</w:t>
         <w:tab/>
-        <w:t>Organigrama del Departamento de Administración.</w:t>
+        <w:t>Organigrama estructural y niveles jerárquicos de Ingeniería de Telecomunicaciones, C.A.</w:t>
         <w:tab/>
       </w:r>
       <w:r>
@@ -1644,21 +1679,53 @@
     </w:p>
     <w:p>
       <w:pPr>
+        <w:tabs>
+          <w:tab w:pos="1020" w:val="left"/>
+          <w:tab w:pos="8271" w:val="right" w:leader="dot"/>
+        </w:tabs>
+        <w:spacing w:line="360" w:lineRule="auto" w:before="0" w:after="80"/>
+        <w:ind w:left="1020" w:hanging="1020"/>
+      </w:pPr>
+      <w:r>
+        <w:rPr>
+          <w:rFonts w:ascii="Times New Roman" w:hAnsi="Times New Roman"/>
+          <w:sz w:val="24"/>
+        </w:rPr>
+        <w:t>4</w:t>
+        <w:tab/>
+        <w:t>Organigrama del Departamento de Administración.</w:t>
+        <w:tab/>
+      </w:r>
+      <w:r>
+        <w:rPr>
+          <w:rFonts w:ascii="Times New Roman" w:hAnsi="Times New Roman"/>
+          <w:b w:val="0"/>
+          <w:sz w:val="24"/>
+        </w:rPr>
+        <w:fldChar w:fldCharType="begin"/>
+        <w:instrText xml:space="preserve"> PAGEREF bm_grafico4 \h </w:instrText>
+        <w:fldChar w:fldCharType="separate"/>
+        <w:t>?</w:t>
+        <w:fldChar w:fldCharType="end"/>
+      </w:r>
+    </w:p>
+    <w:p>
+      <w:pPr>
         <w:sectPr>
           <w:footerReference w:type="default" r:id="rId27"/>
-          <w:footerReference w:type="first" r:id="rId28"/>
+          <w:type w:val="continuous"/>
           <w:pgSz w:w="12240" w:h="15840"/>
           <w:pgMar w:top="1701" w:right="1701" w:bottom="1701" w:left="2268" w:header="720" w:footer="720" w:gutter="0"/>
           <w:cols w:space="720"/>
+          <w:titlePg/>
           <w:docGrid w:linePitch="360"/>
-          <w:pgNumType w:fmt="lowerRoman"/>
         </w:sectPr>
       </w:pPr>
     </w:p>
     <w:p>
       <w:bookmarkStart w:id="bm_lista_anexos" w:name="bm_lista_anexos"/>
       <w:pPr>
-        <w:spacing w:before="1140" w:after="480" w:line="360" w:lineRule="auto"/>
+        <w:spacing w:before="1140" w:after="480"/>
         <w:jc w:val="center"/>
       </w:pPr>
       <w:r>
@@ -1670,6 +1737,18 @@
         <w:t>LISTA DE ANEXOS</w:t>
       </w:r>
       <w:bookmarkEnd w:id="bm_lista_anexos"/>
+    </w:p>
+    <w:p>
+      <w:pPr>
+        <w:sectPr>
+          <w:footerReference w:type="default" r:id="rId28"/>
+          <w:pgSz w:w="12240" w:h="15840"/>
+          <w:pgMar w:top="1701" w:right="1701" w:bottom="1701" w:left="2268" w:header="720" w:footer="720" w:gutter="0"/>
+          <w:cols w:space="720"/>
+          <w:titlePg/>
+          <w:docGrid w:linePitch="360"/>
+        </w:sectPr>
+      </w:pPr>
     </w:p>
     <w:p>
       <w:pPr>
@@ -1734,18 +1813,18 @@
       <w:pPr>
         <w:sectPr>
           <w:footerReference w:type="default" r:id="rId29"/>
-          <w:footerReference w:type="first" r:id="rId30"/>
+          <w:type w:val="continuous"/>
           <w:pgSz w:w="12240" w:h="15840"/>
           <w:pgMar w:top="1701" w:right="1701" w:bottom="1701" w:left="2268" w:header="720" w:footer="720" w:gutter="0"/>
           <w:cols w:space="720"/>
+          <w:titlePg/>
           <w:docGrid w:linePitch="360"/>
-          <w:pgNumType w:fmt="lowerRoman"/>
         </w:sectPr>
       </w:pPr>
     </w:p>
     <w:p>
       <w:pPr>
-        <w:spacing w:line="240" w:lineRule="auto" w:after="0"/>
+        <w:spacing w:after="0"/>
         <w:jc w:val="center"/>
       </w:pPr>
       <w:r>
@@ -1759,7 +1838,7 @@
     </w:p>
     <w:p>
       <w:pPr>
-        <w:spacing w:line="240" w:lineRule="auto" w:after="0"/>
+        <w:spacing w:after="0"/>
         <w:jc w:val="center"/>
       </w:pPr>
       <w:r>
@@ -1773,7 +1852,7 @@
     </w:p>
     <w:p>
       <w:pPr>
-        <w:spacing w:line="240" w:lineRule="auto" w:after="0"/>
+        <w:spacing w:after="0"/>
         <w:jc w:val="center"/>
       </w:pPr>
       <w:r>
@@ -1787,7 +1866,7 @@
     </w:p>
     <w:p>
       <w:pPr>
-        <w:spacing w:line="240" w:lineRule="auto" w:after="0"/>
+        <w:spacing w:after="0"/>
         <w:jc w:val="center"/>
       </w:pPr>
       <w:r>
@@ -1801,7 +1880,7 @@
     </w:p>
     <w:p>
       <w:pPr>
-        <w:spacing w:line="240" w:lineRule="auto" w:after="0"/>
+        <w:spacing w:after="0"/>
         <w:jc w:val="center"/>
       </w:pPr>
       <w:r>
@@ -1815,7 +1894,12 @@
     </w:p>
     <w:p>
       <w:pPr>
-        <w:spacing w:before="480" w:after="240" w:line="360" w:lineRule="auto"/>
+        <w:spacing w:after="360"/>
+      </w:pPr>
+    </w:p>
+    <w:p>
+      <w:pPr>
+        <w:spacing w:after="480"/>
         <w:jc w:val="center"/>
       </w:pPr>
       <w:r>
@@ -1829,7 +1913,8 @@
     </w:p>
     <w:p>
       <w:pPr>
-        <w:spacing w:before="120" w:after="200" w:line="240" w:lineRule="auto"/>
+        <w:spacing w:after="480"/>
+        <w:ind w:left="0"/>
         <w:jc w:val="right"/>
       </w:pPr>
       <w:r>
@@ -1844,7 +1929,6 @@
       <w:r>
         <w:rPr>
           <w:rFonts w:ascii="Times New Roman" w:hAnsi="Times New Roman"/>
-          <w:b w:val="0"/>
           <w:sz w:val="24"/>
         </w:rPr>
         <w:t>Alrifaai Alrifaaie, Amaal</w:t>
@@ -1853,25 +1937,23 @@
       <w:r>
         <w:rPr>
           <w:rFonts w:ascii="Times New Roman" w:hAnsi="Times New Roman"/>
-          <w:b w:val="0"/>
           <w:sz w:val="24"/>
         </w:rPr>
-        <w:t>C.I.: V-31.985.792</w:t>
+        <w:t>C.I.: 31.985.792</w:t>
         <w:br/>
       </w:r>
       <w:r>
         <w:rPr>
           <w:rFonts w:ascii="Times New Roman" w:hAnsi="Times New Roman"/>
-          <w:b/>
           <w:sz w:val="24"/>
         </w:rPr>
-        <w:t>2026, agosto</w:t>
+        <w:t>agosto de 2026</w:t>
       </w:r>
     </w:p>
     <w:p>
       <w:bookmarkStart w:id="bm_resumen" w:name="bm_resumen"/>
       <w:pPr>
-        <w:spacing w:before="0" w:after="160"/>
+        <w:spacing w:before="480" w:after="480"/>
         <w:jc w:val="center"/>
       </w:pPr>
       <w:r>
@@ -1886,8 +1968,20 @@
     </w:p>
     <w:p>
       <w:pPr>
-        <w:spacing w:line="240" w:lineRule="auto" w:after="0" w:before="0"/>
-        <w:ind w:firstLine="0"/>
+        <w:sectPr>
+          <w:footerReference w:type="default" r:id="rId30"/>
+          <w:pgSz w:w="12240" w:h="15840"/>
+          <w:pgMar w:top="1701" w:right="1701" w:bottom="1701" w:left="2268" w:header="720" w:footer="720" w:gutter="0"/>
+          <w:cols w:space="720"/>
+          <w:titlePg/>
+          <w:docGrid w:linePitch="360"/>
+        </w:sectPr>
+      </w:pPr>
+    </w:p>
+    <w:p>
+      <w:pPr>
+        <w:spacing w:line="360" w:lineRule="auto" w:after="0" w:before="0"/>
+        <w:ind w:firstLine="709"/>
         <w:jc w:val="both"/>
       </w:pPr>
       <w:r>
@@ -1899,24 +1993,18 @@
         <w:t>El presente informe recoge las actividades desarrolladas durante diez (10) semanas de pasantías profesionales en Ingeniería de Telecomunicaciones, C.A. (IDETEL), con una primera etapa de rotación por Atención al Cliente y una segunda etapa de apoyo en el área de Administración. Durante la práctica se observó el recorrido de solicitudes de afiliación e incidencias, el registro de pagos, la facturación, el seguimiento de casos y la elaboración de reportes administrativos. La situación problemática se relaciona con la ausencia de un procedimiento formalizado y unificado para controlar las solicitudes desde su recepción hasta el cierre, lo que dificulta conocer responsables, tiempos y estatus de cada caso. El objetivo general fue evaluar el control administrativo aplicado a la gestión de solicitudes de servicios de telecomunicaciones para identificar debilidades y formular mejoras. Se realizaron observaciones directas, revisión de registros, entrevistas estructuradas al personal y un análisis causa-efecto de las fallas detectadas. Posteriormente se diseñó un flujo estandarizado, formatos de control y criterios de seguimiento mediante indicadores básicos. Se concluye que la principal necesidad consiste en formalizar el recorrido de las solicitudes y centralizar la información necesaria para su seguimiento. Se recomienda implementar progresivamente el procedimiento propuesto, asignar responsables por etapa y revisar periódicamente los tiempos de respuesta para detectar desviaciones y oportunidades de mejora.</w:t>
       </w:r>
     </w:p>
+    <w:p/>
     <w:p>
       <w:pPr>
-        <w:spacing w:line="240" w:lineRule="auto" w:before="160"/>
-        <w:ind w:firstLine="0"/>
+        <w:ind w:firstLine="709"/>
       </w:pPr>
       <w:r>
         <w:rPr>
-          <w:rFonts w:ascii="Times New Roman" w:hAnsi="Times New Roman"/>
           <w:b/>
-          <w:sz w:val="24"/>
         </w:rPr>
         <w:t xml:space="preserve">Palabras claves: </w:t>
       </w:r>
       <w:r>
-        <w:rPr>
-          <w:rFonts w:ascii="Times New Roman" w:hAnsi="Times New Roman"/>
-          <w:sz w:val="24"/>
-        </w:rPr>
         <w:t>control administrativo, solicitudes de servicio, trazabilidad, telecomunicaciones, pasantías</w:t>
       </w:r>
     </w:p>
@@ -1924,19 +2012,19 @@
       <w:pPr>
         <w:sectPr>
           <w:footerReference w:type="default" r:id="rId31"/>
-          <w:footerReference w:type="first" r:id="rId32"/>
+          <w:type w:val="continuous"/>
           <w:pgSz w:w="12240" w:h="15840"/>
           <w:pgMar w:top="1701" w:right="1701" w:bottom="1701" w:left="2268" w:header="720" w:footer="720" w:gutter="0"/>
           <w:cols w:space="720"/>
+          <w:titlePg/>
           <w:docGrid w:linePitch="360"/>
-          <w:pgNumType w:fmt="lowerRoman"/>
         </w:sectPr>
       </w:pPr>
     </w:p>
     <w:p>
       <w:bookmarkStart w:id="bm_introduccion" w:name="bm_introduccion"/>
       <w:pPr>
-        <w:spacing w:before="1140" w:after="480" w:line="360" w:lineRule="auto"/>
+        <w:spacing w:before="1140" w:after="480"/>
         <w:jc w:val="center"/>
       </w:pPr>
       <w:r>
@@ -1951,6 +2039,18 @@
     </w:p>
     <w:p>
       <w:pPr>
+        <w:sectPr>
+          <w:footerReference w:type="default" r:id="rId32"/>
+          <w:pgSz w:w="12240" w:h="15840"/>
+          <w:pgMar w:top="1701" w:right="1701" w:bottom="1701" w:left="2268" w:header="720" w:footer="720" w:gutter="0"/>
+          <w:cols w:space="720"/>
+          <w:titlePg/>
+          <w:docGrid w:linePitch="360"/>
+        </w:sectPr>
+      </w:pPr>
+    </w:p>
+    <w:p>
+      <w:pPr>
         <w:spacing w:line="360" w:lineRule="auto" w:after="0" w:before="0"/>
         <w:ind w:firstLine="709"/>
         <w:jc w:val="both"/>
@@ -2013,19 +2113,18 @@
       <w:pPr>
         <w:sectPr>
           <w:footerReference w:type="default" r:id="rId33"/>
-          <w:footerReference w:type="first" r:id="rId34"/>
+          <w:type w:val="continuous"/>
           <w:pgSz w:w="12240" w:h="15840"/>
           <w:pgMar w:top="1701" w:right="1701" w:bottom="1701" w:left="2268" w:header="720" w:footer="720" w:gutter="0"/>
           <w:cols w:space="720"/>
           <w:titlePg/>
           <w:docGrid w:linePitch="360"/>
-          <w:pgNumType w:start="1" w:fmt="decimal"/>
         </w:sectPr>
       </w:pPr>
     </w:p>
     <w:p>
       <w:pPr>
-        <w:spacing w:before="1140" w:after="480" w:line="360" w:lineRule="auto"/>
+        <w:spacing w:before="1140" w:after="480"/>
         <w:jc w:val="center"/>
       </w:pPr>
       <w:r>
@@ -2040,7 +2139,7 @@
     <w:p>
       <w:bookmarkStart w:id="bm_cap1" w:name="bm_cap1"/>
       <w:pPr>
-        <w:spacing w:before="0" w:after="480" w:line="360" w:lineRule="auto"/>
+        <w:spacing w:before="480"/>
         <w:jc w:val="center"/>
       </w:pPr>
       <w:r>
@@ -2052,6 +2151,18 @@
         <w:t>REALIDAD ORGANIZACIONAL</w:t>
       </w:r>
       <w:bookmarkEnd w:id="bm_cap1"/>
+    </w:p>
+    <w:p>
+      <w:pPr>
+        <w:sectPr>
+          <w:footerReference w:type="default" r:id="rId34"/>
+          <w:pgSz w:w="12240" w:h="15840"/>
+          <w:pgMar w:top="1701" w:right="1701" w:bottom="1701" w:left="2268" w:header="720" w:footer="720" w:gutter="0"/>
+          <w:cols w:space="720"/>
+          <w:titlePg/>
+          <w:docGrid w:linePitch="360"/>
+        </w:sectPr>
+      </w:pPr>
     </w:p>
     <w:p>
       <w:bookmarkStart w:id="bm_cap1_ident" w:name="bm_cap1_ident"/>
@@ -2470,6 +2581,106 @@
       </w:r>
     </w:p>
     <w:p>
+      <w:pPr>
+        <w:spacing w:before="480"/>
+        <w:jc w:val="center"/>
+      </w:pPr>
+      <w:r>
+        <w:drawing>
+          <wp:inline xmlns:a="http://schemas.openxmlformats.org/drawingml/2006/main" xmlns:pic="http://schemas.openxmlformats.org/drawingml/2006/picture">
+            <wp:extent cx="1512000" cy="1512000"/>
+            <wp:docPr id="3" name="Picture 3"/>
+            <wp:cNvGraphicFramePr>
+              <a:graphicFrameLocks noChangeAspect="1"/>
+            </wp:cNvGraphicFramePr>
+            <a:graphic>
+              <a:graphicData uri="http://schemas.openxmlformats.org/drawingml/2006/picture">
+                <pic:pic>
+                  <pic:nvPicPr>
+                    <pic:cNvPr id="0" name="logo.jpg"/>
+                    <pic:cNvPicPr/>
+                  </pic:nvPicPr>
+                  <pic:blipFill>
+                    <a:blip r:embed="rId11"/>
+                    <a:stretch>
+                      <a:fillRect/>
+                    </a:stretch>
+                  </pic:blipFill>
+                  <pic:spPr>
+                    <a:xfrm>
+                      <a:off x="0" y="0"/>
+                      <a:ext cx="1512000" cy="1512000"/>
+                    </a:xfrm>
+                    <a:prstGeom prst="rect"/>
+                  </pic:spPr>
+                </pic:pic>
+              </a:graphicData>
+            </a:graphic>
+          </wp:inline>
+        </w:drawing>
+      </w:r>
+    </w:p>
+    <w:p>
+      <w:bookmarkStart w:id="bm_grafico1" w:name="bm_grafico1"/>
+      <w:pPr>
+        <w:spacing w:before="120" w:after="480"/>
+        <w:jc w:val="center"/>
+      </w:pPr>
+      <w:r>
+        <w:rPr>
+          <w:rFonts w:ascii="Times New Roman" w:hAnsi="Times New Roman"/>
+          <w:i/>
+          <w:sz w:val="24"/>
+        </w:rPr>
+        <w:t xml:space="preserve">Gráfico 1. </w:t>
+      </w:r>
+      <w:r>
+        <w:rPr>
+          <w:rFonts w:ascii="Times New Roman" w:hAnsi="Times New Roman"/>
+          <w:b/>
+          <w:sz w:val="24"/>
+        </w:rPr>
+        <w:t>Logotipo de Ingeniería de Telecomunicaciones, C.A.</w:t>
+      </w:r>
+      <w:bookmarkEnd w:id="bm_grafico1"/>
+    </w:p>
+    <w:p>
+      <w:pPr>
+        <w:spacing w:before="0" w:after="240"/>
+        <w:jc w:val="center"/>
+      </w:pPr>
+      <w:r>
+        <w:rPr>
+          <w:rFonts w:ascii="Times New Roman" w:hAnsi="Times New Roman"/>
+          <w:i/>
+          <w:sz w:val="24"/>
+        </w:rPr>
+        <w:t xml:space="preserve">Fuente: </w:t>
+      </w:r>
+      <w:r>
+        <w:rPr>
+          <w:rFonts w:ascii="Times New Roman" w:hAnsi="Times New Roman"/>
+          <w:sz w:val="24"/>
+        </w:rPr>
+        <w:t>Ingeniería de Telecomunicaciones, C.A. (2026).</w:t>
+      </w:r>
+    </w:p>
+    <w:p>
+      <w:pPr>
+        <w:spacing w:line="360" w:lineRule="auto" w:after="0" w:before="0"/>
+        <w:ind w:firstLine="709"/>
+        <w:jc w:val="both"/>
+      </w:pPr>
+      <w:r>
+        <w:rPr>
+          <w:rFonts w:ascii="Times New Roman" w:hAnsi="Times New Roman"/>
+          <w:i w:val="0"/>
+          <w:sz w:val="24"/>
+        </w:rPr>
+        <w:t>El logotipo identifica visualmente a Ingeniería de Telecomunicaciones, C.A. y representa la imagen institucional de la empresa donde se desarrolló la pasantía profesional en las áreas de Atención al Cliente y Administración.</w:t>
+      </w:r>
+    </w:p>
+    <w:p>
       <w:bookmarkStart w:id="bm_cap1_ubic" w:name="bm_cap1_ubic"/>
       <w:pPr>
         <w:spacing w:before="480" w:after="480" w:line="360" w:lineRule="auto"/>
@@ -2509,7 +2720,7 @@
         <w:drawing>
           <wp:inline xmlns:a="http://schemas.openxmlformats.org/drawingml/2006/main" xmlns:pic="http://schemas.openxmlformats.org/drawingml/2006/picture">
             <wp:extent cx="1800000" cy="1125000"/>
-            <wp:docPr id="3" name="Picture 3"/>
+            <wp:docPr id="4" name="Picture 4"/>
             <wp:cNvGraphicFramePr>
               <a:graphicFrameLocks noChangeAspect="1"/>
             </wp:cNvGraphicFramePr>
@@ -2521,7 +2732,7 @@
                     <pic:cNvPicPr/>
                   </pic:nvPicPr>
                   <pic:blipFill>
-                    <a:blip r:embed="rId11"/>
+                    <a:blip r:embed="rId12"/>
                     <a:stretch>
                       <a:fillRect/>
                     </a:stretch>
@@ -2541,7 +2752,7 @@
       </w:r>
     </w:p>
     <w:p>
-      <w:bookmarkStart w:id="bm_grafico1" w:name="bm_grafico1"/>
+      <w:bookmarkStart w:id="bm_grafico2" w:name="bm_grafico2"/>
       <w:pPr>
         <w:spacing w:before="120" w:after="480"/>
         <w:jc w:val="center"/>
@@ -2550,19 +2761,19 @@
         <w:rPr>
           <w:rFonts w:ascii="Times New Roman" w:hAnsi="Times New Roman"/>
           <w:i/>
-          <w:sz w:val="20"/>
+          <w:sz w:val="24"/>
         </w:rPr>
-        <w:t xml:space="preserve">Gráfico 1. </w:t>
+        <w:t xml:space="preserve">Gráfico 2. </w:t>
       </w:r>
       <w:r>
         <w:rPr>
           <w:rFonts w:ascii="Times New Roman" w:hAnsi="Times New Roman"/>
           <w:b/>
-          <w:sz w:val="20"/>
+          <w:sz w:val="24"/>
         </w:rPr>
         <w:t>Representación cartográfica y ubicación espacial de Ingeniería de Telecomunicaciones, C.A.</w:t>
       </w:r>
-      <w:bookmarkEnd w:id="bm_grafico1"/>
+      <w:bookmarkEnd w:id="bm_grafico2"/>
     </w:p>
     <w:p>
       <w:bookmarkStart w:id="bm_cap1_pobla" w:name="bm_cap1_pobla"/>
@@ -2638,7 +2849,7 @@
           <w:i w:val="0"/>
           <w:sz w:val="24"/>
         </w:rPr>
-        <w:t>La estructura organizativa de Ingeniería de Telecomunicaciones, C.A. es de tipo vertical y articula los niveles directivos, administrativos, comerciales y técnicos. A la cabeza se encuentra la Presidencia, seguida de la Gerencia General y Operaciones. A continuación se presentan el organigrama general de la empresa y el organigrama del área administrativa vinculada con la pasantía.</w:t>
+        <w:t>La estructura organizativa de Ingeniería de Telecomunicaciones, C.A. es de tipo vertical, diseñada para garantizar una comunicación fluida entre los niveles directivos y operativos. A la cabeza se encuentra la Presidencia, seguida de la Gerencia General y Operaciones, de la cual se desprenden los departamentos de Supervisión de Administración, Contabilidad y Tributos, Supervisión Comercial, Área de Internet, Supervisión del NOC (Network Operations Center) y Mantenimiento de Radiocomunicación. Se presenta a continuación el organigrama general de la empresa y del Departamento de Administración.</w:t>
       </w:r>
     </w:p>
     <w:p>
@@ -2650,7 +2861,7 @@
         <w:drawing>
           <wp:inline xmlns:a="http://schemas.openxmlformats.org/drawingml/2006/main" xmlns:pic="http://schemas.openxmlformats.org/drawingml/2006/picture">
             <wp:extent cx="4320000" cy="1847904"/>
-            <wp:docPr id="4" name="Picture 4"/>
+            <wp:docPr id="5" name="Picture 5"/>
             <wp:cNvGraphicFramePr>
               <a:graphicFrameLocks noChangeAspect="1"/>
             </wp:cNvGraphicFramePr>
@@ -2662,7 +2873,7 @@
                     <pic:cNvPicPr/>
                   </pic:nvPicPr>
                   <pic:blipFill>
-                    <a:blip r:embed="rId12"/>
+                    <a:blip r:embed="rId13"/>
                     <a:stretch>
                       <a:fillRect/>
                     </a:stretch>
@@ -2682,7 +2893,7 @@
       </w:r>
     </w:p>
     <w:p>
-      <w:bookmarkStart w:id="bm_grafico2" w:name="bm_grafico2"/>
+      <w:bookmarkStart w:id="bm_grafico3" w:name="bm_grafico3"/>
       <w:pPr>
         <w:spacing w:before="120" w:after="480"/>
         <w:jc w:val="center"/>
@@ -2691,19 +2902,19 @@
         <w:rPr>
           <w:rFonts w:ascii="Times New Roman" w:hAnsi="Times New Roman"/>
           <w:i/>
-          <w:sz w:val="20"/>
+          <w:sz w:val="24"/>
         </w:rPr>
-        <w:t xml:space="preserve">Gráfico 2. </w:t>
+        <w:t xml:space="preserve">Gráfico 3. </w:t>
       </w:r>
       <w:r>
         <w:rPr>
           <w:rFonts w:ascii="Times New Roman" w:hAnsi="Times New Roman"/>
           <w:b/>
-          <w:sz w:val="20"/>
+          <w:sz w:val="24"/>
         </w:rPr>
         <w:t>Organigrama estructural y niveles jerárquicos de Ingeniería de Telecomunicaciones, C.A.</w:t>
       </w:r>
-      <w:bookmarkEnd w:id="bm_grafico2"/>
+      <w:bookmarkEnd w:id="bm_grafico3"/>
     </w:p>
     <w:p>
       <w:pPr>
@@ -2714,7 +2925,7 @@
         <w:drawing>
           <wp:inline xmlns:a="http://schemas.openxmlformats.org/drawingml/2006/main" xmlns:pic="http://schemas.openxmlformats.org/drawingml/2006/picture">
             <wp:extent cx="4320000" cy="2680292"/>
-            <wp:docPr id="5" name="Picture 5"/>
+            <wp:docPr id="6" name="Picture 6"/>
             <wp:cNvGraphicFramePr>
               <a:graphicFrameLocks noChangeAspect="1"/>
             </wp:cNvGraphicFramePr>
@@ -2726,7 +2937,7 @@
                     <pic:cNvPicPr/>
                   </pic:nvPicPr>
                   <pic:blipFill>
-                    <a:blip r:embed="rId13"/>
+                    <a:blip r:embed="rId14"/>
                     <a:stretch>
                       <a:fillRect/>
                     </a:stretch>
@@ -2746,7 +2957,7 @@
       </w:r>
     </w:p>
     <w:p>
-      <w:bookmarkStart w:id="bm_grafico3" w:name="bm_grafico3"/>
+      <w:bookmarkStart w:id="bm_grafico4" w:name="bm_grafico4"/>
       <w:pPr>
         <w:spacing w:before="120" w:after="480"/>
         <w:jc w:val="center"/>
@@ -2755,84 +2966,37 @@
         <w:rPr>
           <w:rFonts w:ascii="Times New Roman" w:hAnsi="Times New Roman"/>
           <w:i/>
-          <w:sz w:val="20"/>
+          <w:sz w:val="24"/>
         </w:rPr>
-        <w:t xml:space="preserve">Gráfico 3. </w:t>
+        <w:t xml:space="preserve">Gráfico 4. </w:t>
       </w:r>
-      <w:r>
-        <w:rPr>
-          <w:rFonts w:ascii="Times New Roman" w:hAnsi="Times New Roman"/>
-          <w:b/>
-          <w:sz w:val="20"/>
-        </w:rPr>
-        <w:t>Organigrama del Departamento de Administración.</w:t>
-      </w:r>
-      <w:bookmarkEnd w:id="bm_grafico3"/>
-    </w:p>
-    <w:p>
-      <w:bookmarkStart w:id="bm_cap1_depto" w:name="bm_cap1_depto"/>
-      <w:pPr>
-        <w:spacing w:before="480" w:after="480" w:line="360" w:lineRule="auto"/>
-        <w:jc w:val="left"/>
-      </w:pPr>
       <w:r>
         <w:rPr>
           <w:rFonts w:ascii="Times New Roman" w:hAnsi="Times New Roman"/>
           <w:b/>
           <w:sz w:val="24"/>
         </w:rPr>
-        <w:t>Descripción del departamento donde realizó la pasantía</w:t>
+        <w:t>Organigrama del Departamento de Administración.</w:t>
       </w:r>
-      <w:bookmarkEnd w:id="bm_cap1_depto"/>
+      <w:bookmarkEnd w:id="bm_grafico4"/>
     </w:p>
     <w:p>
       <w:pPr>
-        <w:spacing w:line="360" w:lineRule="auto" w:after="0" w:before="0"/>
-        <w:ind w:firstLine="709"/>
-        <w:jc w:val="both"/>
-      </w:pPr>
-      <w:r>
-        <w:rPr>
-          <w:rFonts w:ascii="Times New Roman" w:hAnsi="Times New Roman"/>
-          <w:i w:val="0"/>
-          <w:sz w:val="24"/>
-        </w:rPr>
-        <w:t>La experiencia de pasantía comprendió una rotación inicial por Atención al Cliente durante las primeras tres semanas y, posteriormente, la incorporación al área de Administración. Esta secuencia permitió conocer el recorrido de las solicitudes desde el contacto inicial con el suscriptor hasta su tratamiento administrativo y coordinación con las unidades técnicas.</w:t>
-      </w:r>
-    </w:p>
-    <w:p>
-      <w:pPr>
-        <w:spacing w:line="360" w:lineRule="auto" w:after="0" w:before="0"/>
-        <w:ind w:firstLine="709"/>
-        <w:jc w:val="both"/>
-      </w:pPr>
-      <w:r>
-        <w:rPr>
-          <w:rFonts w:ascii="Times New Roman" w:hAnsi="Times New Roman"/>
-          <w:i w:val="0"/>
-          <w:sz w:val="24"/>
-        </w:rPr>
-        <w:t>En el ámbito administrativo se observaron funciones relacionadas con Supervisión de Administración, Contabilidad y Tributos; Compras y Facturación; y Atención al Cliente. Las actividades incluyeron recepción y registro de solicitudes, revisión de recaudos, seguimiento de incidencias y afiliaciones, apoyo en facturación y archivo, así como coordinación de información con otras áreas de IDETEL.</w:t>
-      </w:r>
-    </w:p>
-    <w:p>
-      <w:pPr>
         <w:sectPr>
           <w:footerReference w:type="default" r:id="rId35"/>
-          <w:footerReference w:type="first" r:id="rId36"/>
+          <w:type w:val="continuous"/>
           <w:pgSz w:w="12240" w:h="15840"/>
           <w:pgMar w:top="1701" w:right="1701" w:bottom="1701" w:left="2268" w:header="720" w:footer="720" w:gutter="0"/>
           <w:cols w:space="720"/>
           <w:titlePg/>
           <w:docGrid w:linePitch="360"/>
-          <w:pgNumType w:fmt="decimal"/>
         </w:sectPr>
       </w:pPr>
     </w:p>
     <w:p>
       <w:bookmarkStart w:id="bm_referencias" w:name="bm_referencias"/>
       <w:pPr>
-        <w:spacing w:before="1140" w:after="480" w:line="360" w:lineRule="auto"/>
+        <w:spacing w:before="1140" w:after="480"/>
         <w:jc w:val="center"/>
       </w:pPr>
       <w:r>
@@ -2847,282 +3011,157 @@
     </w:p>
     <w:p>
       <w:pPr>
-        <w:spacing w:before="480" w:after="0"/>
-      </w:pPr>
-    </w:p>
-    <w:p>
-      <w:pPr>
-        <w:spacing w:line="240" w:lineRule="auto" w:after="480" w:before="0"/>
-        <w:ind w:left="425" w:hanging="425"/>
-        <w:jc w:val="both"/>
-      </w:pPr>
-      <w:r>
-        <w:rPr>
-          <w:rFonts w:ascii="Times New Roman" w:hAnsi="Times New Roman"/>
-          <w:b w:val="0"/>
-          <w:sz w:val="24"/>
-        </w:rPr>
-        <w:t xml:space="preserve">Arias, F. (2012). </w:t>
-      </w:r>
-      <w:r>
-        <w:rPr>
-          <w:rFonts w:ascii="Times New Roman" w:hAnsi="Times New Roman"/>
-          <w:b/>
-          <w:sz w:val="24"/>
-        </w:rPr>
-        <w:t>El proyecto de investigación: Introducción a la metodología científica (6ta ed.)</w:t>
-      </w:r>
-      <w:r>
-        <w:rPr>
-          <w:rFonts w:ascii="Times New Roman" w:hAnsi="Times New Roman"/>
-          <w:b w:val="0"/>
-          <w:sz w:val="24"/>
-        </w:rPr>
-        <w:t>. Episteme, Venezuela.</w:t>
-      </w:r>
-    </w:p>
-    <w:p>
-      <w:pPr>
-        <w:spacing w:line="240" w:lineRule="auto" w:after="480" w:before="0"/>
-        <w:ind w:left="425" w:hanging="425"/>
-        <w:jc w:val="both"/>
-      </w:pPr>
-      <w:r>
-        <w:rPr>
-          <w:rFonts w:ascii="Times New Roman" w:hAnsi="Times New Roman"/>
-          <w:b w:val="0"/>
-          <w:sz w:val="24"/>
-        </w:rPr>
-        <w:t xml:space="preserve">Chiavenato, I. (2006). </w:t>
-      </w:r>
-      <w:r>
-        <w:rPr>
-          <w:rFonts w:ascii="Times New Roman" w:hAnsi="Times New Roman"/>
-          <w:b/>
-          <w:sz w:val="24"/>
-        </w:rPr>
-        <w:t>Introducción a la teoría general de la administración (7ma ed.)</w:t>
-      </w:r>
-      <w:r>
-        <w:rPr>
-          <w:rFonts w:ascii="Times New Roman" w:hAnsi="Times New Roman"/>
-          <w:b w:val="0"/>
-          <w:sz w:val="24"/>
-        </w:rPr>
-        <w:t>. McGraw-Hill, México.</w:t>
-      </w:r>
-    </w:p>
-    <w:p>
-      <w:pPr>
-        <w:spacing w:line="240" w:lineRule="auto" w:after="480" w:before="0"/>
-        <w:ind w:left="425" w:hanging="425"/>
-        <w:jc w:val="both"/>
-      </w:pPr>
-      <w:r>
-        <w:rPr>
-          <w:rFonts w:ascii="Times New Roman" w:hAnsi="Times New Roman"/>
-          <w:b w:val="0"/>
-          <w:sz w:val="24"/>
-        </w:rPr>
-        <w:t xml:space="preserve">Harrington, H. J. (1993). </w:t>
-      </w:r>
-      <w:r>
-        <w:rPr>
-          <w:rFonts w:ascii="Times New Roman" w:hAnsi="Times New Roman"/>
-          <w:b/>
-          <w:sz w:val="24"/>
-        </w:rPr>
-        <w:t>Mejoramiento de los procesos de la empresa</w:t>
-      </w:r>
-      <w:r>
-        <w:rPr>
-          <w:rFonts w:ascii="Times New Roman" w:hAnsi="Times New Roman"/>
-          <w:b w:val="0"/>
-          <w:sz w:val="24"/>
-        </w:rPr>
-        <w:t>. McGraw-Hill, Colombia.</w:t>
-      </w:r>
-    </w:p>
-    <w:p>
-      <w:pPr>
-        <w:spacing w:line="240" w:lineRule="auto" w:after="480" w:before="0"/>
-        <w:ind w:left="425" w:hanging="425"/>
-        <w:jc w:val="both"/>
-      </w:pPr>
-      <w:r>
-        <w:rPr>
-          <w:rFonts w:ascii="Times New Roman" w:hAnsi="Times New Roman"/>
-          <w:b w:val="0"/>
-          <w:sz w:val="24"/>
-        </w:rPr>
-        <w:t xml:space="preserve">Laudon, K., y Laudon, J. (2016). </w:t>
-      </w:r>
-      <w:r>
-        <w:rPr>
-          <w:rFonts w:ascii="Times New Roman" w:hAnsi="Times New Roman"/>
-          <w:b/>
-          <w:sz w:val="24"/>
-        </w:rPr>
-        <w:t>Sistemas de información gerencial (14va ed.)</w:t>
-      </w:r>
-      <w:r>
-        <w:rPr>
-          <w:rFonts w:ascii="Times New Roman" w:hAnsi="Times New Roman"/>
-          <w:b w:val="0"/>
-          <w:sz w:val="24"/>
-        </w:rPr>
-        <w:t>. Pearson Educación, México.</w:t>
-      </w:r>
-    </w:p>
-    <w:p>
-      <w:pPr>
-        <w:spacing w:line="240" w:lineRule="auto" w:after="480" w:before="0"/>
-        <w:ind w:left="425" w:hanging="425"/>
-        <w:jc w:val="both"/>
-      </w:pPr>
-      <w:r>
-        <w:rPr>
-          <w:rFonts w:ascii="Times New Roman" w:hAnsi="Times New Roman"/>
-          <w:b w:val="0"/>
-          <w:sz w:val="24"/>
-        </w:rPr>
-        <w:t xml:space="preserve">Parasuraman, A., Zeithaml, V., y Berry, L. (1988). </w:t>
-      </w:r>
-      <w:r>
-        <w:rPr>
-          <w:rFonts w:ascii="Times New Roman" w:hAnsi="Times New Roman"/>
-          <w:b/>
-          <w:sz w:val="24"/>
-        </w:rPr>
-        <w:t>SERVQUAL: A multiple-item scale for measuring consumer perceptions of service quality</w:t>
-      </w:r>
-      <w:r>
-        <w:rPr>
-          <w:rFonts w:ascii="Times New Roman" w:hAnsi="Times New Roman"/>
-          <w:b w:val="0"/>
-          <w:sz w:val="24"/>
-        </w:rPr>
-        <w:t>. Journal of Retailing, 64(1), 12-40.</w:t>
-      </w:r>
-    </w:p>
-    <w:p>
-      <w:pPr>
-        <w:spacing w:line="240" w:lineRule="auto" w:after="480" w:before="0"/>
-        <w:ind w:left="425" w:hanging="425"/>
-        <w:jc w:val="both"/>
-      </w:pPr>
-      <w:r>
-        <w:rPr>
-          <w:rFonts w:ascii="Times New Roman" w:hAnsi="Times New Roman"/>
-          <w:b w:val="0"/>
-          <w:sz w:val="24"/>
-        </w:rPr>
-        <w:t xml:space="preserve">Robbins, S., y Coulter, M. (2010). </w:t>
-      </w:r>
-      <w:r>
-        <w:rPr>
-          <w:rFonts w:ascii="Times New Roman" w:hAnsi="Times New Roman"/>
-          <w:b/>
-          <w:sz w:val="24"/>
-        </w:rPr>
-        <w:t>Administración (10ma ed.)</w:t>
-      </w:r>
-      <w:r>
-        <w:rPr>
-          <w:rFonts w:ascii="Times New Roman" w:hAnsi="Times New Roman"/>
-          <w:b w:val="0"/>
-          <w:sz w:val="24"/>
-        </w:rPr>
-        <w:t>. Pearson Educación, México.</w:t>
-      </w:r>
-    </w:p>
-    <w:p>
-      <w:pPr>
-        <w:spacing w:line="240" w:lineRule="auto" w:after="480" w:before="0"/>
-        <w:ind w:left="425" w:hanging="425"/>
-        <w:jc w:val="both"/>
-      </w:pPr>
-      <w:r>
-        <w:rPr>
-          <w:rFonts w:ascii="Times New Roman" w:hAnsi="Times New Roman"/>
-          <w:b w:val="0"/>
-          <w:sz w:val="24"/>
-        </w:rPr>
-        <w:t xml:space="preserve">Universidad Pedagógica Experimental Libertador. (2016). </w:t>
-      </w:r>
-      <w:r>
-        <w:rPr>
-          <w:rFonts w:ascii="Times New Roman" w:hAnsi="Times New Roman"/>
-          <w:b/>
-          <w:sz w:val="24"/>
-        </w:rPr>
-        <w:t>Manual de trabajos de grado de especialización y maestría y tesis doctorales (5ta ed.)</w:t>
-      </w:r>
-      <w:r>
-        <w:rPr>
-          <w:rFonts w:ascii="Times New Roman" w:hAnsi="Times New Roman"/>
-          <w:b w:val="0"/>
-          <w:sz w:val="24"/>
-        </w:rPr>
-        <w:t>. FEDUPEL, Venezuela.</w:t>
-      </w:r>
-    </w:p>
-    <w:p>
-      <w:pPr>
-        <w:spacing w:line="240" w:lineRule="auto" w:after="480" w:before="0"/>
-        <w:ind w:left="425" w:hanging="425"/>
-        <w:jc w:val="both"/>
-      </w:pPr>
-      <w:r>
-        <w:rPr>
-          <w:rFonts w:ascii="Times New Roman" w:hAnsi="Times New Roman"/>
-          <w:b w:val="0"/>
-          <w:sz w:val="24"/>
-        </w:rPr>
-        <w:t xml:space="preserve">Zeithaml, V., Parasuraman, A., y Berry, L. (1993). </w:t>
-      </w:r>
-      <w:r>
-        <w:rPr>
-          <w:rFonts w:ascii="Times New Roman" w:hAnsi="Times New Roman"/>
-          <w:b/>
-          <w:sz w:val="24"/>
-        </w:rPr>
-        <w:t>Calidad total en la gestión de servicios</w:t>
-      </w:r>
-      <w:r>
-        <w:rPr>
-          <w:rFonts w:ascii="Times New Roman" w:hAnsi="Times New Roman"/>
-          <w:b w:val="0"/>
-          <w:sz w:val="24"/>
-        </w:rPr>
-        <w:t>. Díaz de Santos, España.</w:t>
-      </w:r>
-    </w:p>
-    <w:p>
-      <w:pPr>
         <w:sectPr>
-          <w:footerReference w:type="default" r:id="rId37"/>
-          <w:footerReference w:type="first" r:id="rId38"/>
+          <w:footerReference w:type="default" r:id="rId36"/>
           <w:pgSz w:w="12240" w:h="15840"/>
           <w:pgMar w:top="1701" w:right="1701" w:bottom="1701" w:left="2268" w:header="720" w:footer="720" w:gutter="0"/>
           <w:cols w:space="720"/>
           <w:titlePg/>
           <w:docGrid w:linePitch="360"/>
-          <w:pgNumType w:fmt="decimal"/>
+        </w:sectPr>
+      </w:pPr>
+    </w:p>
+    <w:p>
+      <w:pPr>
+        <w:spacing w:before="480" w:after="0"/>
+      </w:pPr>
+    </w:p>
+    <w:p>
+      <w:pPr>
+        <w:spacing w:line="240" w:lineRule="auto" w:after="480" w:before="0"/>
+        <w:ind w:left="425" w:hanging="425"/>
+        <w:jc w:val="both"/>
+      </w:pPr>
+      <w:r>
+        <w:rPr>
+          <w:rFonts w:ascii="Times New Roman" w:hAnsi="Times New Roman"/>
+          <w:sz w:val="24"/>
+        </w:rPr>
+        <w:t>Arias, F. (2012). El proyecto de investigación: Introducción a la metodología científica (6ta ed.). Episteme, Venezuela.</w:t>
+      </w:r>
+    </w:p>
+    <w:p>
+      <w:pPr>
+        <w:spacing w:line="240" w:lineRule="auto" w:after="480" w:before="0"/>
+        <w:ind w:left="425" w:hanging="425"/>
+        <w:jc w:val="both"/>
+      </w:pPr>
+      <w:r>
+        <w:rPr>
+          <w:rFonts w:ascii="Times New Roman" w:hAnsi="Times New Roman"/>
+          <w:sz w:val="24"/>
+        </w:rPr>
+        <w:t>Chiavenato, I. (2006). Introducción a la teoría general de la administración (7ma ed.). McGraw-Hill, México.</w:t>
+      </w:r>
+    </w:p>
+    <w:p>
+      <w:pPr>
+        <w:spacing w:line="240" w:lineRule="auto" w:after="480" w:before="0"/>
+        <w:ind w:left="425" w:hanging="425"/>
+        <w:jc w:val="both"/>
+      </w:pPr>
+      <w:r>
+        <w:rPr>
+          <w:rFonts w:ascii="Times New Roman" w:hAnsi="Times New Roman"/>
+          <w:sz w:val="24"/>
+        </w:rPr>
+        <w:t>Harrington, H. J. (1993). Mejoramiento de los procesos de la empresa. McGraw-Hill, Colombia.</w:t>
+      </w:r>
+    </w:p>
+    <w:p>
+      <w:pPr>
+        <w:spacing w:line="240" w:lineRule="auto" w:after="480" w:before="0"/>
+        <w:ind w:left="425" w:hanging="425"/>
+        <w:jc w:val="both"/>
+      </w:pPr>
+      <w:r>
+        <w:rPr>
+          <w:rFonts w:ascii="Times New Roman" w:hAnsi="Times New Roman"/>
+          <w:sz w:val="24"/>
+        </w:rPr>
+        <w:t>Laudon, K., y Laudon, J. (2016). Sistemas de información gerencial (14va ed.). Pearson Educación, México.</w:t>
+      </w:r>
+    </w:p>
+    <w:p>
+      <w:pPr>
+        <w:spacing w:line="240" w:lineRule="auto" w:after="480" w:before="0"/>
+        <w:ind w:left="425" w:hanging="425"/>
+        <w:jc w:val="both"/>
+      </w:pPr>
+      <w:r>
+        <w:rPr>
+          <w:rFonts w:ascii="Times New Roman" w:hAnsi="Times New Roman"/>
+          <w:sz w:val="24"/>
+        </w:rPr>
+        <w:t>Parasuraman, A., Zeithaml, V., y Berry, L. (1988). SERVQUAL: A multiple-item scale for measuring consumer perceptions of service quality. Journal of Retailing, 64(1), 12-40.</w:t>
+      </w:r>
+    </w:p>
+    <w:p>
+      <w:pPr>
+        <w:spacing w:line="240" w:lineRule="auto" w:after="480" w:before="0"/>
+        <w:ind w:left="425" w:hanging="425"/>
+        <w:jc w:val="both"/>
+      </w:pPr>
+      <w:r>
+        <w:rPr>
+          <w:rFonts w:ascii="Times New Roman" w:hAnsi="Times New Roman"/>
+          <w:sz w:val="24"/>
+        </w:rPr>
+        <w:t>Robbins, S., y Coulter, M. (2010). Administración (10ma ed.). Pearson Educación, México.</w:t>
+      </w:r>
+    </w:p>
+    <w:p>
+      <w:pPr>
+        <w:spacing w:line="240" w:lineRule="auto" w:after="480" w:before="0"/>
+        <w:ind w:left="425" w:hanging="425"/>
+        <w:jc w:val="both"/>
+      </w:pPr>
+      <w:r>
+        <w:rPr>
+          <w:rFonts w:ascii="Times New Roman" w:hAnsi="Times New Roman"/>
+          <w:sz w:val="24"/>
+        </w:rPr>
+        <w:t>Universidad Pedagógica Experimental Libertador. (2016). Manual de trabajos de grado de especialización y maestría y tesis doctorales (5ta ed.). FEDUPEL, Venezuela.</w:t>
+      </w:r>
+    </w:p>
+    <w:p>
+      <w:pPr>
+        <w:spacing w:line="240" w:lineRule="auto" w:after="480" w:before="0"/>
+        <w:ind w:left="425" w:hanging="425"/>
+        <w:jc w:val="both"/>
+      </w:pPr>
+      <w:r>
+        <w:rPr>
+          <w:rFonts w:ascii="Times New Roman" w:hAnsi="Times New Roman"/>
+          <w:sz w:val="24"/>
+        </w:rPr>
+        <w:t>Zeithaml, V., Parasuraman, A., y Berry, L. (1993). Calidad total en la gestión de servicios. Díaz de Santos, España.</w:t>
+      </w:r>
+    </w:p>
+    <w:p>
+      <w:pPr>
+        <w:sectPr>
+          <w:footerReference w:type="default" r:id="rId37"/>
+          <w:type w:val="continuous"/>
+          <w:pgSz w:w="12240" w:h="15840"/>
+          <w:pgMar w:top="1701" w:right="1701" w:bottom="1701" w:left="2268" w:header="720" w:footer="720" w:gutter="0"/>
+          <w:cols w:space="720"/>
+          <w:titlePg/>
+          <w:docGrid w:linePitch="360"/>
         </w:sectPr>
       </w:pPr>
     </w:p>
     <w:p>
       <w:bookmarkStart w:id="bm_anexos" w:name="bm_anexos"/>
       <w:pPr>
-        <w:spacing w:before="4400"/>
+        <w:spacing w:before="4740"/>
         <w:jc w:val="center"/>
       </w:pPr>
       <w:r>
         <w:rPr>
           <w:rFonts w:ascii="Times New Roman" w:hAnsi="Times New Roman"/>
           <w:b/>
-          <w:sz w:val="24"/>
+          <w:sz w:val="32"/>
         </w:rPr>
         <w:t>ANEXOS</w:t>
       </w:r>
@@ -3131,13 +3170,12 @@
     <w:p>
       <w:pPr>
         <w:sectPr>
-          <w:footerReference w:type="default" r:id="rId39"/>
-          <w:footerReference w:type="first" r:id="rId40"/>
+          <w:footerReference w:type="default" r:id="rId38"/>
           <w:pgSz w:w="12240" w:h="15840"/>
           <w:pgMar w:top="1701" w:right="1701" w:bottom="1701" w:left="2268" w:header="720" w:footer="720" w:gutter="0"/>
           <w:cols w:space="720"/>
+          <w:titlePg/>
           <w:docGrid w:linePitch="360"/>
-          <w:pgNumType w:fmt="decimal"/>
         </w:sectPr>
       </w:pPr>
     </w:p>
@@ -3178,8 +3216,8 @@
       <w:r>
         <w:drawing>
           <wp:inline xmlns:a="http://schemas.openxmlformats.org/drawingml/2006/main" xmlns:pic="http://schemas.openxmlformats.org/drawingml/2006/picture">
-            <wp:extent cx="5040000" cy="22990909"/>
-            <wp:docPr id="6" name="Picture 6"/>
+            <wp:extent cx="4860000" cy="22169805"/>
+            <wp:docPr id="7" name="Picture 7"/>
             <wp:cNvGraphicFramePr>
               <a:graphicFrameLocks noChangeAspect="1"/>
             </wp:cNvGraphicFramePr>
@@ -3191,7 +3229,7 @@
                     <pic:cNvPicPr/>
                   </pic:nvPicPr>
                   <pic:blipFill>
-                    <a:blip r:embed="rId14"/>
+                    <a:blip r:embed="rId15"/>
                     <a:stretch>
                       <a:fillRect/>
                     </a:stretch>
@@ -3199,7 +3237,7 @@
                   <pic:spPr>
                     <a:xfrm>
                       <a:off x="0" y="0"/>
-                      <a:ext cx="5040000" cy="22990909"/>
+                      <a:ext cx="4860000" cy="22169805"/>
                     </a:xfrm>
                     <a:prstGeom prst="rect"/>
                   </pic:spPr>
@@ -3211,13 +3249,12 @@
       </w:r>
     </w:p>
     <w:sectPr>
-      <w:footerReference w:type="default" r:id="rId41"/>
-      <w:footerReference w:type="first" r:id="rId42"/>
+      <w:footerReference w:type="default" r:id="rId39"/>
       <w:pgSz w:w="12240" w:h="15840"/>
       <w:pgMar w:top="1701" w:right="1701" w:bottom="1701" w:left="2268" w:header="720" w:footer="720" w:gutter="0"/>
       <w:cols w:space="720"/>
+      <w:titlePg/>
       <w:docGrid w:linePitch="360"/>
-      <w:pgNumType w:fmt="decimal"/>
     </w:sectPr>
   </w:body>
 </w:document>
@@ -3229,7 +3266,6 @@
     <w:pPr>
       <w:pStyle w:val="Footer"/>
     </w:pPr>
-    <w:r/>
   </w:p>
 </w:ftr>
 </file>
@@ -3239,8 +3275,18 @@
   <w:p>
     <w:pPr>
       <w:pStyle w:val="Footer"/>
-    </w:pPr>
-    <w:r/>
+      <w:jc w:val="center"/>
+    </w:pPr>
+    <w:r>
+      <w:rPr>
+        <w:rFonts w:ascii="Times New Roman" w:hAnsi="Times New Roman"/>
+        <w:sz w:val="24"/>
+      </w:rPr>
+      <w:fldChar w:fldCharType="begin"/>
+      <w:instrText xml:space="preserve"> PAGE \* roman </w:instrText>
+      <w:fldChar w:fldCharType="separate"/>
+      <w:fldChar w:fldCharType="end"/>
+    </w:r>
   </w:p>
 </w:ftr>
 </file>
@@ -3252,7 +3298,6 @@
       <w:pStyle w:val="Footer"/>
       <w:jc w:val="center"/>
     </w:pPr>
-    <w:r/>
     <w:r>
       <w:rPr>
         <w:rFonts w:ascii="Times New Roman" w:hAnsi="Times New Roman"/>
@@ -3272,8 +3317,18 @@
   <w:p>
     <w:pPr>
       <w:pStyle w:val="Footer"/>
-    </w:pPr>
-    <w:r/>
+      <w:jc w:val="center"/>
+    </w:pPr>
+    <w:r>
+      <w:rPr>
+        <w:rFonts w:ascii="Times New Roman" w:hAnsi="Times New Roman"/>
+        <w:sz w:val="24"/>
+      </w:rPr>
+      <w:fldChar w:fldCharType="begin"/>
+      <w:instrText xml:space="preserve"> PAGE \* roman </w:instrText>
+      <w:fldChar w:fldCharType="separate"/>
+      <w:fldChar w:fldCharType="end"/>
+    </w:r>
   </w:p>
 </w:ftr>
 </file>
@@ -3285,7 +3340,6 @@
       <w:pStyle w:val="Footer"/>
       <w:jc w:val="center"/>
     </w:pPr>
-    <w:r/>
     <w:r>
       <w:rPr>
         <w:rFonts w:ascii="Times New Roman" w:hAnsi="Times New Roman"/>
@@ -3305,8 +3359,18 @@
   <w:p>
     <w:pPr>
       <w:pStyle w:val="Footer"/>
-    </w:pPr>
-    <w:r/>
+      <w:jc w:val="center"/>
+    </w:pPr>
+    <w:r>
+      <w:rPr>
+        <w:rFonts w:ascii="Times New Roman" w:hAnsi="Times New Roman"/>
+        <w:sz w:val="24"/>
+      </w:rPr>
+      <w:fldChar w:fldCharType="begin"/>
+      <w:instrText xml:space="preserve"> PAGE \* roman </w:instrText>
+      <w:fldChar w:fldCharType="separate"/>
+      <w:fldChar w:fldCharType="end"/>
+    </w:r>
   </w:p>
 </w:ftr>
 </file>
@@ -3318,7 +3382,6 @@
       <w:pStyle w:val="Footer"/>
       <w:jc w:val="center"/>
     </w:pPr>
-    <w:r/>
     <w:r>
       <w:rPr>
         <w:rFonts w:ascii="Times New Roman" w:hAnsi="Times New Roman"/>
@@ -3338,8 +3401,18 @@
   <w:p>
     <w:pPr>
       <w:pStyle w:val="Footer"/>
-    </w:pPr>
-    <w:r/>
+      <w:jc w:val="center"/>
+    </w:pPr>
+    <w:r>
+      <w:rPr>
+        <w:rFonts w:ascii="Times New Roman" w:hAnsi="Times New Roman"/>
+        <w:sz w:val="24"/>
+      </w:rPr>
+      <w:fldChar w:fldCharType="begin"/>
+      <w:instrText xml:space="preserve"> PAGE \* roman </w:instrText>
+      <w:fldChar w:fldCharType="separate"/>
+      <w:fldChar w:fldCharType="end"/>
+    </w:r>
   </w:p>
 </w:ftr>
 </file>
@@ -3351,7 +3424,6 @@
       <w:pStyle w:val="Footer"/>
       <w:jc w:val="center"/>
     </w:pPr>
-    <w:r/>
     <w:r>
       <w:rPr>
         <w:rFonts w:ascii="Times New Roman" w:hAnsi="Times New Roman"/>
@@ -3371,8 +3443,18 @@
   <w:p>
     <w:pPr>
       <w:pStyle w:val="Footer"/>
-    </w:pPr>
-    <w:r/>
+      <w:jc w:val="center"/>
+    </w:pPr>
+    <w:r>
+      <w:rPr>
+        <w:rFonts w:ascii="Times New Roman" w:hAnsi="Times New Roman"/>
+        <w:sz w:val="24"/>
+      </w:rPr>
+      <w:fldChar w:fldCharType="begin"/>
+      <w:instrText xml:space="preserve"> PAGE \* roman </w:instrText>
+      <w:fldChar w:fldCharType="separate"/>
+      <w:fldChar w:fldCharType="end"/>
+    </w:r>
   </w:p>
 </w:ftr>
 </file>
@@ -3384,7 +3466,6 @@
       <w:pStyle w:val="Footer"/>
       <w:jc w:val="center"/>
     </w:pPr>
-    <w:r/>
     <w:r>
       <w:rPr>
         <w:rFonts w:ascii="Times New Roman" w:hAnsi="Times New Roman"/>
@@ -3405,7 +3486,6 @@
     <w:pPr>
       <w:pStyle w:val="Footer"/>
     </w:pPr>
-    <w:r/>
   </w:p>
 </w:ftr>
 </file>
@@ -3415,8 +3495,18 @@
   <w:p>
     <w:pPr>
       <w:pStyle w:val="Footer"/>
-    </w:pPr>
-    <w:r/>
+      <w:jc w:val="center"/>
+    </w:pPr>
+    <w:r>
+      <w:rPr>
+        <w:rFonts w:ascii="Times New Roman" w:hAnsi="Times New Roman"/>
+        <w:sz w:val="24"/>
+      </w:rPr>
+      <w:fldChar w:fldCharType="begin"/>
+      <w:instrText xml:space="preserve"> PAGE </w:instrText>
+      <w:fldChar w:fldCharType="separate"/>
+      <w:fldChar w:fldCharType="end"/>
+    </w:r>
   </w:p>
 </w:ftr>
 </file>
@@ -3428,7 +3518,6 @@
       <w:pStyle w:val="Footer"/>
       <w:jc w:val="center"/>
     </w:pPr>
-    <w:r/>
     <w:r>
       <w:rPr>
         <w:rFonts w:ascii="Times New Roman" w:hAnsi="Times New Roman"/>
@@ -3448,8 +3537,18 @@
   <w:p>
     <w:pPr>
       <w:pStyle w:val="Footer"/>
-    </w:pPr>
-    <w:r/>
+      <w:jc w:val="center"/>
+    </w:pPr>
+    <w:r>
+      <w:rPr>
+        <w:rFonts w:ascii="Times New Roman" w:hAnsi="Times New Roman"/>
+        <w:sz w:val="24"/>
+      </w:rPr>
+      <w:fldChar w:fldCharType="begin"/>
+      <w:instrText xml:space="preserve"> PAGE </w:instrText>
+      <w:fldChar w:fldCharType="separate"/>
+      <w:fldChar w:fldCharType="end"/>
+    </w:r>
   </w:p>
 </w:ftr>
 </file>
@@ -3461,7 +3560,6 @@
       <w:pStyle w:val="Footer"/>
       <w:jc w:val="center"/>
     </w:pPr>
-    <w:r/>
     <w:r>
       <w:rPr>
         <w:rFonts w:ascii="Times New Roman" w:hAnsi="Times New Roman"/>
@@ -3481,20 +3579,8 @@
   <w:p>
     <w:pPr>
       <w:pStyle w:val="Footer"/>
-    </w:pPr>
-    <w:r/>
-  </w:p>
-</w:ftr>
-</file>
-
-<file path=word/footer25.xml><?xml version="1.0" encoding="utf-8"?>
-<w:ftr xmlns:m="http://schemas.openxmlformats.org/officeDocument/2006/math" xmlns:mc="http://schemas.openxmlformats.org/markup-compatibility/2006" xmlns:mo="http://schemas.microsoft.com/office/mac/office/2008/main" xmlns:mv="urn:schemas-microsoft-com:mac:vml" xmlns:o="urn:schemas-microsoft-com:office:office" xmlns:r="http://schemas.openxmlformats.org/officeDocument/2006/relationships" xmlns:v="urn:schemas-microsoft-com:vml" xmlns:w10="urn:schemas-microsoft-com:office:word" xmlns:w14="http://schemas.microsoft.com/office/word/2010/wordml" xmlns:w="http://schemas.openxmlformats.org/wordprocessingml/2006/main" xmlns:wne="http://schemas.microsoft.com/office/word/2006/wordml" xmlns:wp14="http://schemas.microsoft.com/office/word/2010/wordprocessingDrawing" xmlns:wp="http://schemas.openxmlformats.org/drawingml/2006/wordprocessingDrawing" xmlns:wpc="http://schemas.microsoft.com/office/word/2010/wordprocessingCanvas" xmlns:wpg="http://schemas.microsoft.com/office/word/2010/wordprocessingGroup" xmlns:wpi="http://schemas.microsoft.com/office/word/2010/wordprocessingInk" xmlns:wps="http://schemas.microsoft.com/office/word/2010/wordprocessingShape" mc:Ignorable="w14 wp14">
-  <w:p>
-    <w:pPr>
-      <w:pStyle w:val="Footer"/>
       <w:jc w:val="center"/>
     </w:pPr>
-    <w:r/>
     <w:r>
       <w:rPr>
         <w:rFonts w:ascii="Times New Roman" w:hAnsi="Times New Roman"/>
@@ -3509,50 +3595,6 @@
 </w:ftr>
 </file>
 
-<file path=word/footer26.xml><?xml version="1.0" encoding="utf-8"?>
-<w:ftr xmlns:m="http://schemas.openxmlformats.org/officeDocument/2006/math" xmlns:mc="http://schemas.openxmlformats.org/markup-compatibility/2006" xmlns:mo="http://schemas.microsoft.com/office/mac/office/2008/main" xmlns:mv="urn:schemas-microsoft-com:mac:vml" xmlns:o="urn:schemas-microsoft-com:office:office" xmlns:r="http://schemas.openxmlformats.org/officeDocument/2006/relationships" xmlns:v="urn:schemas-microsoft-com:vml" xmlns:w10="urn:schemas-microsoft-com:office:word" xmlns:w14="http://schemas.microsoft.com/office/word/2010/wordml" xmlns:w="http://schemas.openxmlformats.org/wordprocessingml/2006/main" xmlns:wne="http://schemas.microsoft.com/office/word/2006/wordml" xmlns:wp14="http://schemas.microsoft.com/office/word/2010/wordprocessingDrawing" xmlns:wp="http://schemas.openxmlformats.org/drawingml/2006/wordprocessingDrawing" xmlns:wpc="http://schemas.microsoft.com/office/word/2010/wordprocessingCanvas" xmlns:wpg="http://schemas.microsoft.com/office/word/2010/wordprocessingGroup" xmlns:wpi="http://schemas.microsoft.com/office/word/2010/wordprocessingInk" xmlns:wps="http://schemas.microsoft.com/office/word/2010/wordprocessingShape" mc:Ignorable="w14 wp14">
-  <w:p>
-    <w:pPr>
-      <w:pStyle w:val="Footer"/>
-    </w:pPr>
-    <w:r/>
-  </w:p>
-</w:ftr>
-</file>
-
-<file path=word/footer27.xml><?xml version="1.0" encoding="utf-8"?>
-<w:ftr xmlns:m="http://schemas.openxmlformats.org/officeDocument/2006/math" xmlns:mc="http://schemas.openxmlformats.org/markup-compatibility/2006" xmlns:mo="http://schemas.microsoft.com/office/mac/office/2008/main" xmlns:mv="urn:schemas-microsoft-com:mac:vml" xmlns:o="urn:schemas-microsoft-com:office:office" xmlns:r="http://schemas.openxmlformats.org/officeDocument/2006/relationships" xmlns:v="urn:schemas-microsoft-com:vml" xmlns:w10="urn:schemas-microsoft-com:office:word" xmlns:w14="http://schemas.microsoft.com/office/word/2010/wordml" xmlns:w="http://schemas.openxmlformats.org/wordprocessingml/2006/main" xmlns:wne="http://schemas.microsoft.com/office/word/2006/wordml" xmlns:wp14="http://schemas.microsoft.com/office/word/2010/wordprocessingDrawing" xmlns:wp="http://schemas.openxmlformats.org/drawingml/2006/wordprocessingDrawing" xmlns:wpc="http://schemas.microsoft.com/office/word/2010/wordprocessingCanvas" xmlns:wpg="http://schemas.microsoft.com/office/word/2010/wordprocessingGroup" xmlns:wpi="http://schemas.microsoft.com/office/word/2010/wordprocessingInk" xmlns:wps="http://schemas.microsoft.com/office/word/2010/wordprocessingShape" mc:Ignorable="w14 wp14">
-  <w:p>
-    <w:pPr>
-      <w:pStyle w:val="Footer"/>
-      <w:jc w:val="center"/>
-    </w:pPr>
-    <w:r/>
-    <w:r>
-      <w:rPr>
-        <w:rFonts w:ascii="Times New Roman" w:hAnsi="Times New Roman"/>
-        <w:sz w:val="24"/>
-      </w:rPr>
-      <w:fldChar w:fldCharType="begin"/>
-      <w:instrText xml:space="preserve"> PAGE </w:instrText>
-      <w:fldChar w:fldCharType="separate"/>
-      <w:fldChar w:fldCharType="end"/>
-    </w:r>
-  </w:p>
-</w:ftr>
-</file>
-
-<file path=word/footer28.xml><?xml version="1.0" encoding="utf-8"?>
-<w:ftr xmlns:m="http://schemas.openxmlformats.org/officeDocument/2006/math" xmlns:mc="http://schemas.openxmlformats.org/markup-compatibility/2006" xmlns:mo="http://schemas.microsoft.com/office/mac/office/2008/main" xmlns:mv="urn:schemas-microsoft-com:mac:vml" xmlns:o="urn:schemas-microsoft-com:office:office" xmlns:r="http://schemas.openxmlformats.org/officeDocument/2006/relationships" xmlns:v="urn:schemas-microsoft-com:vml" xmlns:w10="urn:schemas-microsoft-com:office:word" xmlns:w14="http://schemas.microsoft.com/office/word/2010/wordml" xmlns:w="http://schemas.openxmlformats.org/wordprocessingml/2006/main" xmlns:wne="http://schemas.microsoft.com/office/word/2006/wordml" xmlns:wp14="http://schemas.microsoft.com/office/word/2010/wordprocessingDrawing" xmlns:wp="http://schemas.openxmlformats.org/drawingml/2006/wordprocessingDrawing" xmlns:wpc="http://schemas.microsoft.com/office/word/2010/wordprocessingCanvas" xmlns:wpg="http://schemas.microsoft.com/office/word/2010/wordprocessingGroup" xmlns:wpi="http://schemas.microsoft.com/office/word/2010/wordprocessingInk" xmlns:wps="http://schemas.microsoft.com/office/word/2010/wordprocessingShape" mc:Ignorable="w14 wp14">
-  <w:p>
-    <w:pPr>
-      <w:pStyle w:val="Footer"/>
-    </w:pPr>
-    <w:r/>
-  </w:p>
-</w:ftr>
-</file>
-
 <file path=word/footer3.xml><?xml version="1.0" encoding="utf-8"?>
 <w:ftr xmlns:m="http://schemas.openxmlformats.org/officeDocument/2006/math" xmlns:mc="http://schemas.openxmlformats.org/markup-compatibility/2006" xmlns:mo="http://schemas.microsoft.com/office/mac/office/2008/main" xmlns:mv="urn:schemas-microsoft-com:mac:vml" xmlns:o="urn:schemas-microsoft-com:office:office" xmlns:r="http://schemas.openxmlformats.org/officeDocument/2006/relationships" xmlns:v="urn:schemas-microsoft-com:vml" xmlns:w10="urn:schemas-microsoft-com:office:word" xmlns:w14="http://schemas.microsoft.com/office/word/2010/wordml" xmlns:w="http://schemas.openxmlformats.org/wordprocessingml/2006/main" xmlns:wne="http://schemas.microsoft.com/office/word/2006/wordml" xmlns:wp14="http://schemas.microsoft.com/office/word/2010/wordprocessingDrawing" xmlns:wp="http://schemas.openxmlformats.org/drawingml/2006/wordprocessingDrawing" xmlns:wpc="http://schemas.microsoft.com/office/word/2010/wordprocessingCanvas" xmlns:wpg="http://schemas.microsoft.com/office/word/2010/wordprocessingGroup" xmlns:wpi="http://schemas.microsoft.com/office/word/2010/wordprocessingInk" xmlns:wps="http://schemas.microsoft.com/office/word/2010/wordprocessingShape" mc:Ignorable="w14 wp14">
   <w:p>
@@ -3560,7 +3602,6 @@
       <w:pStyle w:val="Footer"/>
       <w:jc w:val="center"/>
     </w:pPr>
-    <w:r/>
     <w:r>
       <w:rPr>
         <w:rFonts w:ascii="Times New Roman" w:hAnsi="Times New Roman"/>
@@ -3580,20 +3621,8 @@
   <w:p>
     <w:pPr>
       <w:pStyle w:val="Footer"/>
-    </w:pPr>
-    <w:r/>
-  </w:p>
-</w:ftr>
-</file>
-
-<file path=word/footer5.xml><?xml version="1.0" encoding="utf-8"?>
-<w:ftr xmlns:m="http://schemas.openxmlformats.org/officeDocument/2006/math" xmlns:mc="http://schemas.openxmlformats.org/markup-compatibility/2006" xmlns:mo="http://schemas.microsoft.com/office/mac/office/2008/main" xmlns:mv="urn:schemas-microsoft-com:mac:vml" xmlns:o="urn:schemas-microsoft-com:office:office" xmlns:r="http://schemas.openxmlformats.org/officeDocument/2006/relationships" xmlns:v="urn:schemas-microsoft-com:vml" xmlns:w10="urn:schemas-microsoft-com:office:word" xmlns:w14="http://schemas.microsoft.com/office/word/2010/wordml" xmlns:w="http://schemas.openxmlformats.org/wordprocessingml/2006/main" xmlns:wne="http://schemas.microsoft.com/office/word/2006/wordml" xmlns:wp14="http://schemas.microsoft.com/office/word/2010/wordprocessingDrawing" xmlns:wp="http://schemas.openxmlformats.org/drawingml/2006/wordprocessingDrawing" xmlns:wpc="http://schemas.microsoft.com/office/word/2010/wordprocessingCanvas" xmlns:wpg="http://schemas.microsoft.com/office/word/2010/wordprocessingGroup" xmlns:wpi="http://schemas.microsoft.com/office/word/2010/wordprocessingInk" xmlns:wps="http://schemas.microsoft.com/office/word/2010/wordprocessingShape" mc:Ignorable="w14 wp14">
-  <w:p>
-    <w:pPr>
-      <w:pStyle w:val="Footer"/>
       <w:jc w:val="center"/>
     </w:pPr>
-    <w:r/>
     <w:r>
       <w:rPr>
         <w:rFonts w:ascii="Times New Roman" w:hAnsi="Times New Roman"/>
@@ -3608,13 +3637,22 @@
 </w:ftr>
 </file>
 
+<file path=word/footer5.xml><?xml version="1.0" encoding="utf-8"?>
+<w:ftr xmlns:m="http://schemas.openxmlformats.org/officeDocument/2006/math" xmlns:mc="http://schemas.openxmlformats.org/markup-compatibility/2006" xmlns:mo="http://schemas.microsoft.com/office/mac/office/2008/main" xmlns:mv="urn:schemas-microsoft-com:mac:vml" xmlns:o="urn:schemas-microsoft-com:office:office" xmlns:r="http://schemas.openxmlformats.org/officeDocument/2006/relationships" xmlns:v="urn:schemas-microsoft-com:vml" xmlns:w10="urn:schemas-microsoft-com:office:word" xmlns:w14="http://schemas.microsoft.com/office/word/2010/wordml" xmlns:w="http://schemas.openxmlformats.org/wordprocessingml/2006/main" xmlns:wne="http://schemas.microsoft.com/office/word/2006/wordml" xmlns:wp14="http://schemas.microsoft.com/office/word/2010/wordprocessingDrawing" xmlns:wp="http://schemas.openxmlformats.org/drawingml/2006/wordprocessingDrawing" xmlns:wpc="http://schemas.microsoft.com/office/word/2010/wordprocessingCanvas" xmlns:wpg="http://schemas.microsoft.com/office/word/2010/wordprocessingGroup" xmlns:wpi="http://schemas.microsoft.com/office/word/2010/wordprocessingInk" xmlns:wps="http://schemas.microsoft.com/office/word/2010/wordprocessingShape" mc:Ignorable="w14 wp14">
+  <w:p>
+    <w:pPr>
+      <w:pStyle w:val="Footer"/>
+    </w:pPr>
+  </w:p>
+</w:ftr>
+</file>
+
 <file path=word/footer6.xml><?xml version="1.0" encoding="utf-8"?>
 <w:ftr xmlns:m="http://schemas.openxmlformats.org/officeDocument/2006/math" xmlns:mc="http://schemas.openxmlformats.org/markup-compatibility/2006" xmlns:mo="http://schemas.microsoft.com/office/mac/office/2008/main" xmlns:mv="urn:schemas-microsoft-com:mac:vml" xmlns:o="urn:schemas-microsoft-com:office:office" xmlns:r="http://schemas.openxmlformats.org/officeDocument/2006/relationships" xmlns:v="urn:schemas-microsoft-com:vml" xmlns:w10="urn:schemas-microsoft-com:office:word" xmlns:w14="http://schemas.microsoft.com/office/word/2010/wordml" xmlns:w="http://schemas.openxmlformats.org/wordprocessingml/2006/main" xmlns:wne="http://schemas.microsoft.com/office/word/2006/wordml" xmlns:wp14="http://schemas.microsoft.com/office/word/2010/wordprocessingDrawing" xmlns:wp="http://schemas.openxmlformats.org/drawingml/2006/wordprocessingDrawing" xmlns:wpc="http://schemas.microsoft.com/office/word/2010/wordprocessingCanvas" xmlns:wpg="http://schemas.microsoft.com/office/word/2010/wordprocessingGroup" xmlns:wpi="http://schemas.microsoft.com/office/word/2010/wordprocessingInk" xmlns:wps="http://schemas.microsoft.com/office/word/2010/wordprocessingShape" mc:Ignorable="w14 wp14">
   <w:p>
     <w:pPr>
       <w:pStyle w:val="Footer"/>
     </w:pPr>
-    <w:r/>
   </w:p>
 </w:ftr>
 </file>
@@ -3626,7 +3664,6 @@
       <w:pStyle w:val="Footer"/>
       <w:jc w:val="center"/>
     </w:pPr>
-    <w:r/>
     <w:r>
       <w:rPr>
         <w:rFonts w:ascii="Times New Roman" w:hAnsi="Times New Roman"/>
@@ -3646,8 +3683,18 @@
   <w:p>
     <w:pPr>
       <w:pStyle w:val="Footer"/>
-    </w:pPr>
-    <w:r/>
+      <w:jc w:val="center"/>
+    </w:pPr>
+    <w:r>
+      <w:rPr>
+        <w:rFonts w:ascii="Times New Roman" w:hAnsi="Times New Roman"/>
+        <w:sz w:val="24"/>
+      </w:rPr>
+      <w:fldChar w:fldCharType="begin"/>
+      <w:instrText xml:space="preserve"> PAGE \* roman </w:instrText>
+      <w:fldChar w:fldCharType="separate"/>
+      <w:fldChar w:fldCharType="end"/>
+    </w:r>
   </w:p>
 </w:ftr>
 </file>
@@ -3659,7 +3706,6 @@
       <w:pStyle w:val="Footer"/>
       <w:jc w:val="center"/>
     </w:pPr>
-    <w:r/>
     <w:r>
       <w:rPr>
         <w:rFonts w:ascii="Times New Roman" w:hAnsi="Times New Roman"/>

</xml_diff>